<commit_message>
Normalize experiment reports: unify section numbering (1.实验目的 ~ 6.实验结果分析), rename exp06/exp07 reports from template filenames, remove blank template copy
</commit_message>
<xml_diff>
--- a/reports/exp03_图像的边缘检测算法的实现_实验报告.docx
+++ b/reports/exp03_图像的边缘检测算法的实现_实验报告.docx
@@ -1,23 +1,23 @@
 
 <file path=word/document.xml><?xml version="1.0" encoding="utf-8"?>
-<w:document xmlns:wpc="http://schemas.microsoft.com/office/word/2010/wordprocessingCanvas" xmlns:cx="http://schemas.microsoft.com/office/drawing/2014/chartex" xmlns:cx1="http://schemas.microsoft.com/office/drawing/2015/9/8/chartex" xmlns:cx2="http://schemas.microsoft.com/office/drawing/2015/10/21/chartex" xmlns:cx3="http://schemas.microsoft.com/office/drawing/2016/5/9/chartex" xmlns:cx4="http://schemas.microsoft.com/office/drawing/2016/5/10/chartex" xmlns:cx5="http://schemas.microsoft.com/office/drawing/2016/5/11/chartex" xmlns:cx6="http://schemas.microsoft.com/office/drawing/2016/5/12/chartex" xmlns:cx7="http://schemas.microsoft.com/office/drawing/2016/5/13/chartex" xmlns:cx8="http://schemas.microsoft.com/office/drawing/2016/5/14/chartex" xmlns:mc="http://schemas.openxmlformats.org/markup-compatibility/2006" xmlns:o="urn:schemas-microsoft-com:office:office" xmlns:r="http://schemas.openxmlformats.org/officeDocument/2006/relationships" xmlns:m="http://schemas.openxmlformats.org/officeDocument/2006/math" xmlns:v="urn:schemas-microsoft-com:vml" xmlns:wp14="http://schemas.microsoft.com/office/word/2010/wordprocessingDrawing" xmlns:wp="http://schemas.openxmlformats.org/drawingml/2006/wordprocessingDrawing" xmlns:w="http://schemas.openxmlformats.org/wordprocessingml/2006/main" xmlns:w14="http://schemas.microsoft.com/office/word/2010/wordml" xmlns:w10="urn:schemas-microsoft-com:office:word" xmlns:w15="http://schemas.microsoft.com/office/word/2012/wordml" xmlns:wpg="http://schemas.microsoft.com/office/word/2010/wordprocessingGroup" xmlns:wpi="http://schemas.microsoft.com/office/word/2010/wordprocessingInk" xmlns:wne="http://schemas.microsoft.com/office/word/2006/wordml" xmlns:wps="http://schemas.microsoft.com/office/word/2010/wordprocessingShape" xmlns:wpsCustomData="http://www.wps.cn/officeDocument/2013/wpsCustomData" mc:Ignorable="w14 w15 wp14">
+<w:document xmlns:w="http://schemas.openxmlformats.org/wordprocessingml/2006/main" xmlns:a="http://schemas.openxmlformats.org/drawingml/2006/main" xmlns:wp="http://schemas.openxmlformats.org/drawingml/2006/wordprocessingDrawing" xmlns:pic="http://schemas.openxmlformats.org/drawingml/2006/picture" xmlns:r="http://schemas.openxmlformats.org/officeDocument/2006/relationships" xmlns:w14="http://schemas.microsoft.com/office/word/2010/wordml" xmlns:mc="http://schemas.openxmlformats.org/markup-compatibility/2006" mc:Ignorable="w14">
   <w:body>
     <w:p>
       <w:pPr>
-        <w:pStyle w:val="4"/>
+        <w:pStyle w:val="00000f"/>
         <w:rPr>
           <w:rFonts w:hint="eastAsia" w:ascii="宋体" w:hAnsi="宋体" w:eastAsia="宋体"/>
           <w:lang w:val="en-US" w:eastAsia="zh-CN"/>
         </w:rPr>
       </w:pPr>
-      <w:bookmarkStart w:id="0" w:name="_Toc169118284"/>
+      <w:bookmarkStart w:id="1" w:name="_Toc169118284"/>
       <w:r>
         <w:rPr>
           <w:rFonts w:hint="eastAsia" w:ascii="宋体" w:hAnsi="宋体" w:eastAsia="宋体"/>
         </w:rPr>
         <w:t>江西师范大学人工智能学院学生实验报告</w:t>
       </w:r>
-      <w:bookmarkEnd w:id="0"/>
+      <w:bookmarkEnd w:id="1"/>
       <w:r>
         <w:rPr>
           <w:rFonts w:hint="eastAsia" w:ascii="宋体" w:hAnsi="宋体" w:eastAsia="宋体"/>
@@ -30,16 +30,16 @@
       <w:pPr>
         <w:spacing w:before="312" w:beforeLines="100" w:after="156" w:afterLines="50"/>
         <w:rPr>
-          <w:b/>
-          <w:bCs/>
+          <w:b w:val="1"/>
+          <w:bCs w:val="1"/>
           <w:szCs w:val="21"/>
         </w:rPr>
       </w:pPr>
       <w:r>
         <w:rPr>
           <w:rFonts w:hint="eastAsia" w:ascii="宋体" w:hAnsi="宋体"/>
-          <w:b/>
-          <w:bCs/>
+          <w:b w:val="1"/>
+          <w:bCs w:val="1"/>
           <w:szCs w:val="21"/>
         </w:rPr>
         <w:t>专业</w:t>
@@ -47,8 +47,8 @@
       <w:r>
         <w:rPr>
           <w:rFonts w:hint="eastAsia" w:ascii="宋体" w:hAnsi="宋体"/>
-          <w:b/>
-          <w:bCs/>
+          <w:b w:val="1"/>
+          <w:bCs w:val="1"/>
           <w:szCs w:val="21"/>
           <w:u w:val="single"/>
         </w:rPr>
@@ -57,8 +57,8 @@
       <w:r>
         <w:rPr>
           <w:rFonts w:ascii="宋体" w:hAnsi="宋体"/>
-          <w:b/>
-          <w:bCs/>
+          <w:b w:val="1"/>
+          <w:bCs w:val="1"/>
           <w:szCs w:val="21"/>
           <w:u w:val="single"/>
         </w:rPr>
@@ -67,8 +67,8 @@
       <w:r>
         <w:rPr>
           <w:rFonts w:hint="eastAsia" w:ascii="宋体" w:hAnsi="宋体"/>
-          <w:b/>
-          <w:bCs/>
+          <w:b w:val="1"/>
+          <w:bCs w:val="1"/>
           <w:szCs w:val="21"/>
         </w:rPr>
         <w:t xml:space="preserve">姓名 </w:t>
@@ -76,8 +76,8 @@
       <w:r>
         <w:rPr>
           <w:rFonts w:hint="eastAsia" w:ascii="宋体" w:hAnsi="宋体"/>
-          <w:b/>
-          <w:bCs/>
+          <w:b w:val="1"/>
+          <w:bCs w:val="1"/>
           <w:szCs w:val="21"/>
           <w:u w:val="single"/>
         </w:rPr>
@@ -86,8 +86,8 @@
       <w:r>
         <w:rPr>
           <w:rFonts w:hint="eastAsia" w:ascii="宋体" w:hAnsi="宋体"/>
-          <w:b/>
-          <w:bCs/>
+          <w:b w:val="1"/>
+          <w:bCs w:val="1"/>
           <w:szCs w:val="21"/>
           <w:u w:val="single"/>
           <w:lang w:val="en-US" w:eastAsia="zh-CN"/>
@@ -97,8 +97,8 @@
       <w:r>
         <w:rPr>
           <w:rFonts w:hint="eastAsia" w:ascii="宋体" w:hAnsi="宋体"/>
-          <w:b/>
-          <w:bCs/>
+          <w:b w:val="1"/>
+          <w:bCs w:val="1"/>
           <w:szCs w:val="21"/>
           <w:u w:val="single"/>
         </w:rPr>
@@ -107,8 +107,8 @@
       <w:r>
         <w:rPr>
           <w:rFonts w:hint="eastAsia" w:ascii="宋体" w:hAnsi="宋体"/>
-          <w:b/>
-          <w:bCs/>
+          <w:b w:val="1"/>
+          <w:bCs w:val="1"/>
           <w:szCs w:val="21"/>
         </w:rPr>
         <w:t>学号</w:t>
@@ -116,8 +116,8 @@
       <w:r>
         <w:rPr>
           <w:rFonts w:hint="eastAsia" w:ascii="宋体" w:hAnsi="宋体"/>
-          <w:b/>
-          <w:bCs/>
+          <w:b w:val="1"/>
+          <w:bCs w:val="1"/>
           <w:szCs w:val="21"/>
           <w:u w:val="single"/>
         </w:rPr>
@@ -126,8 +126,8 @@
       <w:r>
         <w:rPr>
           <w:rFonts w:hint="eastAsia" w:ascii="宋体" w:hAnsi="宋体"/>
-          <w:b/>
-          <w:bCs/>
+          <w:b w:val="1"/>
+          <w:bCs w:val="1"/>
           <w:szCs w:val="21"/>
           <w:u w:val="single"/>
           <w:lang w:val="en-US" w:eastAsia="zh-CN"/>
@@ -137,8 +137,8 @@
       <w:r>
         <w:rPr>
           <w:rFonts w:hint="eastAsia" w:ascii="宋体" w:hAnsi="宋体"/>
-          <w:b/>
-          <w:bCs/>
+          <w:b w:val="1"/>
+          <w:bCs w:val="1"/>
           <w:szCs w:val="21"/>
           <w:u w:val="single"/>
         </w:rPr>
@@ -147,8 +147,8 @@
       <w:r>
         <w:rPr>
           <w:rFonts w:hint="eastAsia" w:ascii="宋体" w:hAnsi="宋体"/>
-          <w:b/>
-          <w:bCs/>
+          <w:b w:val="1"/>
+          <w:bCs w:val="1"/>
           <w:szCs w:val="21"/>
         </w:rPr>
         <w:t>日期</w:t>
@@ -156,8 +156,8 @@
       <w:r>
         <w:rPr>
           <w:rFonts w:ascii="宋体" w:hAnsi="宋体"/>
-          <w:b/>
-          <w:bCs/>
+          <w:b w:val="1"/>
+          <w:bCs w:val="1"/>
           <w:szCs w:val="21"/>
           <w:u w:val="single"/>
         </w:rPr>
@@ -166,8 +166,8 @@
       <w:r>
         <w:rPr>
           <w:rFonts w:hint="eastAsia" w:ascii="宋体" w:hAnsi="宋体"/>
-          <w:b/>
-          <w:bCs/>
+          <w:b w:val="1"/>
+          <w:bCs w:val="1"/>
           <w:szCs w:val="21"/>
           <w:u w:val="single"/>
         </w:rPr>
@@ -176,8 +176,8 @@
       <w:r>
         <w:rPr>
           <w:rFonts w:hint="eastAsia" w:ascii="宋体" w:hAnsi="宋体"/>
-          <w:b/>
-          <w:bCs/>
+          <w:b w:val="1"/>
+          <w:bCs w:val="1"/>
           <w:szCs w:val="21"/>
           <w:u w:val="single"/>
           <w:lang w:val="en-US" w:eastAsia="zh-CN"/>
@@ -187,8 +187,8 @@
       <w:r>
         <w:rPr>
           <w:rFonts w:hint="eastAsia" w:ascii="宋体" w:hAnsi="宋体"/>
-          <w:b/>
-          <w:bCs/>
+          <w:b w:val="1"/>
+          <w:bCs w:val="1"/>
           <w:szCs w:val="21"/>
           <w:u w:val="single"/>
         </w:rPr>
@@ -197,8 +197,8 @@
       <w:r>
         <w:rPr>
           <w:rFonts w:hint="eastAsia" w:ascii="宋体" w:hAnsi="宋体"/>
-          <w:b/>
-          <w:bCs/>
+          <w:b w:val="1"/>
+          <w:bCs w:val="1"/>
           <w:szCs w:val="21"/>
           <w:u w:val="single"/>
           <w:lang w:val="en-US" w:eastAsia="zh-CN"/>
@@ -208,8 +208,8 @@
       <w:r>
         <w:rPr>
           <w:rFonts w:hint="eastAsia" w:ascii="宋体" w:hAnsi="宋体"/>
-          <w:b/>
-          <w:bCs/>
+          <w:b w:val="1"/>
+          <w:bCs w:val="1"/>
           <w:szCs w:val="21"/>
           <w:u w:val="single"/>
         </w:rPr>
@@ -218,8 +218,8 @@
       <w:r>
         <w:rPr>
           <w:rFonts w:hint="eastAsia" w:ascii="宋体" w:hAnsi="宋体"/>
-          <w:b/>
-          <w:bCs/>
+          <w:b w:val="1"/>
+          <w:bCs w:val="1"/>
           <w:szCs w:val="21"/>
           <w:u w:val="single"/>
           <w:lang w:val="en-US" w:eastAsia="zh-CN"/>
@@ -229,8 +229,8 @@
       <w:r>
         <w:rPr>
           <w:rFonts w:ascii="宋体" w:hAnsi="宋体"/>
-          <w:b/>
-          <w:bCs/>
+          <w:b w:val="1"/>
+          <w:bCs w:val="1"/>
           <w:szCs w:val="21"/>
           <w:u w:val="single"/>
         </w:rPr>
@@ -239,7 +239,7 @@
     </w:p>
     <w:tbl>
       <w:tblPr>
-        <w:tblStyle w:val="6"/>
+        <w:tblStyle w:val="00000a"/>
         <w:tblW w:w="0" w:type="auto"/>
         <w:jc w:val="center"/>
         <w:tblBorders>
@@ -265,22 +265,6 @@
         <w:gridCol w:w="2200"/>
       </w:tblGrid>
       <w:tr>
-        <w:tblPrEx>
-          <w:tblBorders>
-            <w:top w:val="single" w:color="auto" w:sz="4" w:space="0"/>
-            <w:left w:val="single" w:color="auto" w:sz="4" w:space="0"/>
-            <w:bottom w:val="single" w:color="auto" w:sz="4" w:space="0"/>
-            <w:right w:val="single" w:color="auto" w:sz="4" w:space="0"/>
-            <w:insideH w:val="single" w:color="auto" w:sz="4" w:space="0"/>
-            <w:insideV w:val="single" w:color="auto" w:sz="4" w:space="0"/>
-          </w:tblBorders>
-          <w:tblCellMar>
-            <w:top w:w="0" w:type="dxa"/>
-            <w:left w:w="108" w:type="dxa"/>
-            <w:bottom w:w="0" w:type="dxa"/>
-            <w:right w:w="108" w:type="dxa"/>
-          </w:tblCellMar>
-        </w:tblPrEx>
         <w:trPr>
           <w:trHeight w:val="624" w:hRule="atLeast"/>
           <w:jc w:val="center"/>
@@ -381,24 +365,8 @@
         </w:tc>
       </w:tr>
       <w:tr>
-        <w:tblPrEx>
-          <w:tblBorders>
-            <w:top w:val="single" w:color="auto" w:sz="4" w:space="0"/>
-            <w:left w:val="single" w:color="auto" w:sz="4" w:space="0"/>
-            <w:bottom w:val="single" w:color="auto" w:sz="4" w:space="0"/>
-            <w:right w:val="single" w:color="auto" w:sz="4" w:space="0"/>
-            <w:insideH w:val="single" w:color="auto" w:sz="4" w:space="0"/>
-            <w:insideV w:val="single" w:color="auto" w:sz="4" w:space="0"/>
-          </w:tblBorders>
-          <w:tblCellMar>
-            <w:top w:w="0" w:type="dxa"/>
-            <w:left w:w="108" w:type="dxa"/>
-            <w:bottom w:w="0" w:type="dxa"/>
-            <w:right w:w="108" w:type="dxa"/>
-          </w:tblCellMar>
-        </w:tblPrEx>
         <w:trPr>
-          <w:cantSplit/>
+          <w:cantSplit w:val="1"/>
           <w:trHeight w:val="634" w:hRule="atLeast"/>
           <w:jc w:val="center"/>
         </w:trPr>
@@ -453,22 +421,6 @@
         </w:tc>
       </w:tr>
       <w:tr>
-        <w:tblPrEx>
-          <w:tblBorders>
-            <w:top w:val="single" w:color="auto" w:sz="4" w:space="0"/>
-            <w:left w:val="single" w:color="auto" w:sz="4" w:space="0"/>
-            <w:bottom w:val="single" w:color="auto" w:sz="4" w:space="0"/>
-            <w:right w:val="single" w:color="auto" w:sz="4" w:space="0"/>
-            <w:insideH w:val="single" w:color="auto" w:sz="4" w:space="0"/>
-            <w:insideV w:val="single" w:color="auto" w:sz="4" w:space="0"/>
-          </w:tblBorders>
-          <w:tblCellMar>
-            <w:top w:w="0" w:type="dxa"/>
-            <w:left w:w="108" w:type="dxa"/>
-            <w:bottom w:w="0" w:type="dxa"/>
-            <w:right w:w="108" w:type="dxa"/>
-          </w:tblCellMar>
-        </w:tblPrEx>
         <w:trPr>
           <w:trHeight w:val="621" w:hRule="atLeast"/>
           <w:jc w:val="center"/>
@@ -503,7 +455,7 @@
           </w:tcPr>
           <w:p>
             <w:pPr>
-              <w:pStyle w:val="11"/>
+              <w:pStyle w:val="000013"/>
               <w:widowControl w:val="0"/>
               <w:spacing w:before="0" w:beforeAutospacing="0" w:after="0" w:afterAutospacing="0" w:line="320" w:lineRule="exact"/>
               <w:rPr>
@@ -561,24 +513,8 @@
         </w:tc>
       </w:tr>
       <w:tr>
-        <w:tblPrEx>
-          <w:tblBorders>
-            <w:top w:val="single" w:color="auto" w:sz="4" w:space="0"/>
-            <w:left w:val="single" w:color="auto" w:sz="4" w:space="0"/>
-            <w:bottom w:val="single" w:color="auto" w:sz="4" w:space="0"/>
-            <w:right w:val="single" w:color="auto" w:sz="4" w:space="0"/>
-            <w:insideH w:val="single" w:color="auto" w:sz="4" w:space="0"/>
-            <w:insideV w:val="single" w:color="auto" w:sz="4" w:space="0"/>
-          </w:tblBorders>
-          <w:tblCellMar>
-            <w:top w:w="0" w:type="dxa"/>
-            <w:left w:w="108" w:type="dxa"/>
-            <w:bottom w:w="0" w:type="dxa"/>
-            <w:right w:w="108" w:type="dxa"/>
-          </w:tblCellMar>
-        </w:tblPrEx>
         <w:trPr>
-          <w:cantSplit/>
+          <w:cantSplit w:val="1"/>
           <w:trHeight w:val="1108" w:hRule="atLeast"/>
           <w:jc w:val="center"/>
         </w:trPr>
@@ -616,7 +552,7 @@
             </w:pPr>
             <w:r>
               <w:rPr>
-                <w:rFonts w:ascii="Times New Roman" w:hAnsi="Times New Roman" w:eastAsia="宋体"/>
+                <w:rFonts w:hint="eastAsia" w:ascii="Times New Roman" w:hAnsi="Times New Roman" w:eastAsia="宋体"/>
                 <w:b w:val="0"/>
                 <w:sz w:val="22"/>
               </w:rPr>
@@ -630,7 +566,7 @@
             </w:pPr>
             <w:r>
               <w:rPr>
-                <w:rFonts w:ascii="Times New Roman" w:hAnsi="Times New Roman" w:eastAsia="宋体"/>
+                <w:rFonts w:hint="eastAsia" w:ascii="Times New Roman" w:hAnsi="Times New Roman" w:eastAsia="宋体"/>
                 <w:b w:val="0"/>
                 <w:sz w:val="22"/>
               </w:rPr>
@@ -644,7 +580,7 @@
             </w:pPr>
             <w:r>
               <w:rPr>
-                <w:rFonts w:ascii="Times New Roman" w:hAnsi="Times New Roman" w:eastAsia="宋体"/>
+                <w:rFonts w:hint="eastAsia" w:ascii="Times New Roman" w:hAnsi="Times New Roman" w:eastAsia="宋体"/>
                 <w:b w:val="0"/>
                 <w:sz w:val="22"/>
               </w:rPr>
@@ -666,24 +602,8 @@
         </w:tc>
       </w:tr>
       <w:tr>
-        <w:tblPrEx>
-          <w:tblBorders>
-            <w:top w:val="single" w:color="auto" w:sz="4" w:space="0"/>
-            <w:left w:val="single" w:color="auto" w:sz="4" w:space="0"/>
-            <w:bottom w:val="single" w:color="auto" w:sz="4" w:space="0"/>
-            <w:right w:val="single" w:color="auto" w:sz="4" w:space="0"/>
-            <w:insideH w:val="single" w:color="auto" w:sz="4" w:space="0"/>
-            <w:insideV w:val="single" w:color="auto" w:sz="4" w:space="0"/>
-          </w:tblBorders>
-          <w:tblCellMar>
-            <w:top w:w="0" w:type="dxa"/>
-            <w:left w:w="108" w:type="dxa"/>
-            <w:bottom w:w="0" w:type="dxa"/>
-            <w:right w:w="108" w:type="dxa"/>
-          </w:tblCellMar>
-        </w:tblPrEx>
         <w:trPr>
-          <w:cantSplit/>
+          <w:cantSplit w:val="1"/>
           <w:trHeight w:val="1782" w:hRule="atLeast"/>
           <w:jc w:val="center"/>
         </w:trPr>
@@ -717,8 +637,8 @@
             </w:pPr>
             <w:r>
               <w:rPr>
-                <w:rFonts w:ascii="Times New Roman" w:hAnsi="Times New Roman" w:eastAsia="宋体"/>
-                <w:b/>
+                <w:rFonts w:hint="eastAsia" w:ascii="Times New Roman" w:hAnsi="Times New Roman" w:eastAsia="宋体"/>
+                <w:b w:val="1"/>
                 <w:sz w:val="22"/>
               </w:rPr>
               <w:t>2.1 图像边缘与边缘检测</w:t>
@@ -731,7 +651,7 @@
             </w:pPr>
             <w:r>
               <w:rPr>
-                <w:rFonts w:ascii="Times New Roman" w:hAnsi="Times New Roman" w:eastAsia="宋体"/>
+                <w:rFonts w:hint="eastAsia" w:ascii="Times New Roman" w:hAnsi="Times New Roman" w:eastAsia="宋体"/>
                 <w:b w:val="0"/>
                 <w:sz w:val="22"/>
               </w:rPr>
@@ -744,8 +664,8 @@
             </w:pPr>
             <w:r>
               <w:rPr>
-                <w:rFonts w:ascii="Times New Roman" w:hAnsi="Times New Roman" w:eastAsia="宋体"/>
-                <w:b/>
+                <w:rFonts w:hint="eastAsia" w:ascii="Times New Roman" w:hAnsi="Times New Roman" w:eastAsia="宋体"/>
+                <w:b w:val="1"/>
                 <w:sz w:val="22"/>
               </w:rPr>
               <w:t>2.2 一阶微分算子（梯度算子）</w:t>
@@ -758,7 +678,7 @@
             </w:pPr>
             <w:r>
               <w:rPr>
-                <w:rFonts w:ascii="Times New Roman" w:hAnsi="Times New Roman" w:eastAsia="宋体"/>
+                <w:rFonts w:hint="eastAsia" w:ascii="Times New Roman" w:hAnsi="Times New Roman" w:eastAsia="宋体"/>
                 <w:b w:val="0"/>
                 <w:sz w:val="22"/>
               </w:rPr>
@@ -772,7 +692,7 @@
             </w:pPr>
             <w:r>
               <w:rPr>
-                <w:rFonts w:ascii="Times New Roman" w:hAnsi="Times New Roman" w:eastAsia="宋体"/>
+                <w:rFonts w:hint="eastAsia" w:ascii="Times New Roman" w:hAnsi="Times New Roman" w:eastAsia="宋体"/>
                 <w:b w:val="0"/>
                 <w:sz w:val="22"/>
               </w:rPr>
@@ -815,7 +735,7 @@
             </w:pPr>
             <w:r>
               <w:rPr>
-                <w:rFonts w:ascii="Times New Roman" w:hAnsi="Times New Roman" w:eastAsia="宋体"/>
+                <w:rFonts w:hint="eastAsia" w:ascii="Times New Roman" w:hAnsi="Times New Roman" w:eastAsia="宋体"/>
                 <w:b w:val="0"/>
                 <w:sz w:val="22"/>
               </w:rPr>
@@ -874,7 +794,7 @@
             </w:pPr>
             <w:r>
               <w:rPr>
-                <w:rFonts w:ascii="Times New Roman" w:hAnsi="Times New Roman" w:eastAsia="宋体"/>
+                <w:rFonts w:hint="eastAsia" w:ascii="Times New Roman" w:hAnsi="Times New Roman" w:eastAsia="宋体"/>
                 <w:b w:val="0"/>
                 <w:sz w:val="22"/>
               </w:rPr>
@@ -932,8 +852,8 @@
             </w:pPr>
             <w:r>
               <w:rPr>
-                <w:rFonts w:ascii="Times New Roman" w:hAnsi="Times New Roman" w:eastAsia="宋体"/>
-                <w:b/>
+                <w:rFonts w:hint="eastAsia" w:ascii="Times New Roman" w:hAnsi="Times New Roman" w:eastAsia="宋体"/>
+                <w:b w:val="1"/>
                 <w:sz w:val="22"/>
               </w:rPr>
               <w:t>2.3 二阶微分算子（Laplacian 算子）</w:t>
@@ -949,7 +869,7 @@
             </w:pPr>
             <w:r>
               <w:rPr>
-                <w:rFonts w:ascii="Times New Roman" w:hAnsi="Times New Roman" w:eastAsia="宋体"/>
+                <w:rFonts w:hint="eastAsia" w:ascii="Times New Roman" w:hAnsi="Times New Roman" w:eastAsia="宋体"/>
                 <w:b w:val="0"/>
                 <w:sz w:val="22"/>
               </w:rPr>
@@ -959,24 +879,8 @@
         </w:tc>
       </w:tr>
       <w:tr>
-        <w:tblPrEx>
-          <w:tblBorders>
-            <w:top w:val="single" w:color="auto" w:sz="4" w:space="0"/>
-            <w:left w:val="single" w:color="auto" w:sz="4" w:space="0"/>
-            <w:bottom w:val="single" w:color="auto" w:sz="4" w:space="0"/>
-            <w:right w:val="single" w:color="auto" w:sz="4" w:space="0"/>
-            <w:insideH w:val="single" w:color="auto" w:sz="4" w:space="0"/>
-            <w:insideV w:val="single" w:color="auto" w:sz="4" w:space="0"/>
-          </w:tblBorders>
-          <w:tblCellMar>
-            <w:top w:w="0" w:type="dxa"/>
-            <w:left w:w="108" w:type="dxa"/>
-            <w:bottom w:w="0" w:type="dxa"/>
-            <w:right w:w="108" w:type="dxa"/>
-          </w:tblCellMar>
-        </w:tblPrEx>
         <w:trPr>
-          <w:cantSplit/>
+          <w:cantSplit w:val="1"/>
           <w:trHeight w:val="3599" w:hRule="atLeast"/>
           <w:jc w:val="center"/>
         </w:trPr>
@@ -1011,7 +915,7 @@
             </w:pPr>
             <w:r>
               <w:rPr>
-                <w:rFonts w:ascii="Times New Roman" w:hAnsi="Times New Roman" w:eastAsia="宋体"/>
+                <w:rFonts w:hint="eastAsia" w:ascii="Times New Roman" w:hAnsi="Times New Roman" w:eastAsia="宋体"/>
                 <w:b w:val="0"/>
                 <w:sz w:val="22"/>
               </w:rPr>
@@ -1025,7 +929,7 @@
             </w:pPr>
             <w:r>
               <w:rPr>
-                <w:rFonts w:ascii="Times New Roman" w:hAnsi="Times New Roman" w:eastAsia="宋体"/>
+                <w:rFonts w:hint="eastAsia" w:ascii="Times New Roman" w:hAnsi="Times New Roman" w:eastAsia="宋体"/>
                 <w:b w:val="0"/>
                 <w:sz w:val="22"/>
               </w:rPr>
@@ -1039,7 +943,7 @@
             </w:pPr>
             <w:r>
               <w:rPr>
-                <w:rFonts w:ascii="Times New Roman" w:hAnsi="Times New Roman" w:eastAsia="宋体"/>
+                <w:rFonts w:hint="eastAsia" w:ascii="Times New Roman" w:hAnsi="Times New Roman" w:eastAsia="宋体"/>
                 <w:b w:val="0"/>
                 <w:sz w:val="22"/>
               </w:rPr>
@@ -1053,7 +957,7 @@
             </w:pPr>
             <w:r>
               <w:rPr>
-                <w:rFonts w:ascii="Times New Roman" w:hAnsi="Times New Roman" w:eastAsia="宋体"/>
+                <w:rFonts w:hint="eastAsia" w:ascii="Times New Roman" w:hAnsi="Times New Roman" w:eastAsia="宋体"/>
                 <w:b w:val="0"/>
                 <w:sz w:val="22"/>
               </w:rPr>
@@ -1070,36 +974,20 @@
             </w:pPr>
             <w:r>
               <w:rPr>
-                <w:rFonts w:ascii="Times New Roman" w:hAnsi="Times New Roman" w:eastAsia="宋体"/>
+                <w:rFonts w:hint="eastAsia" w:ascii="Times New Roman" w:hAnsi="Times New Roman" w:eastAsia="宋体"/>
                 <w:b w:val="0"/>
                 <w:sz w:val="22"/>
               </w:rPr>
               <w:t>5. 观察并分析各算子的检测效果差异。</w:t>
             </w:r>
-            <w:bookmarkStart w:id="1" w:name="_GoBack"/>
-            <w:bookmarkEnd w:id="1"/>
+            <w:bookmarkStart w:id="2" w:name="_GoBack"/>
+            <w:bookmarkEnd w:id="2"/>
           </w:p>
         </w:tc>
       </w:tr>
       <w:tr>
-        <w:tblPrEx>
-          <w:tblBorders>
-            <w:top w:val="single" w:color="auto" w:sz="4" w:space="0"/>
-            <w:left w:val="single" w:color="auto" w:sz="4" w:space="0"/>
-            <w:bottom w:val="single" w:color="auto" w:sz="4" w:space="0"/>
-            <w:right w:val="single" w:color="auto" w:sz="4" w:space="0"/>
-            <w:insideH w:val="single" w:color="auto" w:sz="4" w:space="0"/>
-            <w:insideV w:val="single" w:color="auto" w:sz="4" w:space="0"/>
-          </w:tblBorders>
-          <w:tblCellMar>
-            <w:top w:w="0" w:type="dxa"/>
-            <w:left w:w="108" w:type="dxa"/>
-            <w:bottom w:w="0" w:type="dxa"/>
-            <w:right w:w="108" w:type="dxa"/>
-          </w:tblCellMar>
-        </w:tblPrEx>
         <w:trPr>
-          <w:cantSplit/>
+          <w:cantSplit w:val="1"/>
           <w:trHeight w:val="3599" w:hRule="atLeast"/>
           <w:jc w:val="center"/>
         </w:trPr>
@@ -3826,8 +3714,8 @@
             <w:r>
               <w:rPr>
                 <w:rFonts w:ascii="宋体" w:hAnsi="华文中宋"/>
-                <w:i/>
-                <w:iCs/>
+                <w:i w:val="1"/>
+                <w:iCs w:val="1"/>
                 <w:sz w:val="24"/>
               </w:rPr>
               <w:br w:type="textWrapping"/>
@@ -3843,24 +3731,8 @@
         </w:tc>
       </w:tr>
       <w:tr>
-        <w:tblPrEx>
-          <w:tblBorders>
-            <w:top w:val="single" w:color="auto" w:sz="4" w:space="0"/>
-            <w:left w:val="single" w:color="auto" w:sz="4" w:space="0"/>
-            <w:bottom w:val="single" w:color="auto" w:sz="4" w:space="0"/>
-            <w:right w:val="single" w:color="auto" w:sz="4" w:space="0"/>
-            <w:insideH w:val="single" w:color="auto" w:sz="4" w:space="0"/>
-            <w:insideV w:val="single" w:color="auto" w:sz="4" w:space="0"/>
-          </w:tblBorders>
-          <w:tblCellMar>
-            <w:top w:w="0" w:type="dxa"/>
-            <w:left w:w="108" w:type="dxa"/>
-            <w:bottom w:w="0" w:type="dxa"/>
-            <w:right w:w="108" w:type="dxa"/>
-          </w:tblCellMar>
-        </w:tblPrEx>
         <w:trPr>
-          <w:cantSplit/>
+          <w:cantSplit w:val="1"/>
           <w:trHeight w:val="8142" w:hRule="atLeast"/>
           <w:jc w:val="center"/>
         </w:trPr>
@@ -3894,7 +3766,7 @@
             </w:pPr>
             <w:r>
               <w:rPr>
-                <w:rFonts w:ascii="Times New Roman" w:hAnsi="Times New Roman" w:eastAsia="宋体"/>
+                <w:rFonts w:hint="eastAsia" w:ascii="Times New Roman" w:hAnsi="Times New Roman" w:eastAsia="宋体"/>
                 <w:b w:val="0"/>
                 <w:sz w:val="22"/>
               </w:rPr>
@@ -3910,21 +3782,21 @@
                 <wp:inline distT="0" distB="0" distL="114300" distR="114300">
                   <wp:extent cx="5579745" cy="3094990"/>
                   <wp:effectExtent l="0" t="0" r="1270" b="3175"/>
-                  <wp:docPr id="1" name="Picture 1"/>
+                  <wp:docPr id="2" name="Picture 1"/>
                   <wp:cNvGraphicFramePr>
-                    <a:graphicFrameLocks xmlns:a="http://schemas.openxmlformats.org/drawingml/2006/main" noChangeAspect="1"/>
+                    <a:graphicFrameLocks noChangeAspect="1"/>
                   </wp:cNvGraphicFramePr>
-                  <a:graphic xmlns:a="http://schemas.openxmlformats.org/drawingml/2006/main">
+                  <a:graphic>
                     <a:graphicData uri="http://schemas.openxmlformats.org/drawingml/2006/picture">
-                      <pic:pic xmlns:pic="http://schemas.openxmlformats.org/drawingml/2006/picture">
+                      <pic:pic>
                         <pic:nvPicPr>
-                          <pic:cNvPr id="1" name="Picture 1"/>
+                          <pic:cNvPr id="3" name="Picture 1"/>
                           <pic:cNvPicPr>
                             <a:picLocks noChangeAspect="1"/>
                           </pic:cNvPicPr>
                         </pic:nvPicPr>
                         <pic:blipFill>
-                          <a:blip r:embed="rId6"/>
+                          <a:blip r:embed="rId7"/>
                           <a:stretch>
                             <a:fillRect/>
                           </a:stretch>
@@ -3956,7 +3828,7 @@
             </w:pPr>
             <w:r>
               <w:rPr>
-                <w:rFonts w:ascii="Times New Roman" w:hAnsi="Times New Roman" w:eastAsia="宋体"/>
+                <w:rFonts w:hint="eastAsia" w:ascii="Times New Roman" w:hAnsi="Times New Roman" w:eastAsia="宋体"/>
                 <w:b w:val="0"/>
                 <w:sz w:val="20"/>
               </w:rPr>
@@ -3979,7 +3851,7 @@
                 <w:rFonts w:hint="eastAsia" w:ascii="宋体" w:hAnsi="华文中宋"/>
                 <w:sz w:val="24"/>
               </w:rPr>
-              <w:t>实验结果分析</w:t>
+              <w:t>6.实验结果分析</w:t>
             </w:r>
           </w:p>
           <w:p>
@@ -3989,7 +3861,7 @@
             </w:pPr>
             <w:r>
               <w:rPr>
-                <w:rFonts w:ascii="Times New Roman" w:hAnsi="Times New Roman" w:eastAsia="宋体"/>
+                <w:rFonts w:hint="eastAsia" w:ascii="Times New Roman" w:hAnsi="Times New Roman" w:eastAsia="宋体"/>
                 <w:b w:val="0"/>
                 <w:sz w:val="22"/>
               </w:rPr>
@@ -4002,8 +3874,8 @@
             </w:pPr>
             <w:r>
               <w:rPr>
-                <w:rFonts w:ascii="Times New Roman" w:hAnsi="Times New Roman" w:eastAsia="宋体"/>
-                <w:b/>
+                <w:rFonts w:hint="eastAsia" w:ascii="Times New Roman" w:hAnsi="Times New Roman" w:eastAsia="宋体"/>
+                <w:b w:val="1"/>
                 <w:sz w:val="22"/>
               </w:rPr>
               <w:t>（1）Roberts 算子</w:t>
@@ -4016,7 +3888,7 @@
             </w:pPr>
             <w:r>
               <w:rPr>
-                <w:rFonts w:ascii="Times New Roman" w:hAnsi="Times New Roman" w:eastAsia="宋体"/>
+                <w:rFonts w:hint="eastAsia" w:ascii="Times New Roman" w:hAnsi="Times New Roman" w:eastAsia="宋体"/>
                 <w:b w:val="0"/>
                 <w:sz w:val="22"/>
               </w:rPr>
@@ -4029,8 +3901,8 @@
             </w:pPr>
             <w:r>
               <w:rPr>
-                <w:rFonts w:ascii="Times New Roman" w:hAnsi="Times New Roman" w:eastAsia="宋体"/>
-                <w:b/>
+                <w:rFonts w:hint="eastAsia" w:ascii="Times New Roman" w:hAnsi="Times New Roman" w:eastAsia="宋体"/>
+                <w:b w:val="1"/>
                 <w:sz w:val="22"/>
               </w:rPr>
               <w:t>（2）Prewitt 算子</w:t>
@@ -4043,7 +3915,7 @@
             </w:pPr>
             <w:r>
               <w:rPr>
-                <w:rFonts w:ascii="Times New Roman" w:hAnsi="Times New Roman" w:eastAsia="宋体"/>
+                <w:rFonts w:hint="eastAsia" w:ascii="Times New Roman" w:hAnsi="Times New Roman" w:eastAsia="宋体"/>
                 <w:b w:val="0"/>
                 <w:sz w:val="22"/>
               </w:rPr>
@@ -4056,8 +3928,8 @@
             </w:pPr>
             <w:r>
               <w:rPr>
-                <w:rFonts w:ascii="Times New Roman" w:hAnsi="Times New Roman" w:eastAsia="宋体"/>
-                <w:b/>
+                <w:rFonts w:hint="eastAsia" w:ascii="Times New Roman" w:hAnsi="Times New Roman" w:eastAsia="宋体"/>
+                <w:b w:val="1"/>
                 <w:sz w:val="22"/>
               </w:rPr>
               <w:t>（3）Sobel 算子</w:t>
@@ -4070,7 +3942,7 @@
             </w:pPr>
             <w:r>
               <w:rPr>
-                <w:rFonts w:ascii="Times New Roman" w:hAnsi="Times New Roman" w:eastAsia="宋体"/>
+                <w:rFonts w:hint="eastAsia" w:ascii="Times New Roman" w:hAnsi="Times New Roman" w:eastAsia="宋体"/>
                 <w:b w:val="0"/>
                 <w:sz w:val="22"/>
               </w:rPr>
@@ -4083,8 +3955,8 @@
             </w:pPr>
             <w:r>
               <w:rPr>
-                <w:rFonts w:ascii="Times New Roman" w:hAnsi="Times New Roman" w:eastAsia="宋体"/>
-                <w:b/>
+                <w:rFonts w:hint="eastAsia" w:ascii="Times New Roman" w:hAnsi="Times New Roman" w:eastAsia="宋体"/>
+                <w:b w:val="1"/>
                 <w:sz w:val="22"/>
               </w:rPr>
               <w:t>（4）Laplacian 算子</w:t>
@@ -4097,7 +3969,7 @@
             </w:pPr>
             <w:r>
               <w:rPr>
-                <w:rFonts w:ascii="Times New Roman" w:hAnsi="Times New Roman" w:eastAsia="宋体"/>
+                <w:rFonts w:hint="eastAsia" w:ascii="Times New Roman" w:hAnsi="Times New Roman" w:eastAsia="宋体"/>
                 <w:b w:val="0"/>
                 <w:sz w:val="22"/>
               </w:rPr>
@@ -4111,7 +3983,7 @@
             </w:pPr>
             <w:r>
               <w:rPr>
-                <w:rFonts w:ascii="Times New Roman" w:hAnsi="Times New Roman" w:eastAsia="宋体"/>
+                <w:rFonts w:hint="eastAsia" w:ascii="Times New Roman" w:hAnsi="Times New Roman" w:eastAsia="宋体"/>
                 <w:b w:val="0"/>
                 <w:sz w:val="22"/>
               </w:rPr>
@@ -4120,7 +3992,7 @@
           </w:p>
           <w:tbl>
             <w:tblPr>
-              <w:tblStyle w:val="7"/>
+              <w:tblStyle w:val="000012"/>
               <w:tblW w:w="0" w:type="auto"/>
               <w:jc w:val="center"/>
               <w:tblBorders>
@@ -4148,22 +4020,6 @@
               <w:gridCol w:w="1512"/>
             </w:tblGrid>
             <w:tr>
-              <w:tblPrEx>
-                <w:tblBorders>
-                  <w:top w:val="single" w:color="auto" w:sz="4" w:space="0"/>
-                  <w:left w:val="single" w:color="auto" w:sz="4" w:space="0"/>
-                  <w:bottom w:val="single" w:color="auto" w:sz="4" w:space="0"/>
-                  <w:right w:val="single" w:color="auto" w:sz="4" w:space="0"/>
-                  <w:insideH w:val="single" w:color="auto" w:sz="4" w:space="0"/>
-                  <w:insideV w:val="single" w:color="auto" w:sz="4" w:space="0"/>
-                </w:tblBorders>
-                <w:tblCellMar>
-                  <w:top w:w="0" w:type="dxa"/>
-                  <w:left w:w="108" w:type="dxa"/>
-                  <w:bottom w:w="0" w:type="dxa"/>
-                  <w:right w:w="108" w:type="dxa"/>
-                </w:tblCellMar>
-              </w:tblPrEx>
               <w:trPr>
                 <w:jc w:val="center"/>
               </w:trPr>
@@ -4184,8 +4040,8 @@
                   </w:pPr>
                   <w:r>
                     <w:rPr>
-                      <w:rFonts w:ascii="Times New Roman" w:hAnsi="Times New Roman" w:eastAsia="宋体"/>
-                      <w:b/>
+                      <w:rFonts w:hint="eastAsia" w:ascii="Times New Roman" w:hAnsi="Times New Roman" w:eastAsia="宋体"/>
+                      <w:b w:val="1"/>
                       <w:sz w:val="22"/>
                     </w:rPr>
                     <w:t>算子</w:t>
@@ -4209,8 +4065,8 @@
                   </w:pPr>
                   <w:r>
                     <w:rPr>
-                      <w:rFonts w:ascii="Times New Roman" w:hAnsi="Times New Roman" w:eastAsia="宋体"/>
-                      <w:b/>
+                      <w:rFonts w:hint="eastAsia" w:ascii="Times New Roman" w:hAnsi="Times New Roman" w:eastAsia="宋体"/>
+                      <w:b w:val="1"/>
                       <w:sz w:val="22"/>
                     </w:rPr>
                     <w:t>模板尺寸</w:t>
@@ -4234,8 +4090,8 @@
                   </w:pPr>
                   <w:r>
                     <w:rPr>
-                      <w:rFonts w:ascii="Times New Roman" w:hAnsi="Times New Roman" w:eastAsia="宋体"/>
-                      <w:b/>
+                      <w:rFonts w:hint="eastAsia" w:ascii="Times New Roman" w:hAnsi="Times New Roman" w:eastAsia="宋体"/>
+                      <w:b w:val="1"/>
                       <w:sz w:val="22"/>
                     </w:rPr>
                     <w:t>微分阶数</w:t>
@@ -4259,8 +4115,8 @@
                   </w:pPr>
                   <w:r>
                     <w:rPr>
-                      <w:rFonts w:ascii="Times New Roman" w:hAnsi="Times New Roman" w:eastAsia="宋体"/>
-                      <w:b/>
+                      <w:rFonts w:hint="eastAsia" w:ascii="Times New Roman" w:hAnsi="Times New Roman" w:eastAsia="宋体"/>
+                      <w:b w:val="1"/>
                       <w:sz w:val="22"/>
                     </w:rPr>
                     <w:t>方向性</w:t>
@@ -4284,8 +4140,8 @@
                   </w:pPr>
                   <w:r>
                     <w:rPr>
-                      <w:rFonts w:ascii="Times New Roman" w:hAnsi="Times New Roman" w:eastAsia="宋体"/>
-                      <w:b/>
+                      <w:rFonts w:hint="eastAsia" w:ascii="Times New Roman" w:hAnsi="Times New Roman" w:eastAsia="宋体"/>
+                      <w:b w:val="1"/>
                       <w:sz w:val="22"/>
                     </w:rPr>
                     <w:t>抗噪能力</w:t>
@@ -4309,8 +4165,8 @@
                   </w:pPr>
                   <w:r>
                     <w:rPr>
-                      <w:rFonts w:ascii="Times New Roman" w:hAnsi="Times New Roman" w:eastAsia="宋体"/>
-                      <w:b/>
+                      <w:rFonts w:hint="eastAsia" w:ascii="Times New Roman" w:hAnsi="Times New Roman" w:eastAsia="宋体"/>
+                      <w:b w:val="1"/>
                       <w:sz w:val="22"/>
                     </w:rPr>
                     <w:t>边缘定位</w:t>
@@ -4319,22 +4175,6 @@
               </w:tc>
             </w:tr>
             <w:tr>
-              <w:tblPrEx>
-                <w:tblBorders>
-                  <w:top w:val="single" w:color="auto" w:sz="4" w:space="0"/>
-                  <w:left w:val="single" w:color="auto" w:sz="4" w:space="0"/>
-                  <w:bottom w:val="single" w:color="auto" w:sz="4" w:space="0"/>
-                  <w:right w:val="single" w:color="auto" w:sz="4" w:space="0"/>
-                  <w:insideH w:val="single" w:color="auto" w:sz="4" w:space="0"/>
-                  <w:insideV w:val="single" w:color="auto" w:sz="4" w:space="0"/>
-                </w:tblBorders>
-                <w:tblCellMar>
-                  <w:top w:w="0" w:type="dxa"/>
-                  <w:left w:w="108" w:type="dxa"/>
-                  <w:bottom w:w="0" w:type="dxa"/>
-                  <w:right w:w="108" w:type="dxa"/>
-                </w:tblCellMar>
-              </w:tblPrEx>
               <w:trPr>
                 <w:jc w:val="center"/>
               </w:trPr>
@@ -4405,7 +4245,7 @@
                   </w:pPr>
                   <w:r>
                     <w:rPr>
-                      <w:rFonts w:ascii="Times New Roman" w:hAnsi="Times New Roman" w:eastAsia="宋体"/>
+                      <w:rFonts w:hint="eastAsia" w:ascii="Times New Roman" w:hAnsi="Times New Roman" w:eastAsia="宋体"/>
                       <w:b w:val="0"/>
                       <w:sz w:val="20"/>
                     </w:rPr>
@@ -4430,7 +4270,7 @@
                   </w:pPr>
                   <w:r>
                     <w:rPr>
-                      <w:rFonts w:ascii="Times New Roman" w:hAnsi="Times New Roman" w:eastAsia="宋体"/>
+                      <w:rFonts w:hint="eastAsia" w:ascii="Times New Roman" w:hAnsi="Times New Roman" w:eastAsia="宋体"/>
                       <w:b w:val="0"/>
                       <w:sz w:val="20"/>
                     </w:rPr>
@@ -4455,7 +4295,7 @@
                   </w:pPr>
                   <w:r>
                     <w:rPr>
-                      <w:rFonts w:ascii="Times New Roman" w:hAnsi="Times New Roman" w:eastAsia="宋体"/>
+                      <w:rFonts w:hint="eastAsia" w:ascii="Times New Roman" w:hAnsi="Times New Roman" w:eastAsia="宋体"/>
                       <w:b w:val="0"/>
                       <w:sz w:val="20"/>
                     </w:rPr>
@@ -4480,7 +4320,7 @@
                   </w:pPr>
                   <w:r>
                     <w:rPr>
-                      <w:rFonts w:ascii="Times New Roman" w:hAnsi="Times New Roman" w:eastAsia="宋体"/>
+                      <w:rFonts w:hint="eastAsia" w:ascii="Times New Roman" w:hAnsi="Times New Roman" w:eastAsia="宋体"/>
                       <w:b w:val="0"/>
                       <w:sz w:val="20"/>
                     </w:rPr>
@@ -4490,22 +4330,6 @@
               </w:tc>
             </w:tr>
             <w:tr>
-              <w:tblPrEx>
-                <w:tblBorders>
-                  <w:top w:val="single" w:color="auto" w:sz="4" w:space="0"/>
-                  <w:left w:val="single" w:color="auto" w:sz="4" w:space="0"/>
-                  <w:bottom w:val="single" w:color="auto" w:sz="4" w:space="0"/>
-                  <w:right w:val="single" w:color="auto" w:sz="4" w:space="0"/>
-                  <w:insideH w:val="single" w:color="auto" w:sz="4" w:space="0"/>
-                  <w:insideV w:val="single" w:color="auto" w:sz="4" w:space="0"/>
-                </w:tblBorders>
-                <w:tblCellMar>
-                  <w:top w:w="0" w:type="dxa"/>
-                  <w:left w:w="108" w:type="dxa"/>
-                  <w:bottom w:w="0" w:type="dxa"/>
-                  <w:right w:w="108" w:type="dxa"/>
-                </w:tblCellMar>
-              </w:tblPrEx>
               <w:trPr>
                 <w:jc w:val="center"/>
               </w:trPr>
@@ -4576,7 +4400,7 @@
                   </w:pPr>
                   <w:r>
                     <w:rPr>
-                      <w:rFonts w:ascii="Times New Roman" w:hAnsi="Times New Roman" w:eastAsia="宋体"/>
+                      <w:rFonts w:hint="eastAsia" w:ascii="Times New Roman" w:hAnsi="Times New Roman" w:eastAsia="宋体"/>
                       <w:b w:val="0"/>
                       <w:sz w:val="20"/>
                     </w:rPr>
@@ -4601,7 +4425,7 @@
                   </w:pPr>
                   <w:r>
                     <w:rPr>
-                      <w:rFonts w:ascii="Times New Roman" w:hAnsi="Times New Roman" w:eastAsia="宋体"/>
+                      <w:rFonts w:hint="eastAsia" w:ascii="Times New Roman" w:hAnsi="Times New Roman" w:eastAsia="宋体"/>
                       <w:b w:val="0"/>
                       <w:sz w:val="20"/>
                     </w:rPr>
@@ -4626,7 +4450,7 @@
                   </w:pPr>
                   <w:r>
                     <w:rPr>
-                      <w:rFonts w:ascii="Times New Roman" w:hAnsi="Times New Roman" w:eastAsia="宋体"/>
+                      <w:rFonts w:hint="eastAsia" w:ascii="Times New Roman" w:hAnsi="Times New Roman" w:eastAsia="宋体"/>
                       <w:b w:val="0"/>
                       <w:sz w:val="20"/>
                     </w:rPr>
@@ -4651,7 +4475,7 @@
                   </w:pPr>
                   <w:r>
                     <w:rPr>
-                      <w:rFonts w:ascii="Times New Roman" w:hAnsi="Times New Roman" w:eastAsia="宋体"/>
+                      <w:rFonts w:hint="eastAsia" w:ascii="Times New Roman" w:hAnsi="Times New Roman" w:eastAsia="宋体"/>
                       <w:b w:val="0"/>
                       <w:sz w:val="20"/>
                     </w:rPr>
@@ -4661,22 +4485,6 @@
               </w:tc>
             </w:tr>
             <w:tr>
-              <w:tblPrEx>
-                <w:tblBorders>
-                  <w:top w:val="single" w:color="auto" w:sz="4" w:space="0"/>
-                  <w:left w:val="single" w:color="auto" w:sz="4" w:space="0"/>
-                  <w:bottom w:val="single" w:color="auto" w:sz="4" w:space="0"/>
-                  <w:right w:val="single" w:color="auto" w:sz="4" w:space="0"/>
-                  <w:insideH w:val="single" w:color="auto" w:sz="4" w:space="0"/>
-                  <w:insideV w:val="single" w:color="auto" w:sz="4" w:space="0"/>
-                </w:tblBorders>
-                <w:tblCellMar>
-                  <w:top w:w="0" w:type="dxa"/>
-                  <w:left w:w="108" w:type="dxa"/>
-                  <w:bottom w:w="0" w:type="dxa"/>
-                  <w:right w:w="108" w:type="dxa"/>
-                </w:tblCellMar>
-              </w:tblPrEx>
               <w:trPr>
                 <w:jc w:val="center"/>
               </w:trPr>
@@ -4747,7 +4555,7 @@
                   </w:pPr>
                   <w:r>
                     <w:rPr>
-                      <w:rFonts w:ascii="Times New Roman" w:hAnsi="Times New Roman" w:eastAsia="宋体"/>
+                      <w:rFonts w:hint="eastAsia" w:ascii="Times New Roman" w:hAnsi="Times New Roman" w:eastAsia="宋体"/>
                       <w:b w:val="0"/>
                       <w:sz w:val="20"/>
                     </w:rPr>
@@ -4772,7 +4580,7 @@
                   </w:pPr>
                   <w:r>
                     <w:rPr>
-                      <w:rFonts w:ascii="Times New Roman" w:hAnsi="Times New Roman" w:eastAsia="宋体"/>
+                      <w:rFonts w:hint="eastAsia" w:ascii="Times New Roman" w:hAnsi="Times New Roman" w:eastAsia="宋体"/>
                       <w:b w:val="0"/>
                       <w:sz w:val="20"/>
                     </w:rPr>
@@ -4797,7 +4605,7 @@
                   </w:pPr>
                   <w:r>
                     <w:rPr>
-                      <w:rFonts w:ascii="Times New Roman" w:hAnsi="Times New Roman" w:eastAsia="宋体"/>
+                      <w:rFonts w:hint="eastAsia" w:ascii="Times New Roman" w:hAnsi="Times New Roman" w:eastAsia="宋体"/>
                       <w:b w:val="0"/>
                       <w:sz w:val="20"/>
                     </w:rPr>
@@ -4822,7 +4630,7 @@
                   </w:pPr>
                   <w:r>
                     <w:rPr>
-                      <w:rFonts w:ascii="Times New Roman" w:hAnsi="Times New Roman" w:eastAsia="宋体"/>
+                      <w:rFonts w:hint="eastAsia" w:ascii="Times New Roman" w:hAnsi="Times New Roman" w:eastAsia="宋体"/>
                       <w:b w:val="0"/>
                       <w:sz w:val="20"/>
                     </w:rPr>
@@ -4832,22 +4640,6 @@
               </w:tc>
             </w:tr>
             <w:tr>
-              <w:tblPrEx>
-                <w:tblBorders>
-                  <w:top w:val="single" w:color="auto" w:sz="4" w:space="0"/>
-                  <w:left w:val="single" w:color="auto" w:sz="4" w:space="0"/>
-                  <w:bottom w:val="single" w:color="auto" w:sz="4" w:space="0"/>
-                  <w:right w:val="single" w:color="auto" w:sz="4" w:space="0"/>
-                  <w:insideH w:val="single" w:color="auto" w:sz="4" w:space="0"/>
-                  <w:insideV w:val="single" w:color="auto" w:sz="4" w:space="0"/>
-                </w:tblBorders>
-                <w:tblCellMar>
-                  <w:top w:w="0" w:type="dxa"/>
-                  <w:left w:w="108" w:type="dxa"/>
-                  <w:bottom w:w="0" w:type="dxa"/>
-                  <w:right w:w="108" w:type="dxa"/>
-                </w:tblCellMar>
-              </w:tblPrEx>
               <w:trPr>
                 <w:jc w:val="center"/>
               </w:trPr>
@@ -4918,7 +4710,7 @@
                   </w:pPr>
                   <w:r>
                     <w:rPr>
-                      <w:rFonts w:ascii="Times New Roman" w:hAnsi="Times New Roman" w:eastAsia="宋体"/>
+                      <w:rFonts w:hint="eastAsia" w:ascii="Times New Roman" w:hAnsi="Times New Roman" w:eastAsia="宋体"/>
                       <w:b w:val="0"/>
                       <w:sz w:val="20"/>
                     </w:rPr>
@@ -4943,7 +4735,7 @@
                   </w:pPr>
                   <w:r>
                     <w:rPr>
-                      <w:rFonts w:ascii="Times New Roman" w:hAnsi="Times New Roman" w:eastAsia="宋体"/>
+                      <w:rFonts w:hint="eastAsia" w:ascii="Times New Roman" w:hAnsi="Times New Roman" w:eastAsia="宋体"/>
                       <w:b w:val="0"/>
                       <w:sz w:val="20"/>
                     </w:rPr>
@@ -4968,7 +4760,7 @@
                   </w:pPr>
                   <w:r>
                     <w:rPr>
-                      <w:rFonts w:ascii="Times New Roman" w:hAnsi="Times New Roman" w:eastAsia="宋体"/>
+                      <w:rFonts w:hint="eastAsia" w:ascii="Times New Roman" w:hAnsi="Times New Roman" w:eastAsia="宋体"/>
                       <w:b w:val="0"/>
                       <w:sz w:val="20"/>
                     </w:rPr>
@@ -4993,7 +4785,7 @@
                   </w:pPr>
                   <w:r>
                     <w:rPr>
-                      <w:rFonts w:ascii="Times New Roman" w:hAnsi="Times New Roman" w:eastAsia="宋体"/>
+                      <w:rFonts w:hint="eastAsia" w:ascii="Times New Roman" w:hAnsi="Times New Roman" w:eastAsia="宋体"/>
                       <w:b w:val="0"/>
                       <w:sz w:val="20"/>
                     </w:rPr>
@@ -5015,7 +4807,7 @@
             </w:pPr>
             <w:r>
               <w:rPr>
-                <w:rFonts w:ascii="Times New Roman" w:hAnsi="Times New Roman" w:eastAsia="宋体"/>
+                <w:rFonts w:hint="eastAsia" w:ascii="Times New Roman" w:hAnsi="Times New Roman" w:eastAsia="宋体"/>
                 <w:b w:val="0"/>
                 <w:sz w:val="22"/>
               </w:rPr>
@@ -5039,8 +4831,8 @@
     <w:p>
       <w:pPr>
         <w:rPr>
-          <w:b/>
-          <w:bCs/>
+          <w:b w:val="1"/>
+          <w:bCs w:val="1"/>
           <w:color w:val="C00000"/>
           <w:sz w:val="32"/>
           <w:szCs w:val="32"/>
@@ -5048,7 +4840,9 @@
         </w:rPr>
       </w:pPr>
     </w:p>
-    <w:p/>
+    <w:p>
+      <w:pPr/>
+    </w:p>
     <w:sectPr>
       <w:pgSz w:w="11906" w:h="16838"/>
       <w:pgMar w:top="1440" w:right="1800" w:bottom="1440" w:left="1800" w:header="851" w:footer="992" w:gutter="0"/>
@@ -5060,8 +4854,18 @@
 </file>
 
 <file path=word/endnotes.xml><?xml version="1.0" encoding="utf-8"?>
-<w:endnotes xmlns:wpc="http://schemas.microsoft.com/office/word/2010/wordprocessingCanvas" xmlns:mc="http://schemas.openxmlformats.org/markup-compatibility/2006" xmlns:o="urn:schemas-microsoft-com:office:office" xmlns:r="http://schemas.openxmlformats.org/officeDocument/2006/relationships" xmlns:m="http://schemas.openxmlformats.org/officeDocument/2006/math" xmlns:v="urn:schemas-microsoft-com:vml" xmlns:wp14="http://schemas.microsoft.com/office/word/2010/wordprocessingDrawing" xmlns:wp="http://schemas.openxmlformats.org/drawingml/2006/wordprocessingDrawing" xmlns:w="http://schemas.openxmlformats.org/wordprocessingml/2006/main" xmlns:w14="http://schemas.microsoft.com/office/word/2010/wordml" xmlns:w15="http://schemas.microsoft.com/office/word/2012/wordml" xmlns:w10="urn:schemas-microsoft-com:office:word" xmlns:wpg="http://schemas.microsoft.com/office/word/2010/wordprocessingGroup" xmlns:wpi="http://schemas.microsoft.com/office/word/2010/wordprocessingInk" xmlns:wne="http://schemas.microsoft.com/office/word/2006/wordml" xmlns:wps="http://schemas.microsoft.com/office/word/2010/wordprocessingShape" xmlns:wpsCustomData="http://www.wps.cn/officeDocument/2013/wpsCustomData" mc:Ignorable="w14 w15 wp14">
-  <w:endnote w:type="separator" w:id="0">
+<w:endnotes xmlns:w="http://schemas.openxmlformats.org/wordprocessingml/2006/main" xmlns:w14="http://schemas.microsoft.com/office/word/2010/wordml" xmlns:mc="http://schemas.openxmlformats.org/markup-compatibility/2006" mc:Ignorable="w14">
+  <w:endnote w:type="continuationSeparator" w:id="0">
+    <w:p>
+      <w:pPr>
+        <w:spacing w:line="240" w:lineRule="auto"/>
+      </w:pPr>
+      <w:r>
+        <w:continuationSeparator/>
+      </w:r>
+    </w:p>
+  </w:endnote>
+  <w:endnote w:type="separator" w:id="1">
     <w:p>
       <w:pPr>
         <w:spacing w:line="240" w:lineRule="auto"/>
@@ -5071,21 +4875,21 @@
       </w:r>
     </w:p>
   </w:endnote>
-  <w:endnote w:type="continuationSeparator" w:id="1">
+</w:endnotes>
+</file>
+
+<file path=word/footnotes.xml><?xml version="1.0" encoding="utf-8"?>
+<w:footnotes xmlns:w="http://schemas.openxmlformats.org/wordprocessingml/2006/main" xmlns:w14="http://schemas.microsoft.com/office/word/2010/wordml" xmlns:mc="http://schemas.openxmlformats.org/markup-compatibility/2006" mc:Ignorable="w14">
+  <w:footnote w:type="continuationSeparator" w:id="1">
     <w:p>
       <w:pPr>
-        <w:spacing w:line="240" w:lineRule="auto"/>
+        <w:spacing w:before="0" w:after="0" w:line="240" w:lineRule="auto"/>
       </w:pPr>
       <w:r>
         <w:continuationSeparator/>
       </w:r>
     </w:p>
-  </w:endnote>
-</w:endnotes>
-</file>
-
-<file path=word/footnotes.xml><?xml version="1.0" encoding="utf-8"?>
-<w:footnotes xmlns:wpc="http://schemas.microsoft.com/office/word/2010/wordprocessingCanvas" xmlns:mc="http://schemas.openxmlformats.org/markup-compatibility/2006" xmlns:o="urn:schemas-microsoft-com:office:office" xmlns:r="http://schemas.openxmlformats.org/officeDocument/2006/relationships" xmlns:m="http://schemas.openxmlformats.org/officeDocument/2006/math" xmlns:v="urn:schemas-microsoft-com:vml" xmlns:wp14="http://schemas.microsoft.com/office/word/2010/wordprocessingDrawing" xmlns:wp="http://schemas.openxmlformats.org/drawingml/2006/wordprocessingDrawing" xmlns:w="http://schemas.openxmlformats.org/wordprocessingml/2006/main" xmlns:w14="http://schemas.microsoft.com/office/word/2010/wordml" xmlns:w15="http://schemas.microsoft.com/office/word/2012/wordml" xmlns:w10="urn:schemas-microsoft-com:office:word" xmlns:wpg="http://schemas.microsoft.com/office/word/2010/wordprocessingGroup" xmlns:wpi="http://schemas.microsoft.com/office/word/2010/wordprocessingInk" xmlns:wne="http://schemas.microsoft.com/office/word/2006/wordml" xmlns:wps="http://schemas.microsoft.com/office/word/2010/wordprocessingShape" xmlns:wpsCustomData="http://www.wps.cn/officeDocument/2013/wpsCustomData" mc:Ignorable="w14 w15 wp14">
+  </w:footnote>
   <w:footnote w:type="separator" w:id="0">
     <w:p>
       <w:pPr>
@@ -5096,21 +4900,11 @@
       </w:r>
     </w:p>
   </w:footnote>
-  <w:footnote w:type="continuationSeparator" w:id="1">
-    <w:p>
-      <w:pPr>
-        <w:spacing w:before="0" w:after="0" w:line="240" w:lineRule="auto"/>
-      </w:pPr>
-      <w:r>
-        <w:continuationSeparator/>
-      </w:r>
-    </w:p>
-  </w:footnote>
 </w:footnotes>
 </file>
 
 <file path=word/numbering.xml><?xml version="1.0" encoding="utf-8"?>
-<w:numbering xmlns:wpc="http://schemas.microsoft.com/office/word/2010/wordprocessingCanvas" xmlns:mc="http://schemas.openxmlformats.org/markup-compatibility/2006" xmlns:o="urn:schemas-microsoft-com:office:office" xmlns:r="http://schemas.openxmlformats.org/officeDocument/2006/relationships" xmlns:m="http://schemas.openxmlformats.org/officeDocument/2006/math" xmlns:v="urn:schemas-microsoft-com:vml" xmlns:wp14="http://schemas.microsoft.com/office/word/2010/wordprocessingDrawing" xmlns:wp="http://schemas.openxmlformats.org/drawingml/2006/wordprocessingDrawing" xmlns:w10="urn:schemas-microsoft-com:office:word" xmlns:w="http://schemas.openxmlformats.org/wordprocessingml/2006/main" xmlns:w14="http://schemas.microsoft.com/office/word/2010/wordml" xmlns:wpg="http://schemas.microsoft.com/office/word/2010/wordprocessingGroup" xmlns:wpi="http://schemas.microsoft.com/office/word/2010/wordprocessingInk" xmlns:wne="http://schemas.microsoft.com/office/word/2006/wordml" xmlns:wps="http://schemas.microsoft.com/office/word/2010/wordprocessingShape" xmlns:wpsCustomData="http://www.wps.cn/officeDocument/2013/wpsCustomData" mc:Ignorable="w14 wp14">
+<w:numbering xmlns:w="http://schemas.openxmlformats.org/wordprocessingml/2006/main">
   <w:abstractNum w:abstractNumId="0">
     <w:nsid w:val="E02B56A1"/>
     <w:multiLevelType w:val="singleLevel"/>
@@ -5134,7 +4928,7 @@
 </file>
 
 <file path=word/styles.xml><?xml version="1.0" encoding="utf-8"?>
-<w:styles xmlns:mc="http://schemas.openxmlformats.org/markup-compatibility/2006" xmlns:o="urn:schemas-microsoft-com:office:office" xmlns:r="http://schemas.openxmlformats.org/officeDocument/2006/relationships" xmlns:m="http://schemas.openxmlformats.org/officeDocument/2006/math" xmlns:v="urn:schemas-microsoft-com:vml" xmlns:w="http://schemas.openxmlformats.org/wordprocessingml/2006/main" xmlns:w14="http://schemas.microsoft.com/office/word/2010/wordml" xmlns:w10="urn:schemas-microsoft-com:office:word" xmlns:sl="http://schemas.openxmlformats.org/schemaLibrary/2006/main" xmlns:wpsCustomData="http://www.wps.cn/officeDocument/2013/wpsCustomData" mc:Ignorable="w14">
+<w:styles xmlns:w="http://schemas.openxmlformats.org/wordprocessingml/2006/main" xmlns:w14="http://schemas.microsoft.com/office/word/2010/wordml" xmlns:mc="http://schemas.openxmlformats.org/markup-compatibility/2006" mc:Ignorable="w14">
   <w:docDefaults>
     <w:rPrDefault>
       <w:rPr>
@@ -5143,261 +4937,268 @@
     </w:rPrDefault>
     <w:pPrDefault/>
   </w:docDefaults>
-  <w:latentStyles w:count="260" w:defQFormat="0" w:defUnhideWhenUsed="1" w:defSemiHidden="1" w:defUIPriority="99" w:defLockedState="0">
-    <w:lsdException w:qFormat="1" w:unhideWhenUsed="0" w:uiPriority="0" w:semiHidden="0" w:name="Normal"/>
-    <w:lsdException w:qFormat="1" w:unhideWhenUsed="0" w:uiPriority="9" w:semiHidden="0" w:name="heading 1"/>
-    <w:lsdException w:qFormat="1" w:uiPriority="9" w:name="heading 2"/>
-    <w:lsdException w:qFormat="1" w:uiPriority="9" w:name="heading 3"/>
-    <w:lsdException w:qFormat="1" w:uiPriority="9" w:name="heading 4"/>
-    <w:lsdException w:qFormat="1" w:uiPriority="9" w:name="heading 5"/>
-    <w:lsdException w:qFormat="1" w:uiPriority="9" w:name="heading 6"/>
-    <w:lsdException w:qFormat="1" w:uiPriority="9" w:name="heading 7"/>
-    <w:lsdException w:qFormat="1" w:uiPriority="9" w:name="heading 8"/>
-    <w:lsdException w:qFormat="1" w:uiPriority="9" w:name="heading 9"/>
-    <w:lsdException w:uiPriority="99" w:name="index 1"/>
-    <w:lsdException w:uiPriority="99" w:name="index 2"/>
-    <w:lsdException w:uiPriority="99" w:name="index 3"/>
-    <w:lsdException w:uiPriority="99" w:name="index 4"/>
-    <w:lsdException w:uiPriority="99" w:name="index 5"/>
-    <w:lsdException w:uiPriority="99" w:name="index 6"/>
-    <w:lsdException w:uiPriority="99" w:name="index 7"/>
-    <w:lsdException w:uiPriority="99" w:name="index 8"/>
-    <w:lsdException w:uiPriority="99" w:name="index 9"/>
-    <w:lsdException w:uiPriority="39" w:name="toc 1"/>
-    <w:lsdException w:uiPriority="39" w:name="toc 2"/>
-    <w:lsdException w:uiPriority="39" w:name="toc 3"/>
-    <w:lsdException w:uiPriority="39" w:name="toc 4"/>
-    <w:lsdException w:uiPriority="39" w:name="toc 5"/>
-    <w:lsdException w:uiPriority="39" w:name="toc 6"/>
-    <w:lsdException w:uiPriority="39" w:name="toc 7"/>
-    <w:lsdException w:uiPriority="39" w:name="toc 8"/>
-    <w:lsdException w:uiPriority="39" w:name="toc 9"/>
-    <w:lsdException w:uiPriority="99" w:name="Normal Indent"/>
-    <w:lsdException w:uiPriority="99" w:name="footnote text"/>
-    <w:lsdException w:uiPriority="99" w:name="annotation text"/>
-    <w:lsdException w:uiPriority="99" w:semiHidden="0" w:name="header"/>
-    <w:lsdException w:qFormat="1" w:uiPriority="99" w:semiHidden="0" w:name="footer"/>
-    <w:lsdException w:uiPriority="99" w:name="index heading"/>
-    <w:lsdException w:qFormat="1" w:uiPriority="35" w:name="caption"/>
-    <w:lsdException w:uiPriority="99" w:name="table of figures"/>
-    <w:lsdException w:uiPriority="99" w:name="envelope address"/>
-    <w:lsdException w:uiPriority="99" w:name="envelope return"/>
-    <w:lsdException w:uiPriority="99" w:name="footnote reference"/>
-    <w:lsdException w:uiPriority="99" w:name="annotation reference"/>
-    <w:lsdException w:uiPriority="99" w:name="line number"/>
-    <w:lsdException w:uiPriority="99" w:name="page number"/>
-    <w:lsdException w:uiPriority="99" w:name="endnote reference"/>
-    <w:lsdException w:uiPriority="99" w:name="endnote text"/>
-    <w:lsdException w:uiPriority="99" w:name="table of authorities"/>
-    <w:lsdException w:uiPriority="99" w:name="macro"/>
-    <w:lsdException w:uiPriority="99" w:name="toa heading"/>
-    <w:lsdException w:uiPriority="99" w:name="List"/>
-    <w:lsdException w:uiPriority="99" w:name="List Bullet"/>
-    <w:lsdException w:uiPriority="99" w:name="List Number"/>
-    <w:lsdException w:uiPriority="99" w:name="List 2"/>
-    <w:lsdException w:uiPriority="99" w:name="List 3"/>
-    <w:lsdException w:uiPriority="99" w:name="List 4"/>
-    <w:lsdException w:uiPriority="99" w:name="List 5"/>
-    <w:lsdException w:uiPriority="99" w:name="List Bullet 2"/>
-    <w:lsdException w:uiPriority="99" w:name="List Bullet 3"/>
-    <w:lsdException w:uiPriority="99" w:name="List Bullet 4"/>
-    <w:lsdException w:uiPriority="99" w:name="List Bullet 5"/>
-    <w:lsdException w:uiPriority="99" w:name="List Number 2"/>
-    <w:lsdException w:uiPriority="99" w:name="List Number 3"/>
-    <w:lsdException w:uiPriority="99" w:name="List Number 4"/>
-    <w:lsdException w:uiPriority="99" w:name="List Number 5"/>
-    <w:lsdException w:qFormat="1" w:unhideWhenUsed="0" w:uiPriority="10" w:semiHidden="0" w:name="Title"/>
-    <w:lsdException w:uiPriority="99" w:name="Closing"/>
-    <w:lsdException w:uiPriority="99" w:name="Signature"/>
-    <w:lsdException w:qFormat="1" w:uiPriority="1" w:name="Default Paragraph Font"/>
-    <w:lsdException w:uiPriority="99" w:name="Body Text"/>
-    <w:lsdException w:uiPriority="99" w:name="Body Text Indent"/>
-    <w:lsdException w:uiPriority="99" w:name="List Continue"/>
-    <w:lsdException w:uiPriority="99" w:name="List Continue 2"/>
-    <w:lsdException w:uiPriority="99" w:name="List Continue 3"/>
-    <w:lsdException w:uiPriority="99" w:name="List Continue 4"/>
-    <w:lsdException w:uiPriority="99" w:name="List Continue 5"/>
-    <w:lsdException w:uiPriority="99" w:name="Message Header"/>
-    <w:lsdException w:qFormat="1" w:unhideWhenUsed="0" w:uiPriority="11" w:semiHidden="0" w:name="Subtitle"/>
-    <w:lsdException w:uiPriority="99" w:name="Salutation"/>
-    <w:lsdException w:uiPriority="99" w:name="Date"/>
-    <w:lsdException w:uiPriority="99" w:name="Body Text First Indent"/>
-    <w:lsdException w:uiPriority="99" w:name="Body Text First Indent 2"/>
-    <w:lsdException w:uiPriority="99" w:name="Note Heading"/>
-    <w:lsdException w:uiPriority="99" w:name="Body Text 2"/>
-    <w:lsdException w:uiPriority="99" w:name="Body Text 3"/>
-    <w:lsdException w:uiPriority="99" w:name="Body Text Indent 2"/>
-    <w:lsdException w:uiPriority="99" w:name="Body Text Indent 3"/>
-    <w:lsdException w:uiPriority="99" w:name="Block Text"/>
-    <w:lsdException w:uiPriority="99" w:name="Hyperlink"/>
-    <w:lsdException w:uiPriority="99" w:name="FollowedHyperlink"/>
-    <w:lsdException w:qFormat="1" w:unhideWhenUsed="0" w:uiPriority="22" w:semiHidden="0" w:name="Strong"/>
-    <w:lsdException w:qFormat="1" w:unhideWhenUsed="0" w:uiPriority="20" w:semiHidden="0" w:name="Emphasis"/>
-    <w:lsdException w:uiPriority="99" w:name="Document Map"/>
-    <w:lsdException w:uiPriority="99" w:name="Plain Text"/>
-    <w:lsdException w:uiPriority="99" w:name="E-mail Signature"/>
-    <w:lsdException w:uiPriority="99" w:name="Normal (Web)"/>
-    <w:lsdException w:uiPriority="99" w:name="HTML Acronym"/>
-    <w:lsdException w:uiPriority="99" w:name="HTML Address"/>
-    <w:lsdException w:uiPriority="99" w:name="HTML Cite"/>
-    <w:lsdException w:uiPriority="99" w:name="HTML Code"/>
-    <w:lsdException w:uiPriority="99" w:name="HTML Definition"/>
-    <w:lsdException w:uiPriority="99" w:name="HTML Keyboard"/>
-    <w:lsdException w:uiPriority="99" w:name="HTML Preformatted"/>
-    <w:lsdException w:uiPriority="99" w:name="HTML Sample"/>
-    <w:lsdException w:uiPriority="99" w:name="HTML Typewriter"/>
-    <w:lsdException w:uiPriority="99" w:name="HTML Variable"/>
-    <w:lsdException w:qFormat="1" w:uiPriority="99" w:name="Normal Table"/>
-    <w:lsdException w:uiPriority="99" w:name="annotation subject"/>
-    <w:lsdException w:uiPriority="99" w:name="Table Simple 1"/>
-    <w:lsdException w:uiPriority="99" w:name="Table Simple 2"/>
-    <w:lsdException w:uiPriority="99" w:name="Table Simple 3"/>
-    <w:lsdException w:uiPriority="99" w:name="Table Classic 1"/>
-    <w:lsdException w:uiPriority="99" w:name="Table Classic 2"/>
-    <w:lsdException w:uiPriority="99" w:name="Table Classic 3"/>
-    <w:lsdException w:uiPriority="99" w:name="Table Classic 4"/>
-    <w:lsdException w:uiPriority="99" w:name="Table Colorful 1"/>
-    <w:lsdException w:uiPriority="99" w:name="Table Colorful 2"/>
-    <w:lsdException w:uiPriority="99" w:name="Table Colorful 3"/>
-    <w:lsdException w:uiPriority="99" w:name="Table Columns 1"/>
-    <w:lsdException w:uiPriority="99" w:name="Table Columns 2"/>
-    <w:lsdException w:uiPriority="99" w:name="Table Columns 3"/>
-    <w:lsdException w:uiPriority="99" w:name="Table Columns 4"/>
-    <w:lsdException w:uiPriority="99" w:name="Table Columns 5"/>
-    <w:lsdException w:uiPriority="99" w:name="Table Grid 1"/>
-    <w:lsdException w:uiPriority="99" w:name="Table Grid 2"/>
-    <w:lsdException w:uiPriority="99" w:name="Table Grid 3"/>
-    <w:lsdException w:uiPriority="99" w:name="Table Grid 4"/>
-    <w:lsdException w:uiPriority="99" w:name="Table Grid 5"/>
-    <w:lsdException w:uiPriority="99" w:name="Table Grid 6"/>
-    <w:lsdException w:uiPriority="99" w:name="Table Grid 7"/>
-    <w:lsdException w:uiPriority="99" w:name="Table Grid 8"/>
-    <w:lsdException w:uiPriority="99" w:name="Table List 1"/>
-    <w:lsdException w:uiPriority="99" w:name="Table List 2"/>
-    <w:lsdException w:uiPriority="99" w:name="Table List 3"/>
-    <w:lsdException w:uiPriority="99" w:name="Table List 4"/>
-    <w:lsdException w:uiPriority="99" w:name="Table List 5"/>
-    <w:lsdException w:uiPriority="99" w:name="Table List 6"/>
-    <w:lsdException w:uiPriority="99" w:name="Table List 7"/>
-    <w:lsdException w:uiPriority="99" w:name="Table List 8"/>
-    <w:lsdException w:uiPriority="99" w:name="Table 3D effects 1"/>
-    <w:lsdException w:uiPriority="99" w:name="Table 3D effects 2"/>
-    <w:lsdException w:uiPriority="99" w:name="Table 3D effects 3"/>
-    <w:lsdException w:uiPriority="99" w:name="Table Contemporary"/>
-    <w:lsdException w:uiPriority="99" w:name="Table Elegant"/>
-    <w:lsdException w:uiPriority="99" w:name="Table Professional"/>
-    <w:lsdException w:uiPriority="99" w:name="Table Subtle 1"/>
-    <w:lsdException w:uiPriority="99" w:name="Table Subtle 2"/>
-    <w:lsdException w:uiPriority="99" w:name="Table Web 1"/>
-    <w:lsdException w:uiPriority="99" w:name="Table Web 2"/>
-    <w:lsdException w:uiPriority="99" w:name="Table Web 3"/>
-    <w:lsdException w:uiPriority="99" w:name="Balloon Text"/>
-    <w:lsdException w:qFormat="1" w:unhideWhenUsed="0" w:uiPriority="59" w:semiHidden="0" w:name="Table Grid"/>
-    <w:lsdException w:uiPriority="99" w:name="Table Theme"/>
-    <w:lsdException w:unhideWhenUsed="0" w:uiPriority="60" w:semiHidden="0" w:name="Light Shading"/>
-    <w:lsdException w:unhideWhenUsed="0" w:uiPriority="61" w:semiHidden="0" w:name="Light List"/>
-    <w:lsdException w:unhideWhenUsed="0" w:uiPriority="62" w:semiHidden="0" w:name="Light Grid"/>
-    <w:lsdException w:unhideWhenUsed="0" w:uiPriority="63" w:semiHidden="0" w:name="Medium Shading 1"/>
-    <w:lsdException w:unhideWhenUsed="0" w:uiPriority="64" w:semiHidden="0" w:name="Medium Shading 2"/>
-    <w:lsdException w:unhideWhenUsed="0" w:uiPriority="65" w:semiHidden="0" w:name="Medium List 1"/>
-    <w:lsdException w:unhideWhenUsed="0" w:uiPriority="66" w:semiHidden="0" w:name="Medium List 2"/>
-    <w:lsdException w:unhideWhenUsed="0" w:uiPriority="67" w:semiHidden="0" w:name="Medium Grid 1"/>
-    <w:lsdException w:unhideWhenUsed="0" w:uiPriority="68" w:semiHidden="0" w:name="Medium Grid 2"/>
-    <w:lsdException w:unhideWhenUsed="0" w:uiPriority="69" w:semiHidden="0" w:name="Medium Grid 3"/>
-    <w:lsdException w:unhideWhenUsed="0" w:uiPriority="70" w:semiHidden="0" w:name="Dark List"/>
-    <w:lsdException w:unhideWhenUsed="0" w:uiPriority="71" w:semiHidden="0" w:name="Colorful Shading"/>
-    <w:lsdException w:unhideWhenUsed="0" w:uiPriority="72" w:semiHidden="0" w:name="Colorful List"/>
-    <w:lsdException w:unhideWhenUsed="0" w:uiPriority="73" w:semiHidden="0" w:name="Colorful Grid"/>
-    <w:lsdException w:unhideWhenUsed="0" w:uiPriority="60" w:semiHidden="0" w:name="Light Shading Accent 1"/>
-    <w:lsdException w:unhideWhenUsed="0" w:uiPriority="61" w:semiHidden="0" w:name="Light List Accent 1"/>
-    <w:lsdException w:unhideWhenUsed="0" w:uiPriority="62" w:semiHidden="0" w:name="Light Grid Accent 1"/>
-    <w:lsdException w:unhideWhenUsed="0" w:uiPriority="63" w:semiHidden="0" w:name="Medium Shading 1 Accent 1"/>
-    <w:lsdException w:unhideWhenUsed="0" w:uiPriority="64" w:semiHidden="0" w:name="Medium Shading 2 Accent 1"/>
-    <w:lsdException w:unhideWhenUsed="0" w:uiPriority="65" w:semiHidden="0" w:name="Medium List 1 Accent 1"/>
-    <w:lsdException w:qFormat="1" w:unhideWhenUsed="0" w:uiPriority="34" w:semiHidden="0" w:name="List Paragraph"/>
-    <w:lsdException w:unhideWhenUsed="0" w:uiPriority="66" w:semiHidden="0" w:name="Medium List 2 Accent 1"/>
-    <w:lsdException w:unhideWhenUsed="0" w:uiPriority="67" w:semiHidden="0" w:name="Medium Grid 1 Accent 1"/>
-    <w:lsdException w:unhideWhenUsed="0" w:uiPriority="68" w:semiHidden="0" w:name="Medium Grid 2 Accent 1"/>
-    <w:lsdException w:unhideWhenUsed="0" w:uiPriority="69" w:semiHidden="0" w:name="Medium Grid 3 Accent 1"/>
-    <w:lsdException w:unhideWhenUsed="0" w:uiPriority="70" w:semiHidden="0" w:name="Dark List Accent 1"/>
-    <w:lsdException w:unhideWhenUsed="0" w:uiPriority="71" w:semiHidden="0" w:name="Colorful Shading Accent 1"/>
-    <w:lsdException w:unhideWhenUsed="0" w:uiPriority="72" w:semiHidden="0" w:name="Colorful List Accent 1"/>
-    <w:lsdException w:unhideWhenUsed="0" w:uiPriority="73" w:semiHidden="0" w:name="Colorful Grid Accent 1"/>
-    <w:lsdException w:unhideWhenUsed="0" w:uiPriority="60" w:semiHidden="0" w:name="Light Shading Accent 2"/>
-    <w:lsdException w:unhideWhenUsed="0" w:uiPriority="61" w:semiHidden="0" w:name="Light List Accent 2"/>
-    <w:lsdException w:unhideWhenUsed="0" w:uiPriority="62" w:semiHidden="0" w:name="Light Grid Accent 2"/>
-    <w:lsdException w:unhideWhenUsed="0" w:uiPriority="63" w:semiHidden="0" w:name="Medium Shading 1 Accent 2"/>
-    <w:lsdException w:unhideWhenUsed="0" w:uiPriority="64" w:semiHidden="0" w:name="Medium Shading 2 Accent 2"/>
-    <w:lsdException w:unhideWhenUsed="0" w:uiPriority="65" w:semiHidden="0" w:name="Medium List 1 Accent 2"/>
-    <w:lsdException w:unhideWhenUsed="0" w:uiPriority="66" w:semiHidden="0" w:name="Medium List 2 Accent 2"/>
-    <w:lsdException w:unhideWhenUsed="0" w:uiPriority="67" w:semiHidden="0" w:name="Medium Grid 1 Accent 2"/>
-    <w:lsdException w:unhideWhenUsed="0" w:uiPriority="68" w:semiHidden="0" w:name="Medium Grid 2 Accent 2"/>
-    <w:lsdException w:unhideWhenUsed="0" w:uiPriority="69" w:semiHidden="0" w:name="Medium Grid 3 Accent 2"/>
-    <w:lsdException w:unhideWhenUsed="0" w:uiPriority="70" w:semiHidden="0" w:name="Dark List Accent 2"/>
-    <w:lsdException w:unhideWhenUsed="0" w:uiPriority="71" w:semiHidden="0" w:name="Colorful Shading Accent 2"/>
-    <w:lsdException w:unhideWhenUsed="0" w:uiPriority="72" w:semiHidden="0" w:name="Colorful List Accent 2"/>
-    <w:lsdException w:unhideWhenUsed="0" w:uiPriority="73" w:semiHidden="0" w:name="Colorful Grid Accent 2"/>
-    <w:lsdException w:unhideWhenUsed="0" w:uiPriority="60" w:semiHidden="0" w:name="Light Shading Accent 3"/>
-    <w:lsdException w:unhideWhenUsed="0" w:uiPriority="61" w:semiHidden="0" w:name="Light List Accent 3"/>
-    <w:lsdException w:unhideWhenUsed="0" w:uiPriority="62" w:semiHidden="0" w:name="Light Grid Accent 3"/>
-    <w:lsdException w:unhideWhenUsed="0" w:uiPriority="63" w:semiHidden="0" w:name="Medium Shading 1 Accent 3"/>
-    <w:lsdException w:unhideWhenUsed="0" w:uiPriority="64" w:semiHidden="0" w:name="Medium Shading 2 Accent 3"/>
-    <w:lsdException w:unhideWhenUsed="0" w:uiPriority="65" w:semiHidden="0" w:name="Medium List 1 Accent 3"/>
-    <w:lsdException w:unhideWhenUsed="0" w:uiPriority="66" w:semiHidden="0" w:name="Medium List 2 Accent 3"/>
-    <w:lsdException w:unhideWhenUsed="0" w:uiPriority="67" w:semiHidden="0" w:name="Medium Grid 1 Accent 3"/>
-    <w:lsdException w:unhideWhenUsed="0" w:uiPriority="68" w:semiHidden="0" w:name="Medium Grid 2 Accent 3"/>
-    <w:lsdException w:unhideWhenUsed="0" w:uiPriority="69" w:semiHidden="0" w:name="Medium Grid 3 Accent 3"/>
-    <w:lsdException w:unhideWhenUsed="0" w:uiPriority="70" w:semiHidden="0" w:name="Dark List Accent 3"/>
-    <w:lsdException w:unhideWhenUsed="0" w:uiPriority="71" w:semiHidden="0" w:name="Colorful Shading Accent 3"/>
-    <w:lsdException w:unhideWhenUsed="0" w:uiPriority="72" w:semiHidden="0" w:name="Colorful List Accent 3"/>
-    <w:lsdException w:unhideWhenUsed="0" w:uiPriority="73" w:semiHidden="0" w:name="Colorful Grid Accent 3"/>
-    <w:lsdException w:unhideWhenUsed="0" w:uiPriority="60" w:semiHidden="0" w:name="Light Shading Accent 4"/>
-    <w:lsdException w:unhideWhenUsed="0" w:uiPriority="61" w:semiHidden="0" w:name="Light List Accent 4"/>
-    <w:lsdException w:unhideWhenUsed="0" w:uiPriority="62" w:semiHidden="0" w:name="Light Grid Accent 4"/>
-    <w:lsdException w:unhideWhenUsed="0" w:uiPriority="63" w:semiHidden="0" w:name="Medium Shading 1 Accent 4"/>
-    <w:lsdException w:unhideWhenUsed="0" w:uiPriority="64" w:semiHidden="0" w:name="Medium Shading 2 Accent 4"/>
-    <w:lsdException w:unhideWhenUsed="0" w:uiPriority="65" w:semiHidden="0" w:name="Medium List 1 Accent 4"/>
-    <w:lsdException w:unhideWhenUsed="0" w:uiPriority="66" w:semiHidden="0" w:name="Medium List 2 Accent 4"/>
-    <w:lsdException w:unhideWhenUsed="0" w:uiPriority="67" w:semiHidden="0" w:name="Medium Grid 1 Accent 4"/>
-    <w:lsdException w:unhideWhenUsed="0" w:uiPriority="68" w:semiHidden="0" w:name="Medium Grid 2 Accent 4"/>
-    <w:lsdException w:unhideWhenUsed="0" w:uiPriority="69" w:semiHidden="0" w:name="Medium Grid 3 Accent 4"/>
-    <w:lsdException w:unhideWhenUsed="0" w:uiPriority="70" w:semiHidden="0" w:name="Dark List Accent 4"/>
-    <w:lsdException w:unhideWhenUsed="0" w:uiPriority="71" w:semiHidden="0" w:name="Colorful Shading Accent 4"/>
-    <w:lsdException w:unhideWhenUsed="0" w:uiPriority="72" w:semiHidden="0" w:name="Colorful List Accent 4"/>
-    <w:lsdException w:unhideWhenUsed="0" w:uiPriority="73" w:semiHidden="0" w:name="Colorful Grid Accent 4"/>
-    <w:lsdException w:unhideWhenUsed="0" w:uiPriority="60" w:semiHidden="0" w:name="Light Shading Accent 5"/>
-    <w:lsdException w:unhideWhenUsed="0" w:uiPriority="61" w:semiHidden="0" w:name="Light List Accent 5"/>
-    <w:lsdException w:unhideWhenUsed="0" w:uiPriority="62" w:semiHidden="0" w:name="Light Grid Accent 5"/>
-    <w:lsdException w:unhideWhenUsed="0" w:uiPriority="63" w:semiHidden="0" w:name="Medium Shading 1 Accent 5"/>
-    <w:lsdException w:unhideWhenUsed="0" w:uiPriority="64" w:semiHidden="0" w:name="Medium Shading 2 Accent 5"/>
-    <w:lsdException w:unhideWhenUsed="0" w:uiPriority="65" w:semiHidden="0" w:name="Medium List 1 Accent 5"/>
-    <w:lsdException w:unhideWhenUsed="0" w:uiPriority="66" w:semiHidden="0" w:name="Medium List 2 Accent 5"/>
-    <w:lsdException w:unhideWhenUsed="0" w:uiPriority="67" w:semiHidden="0" w:name="Medium Grid 1 Accent 5"/>
-    <w:lsdException w:unhideWhenUsed="0" w:uiPriority="68" w:semiHidden="0" w:name="Medium Grid 2 Accent 5"/>
-    <w:lsdException w:unhideWhenUsed="0" w:uiPriority="69" w:semiHidden="0" w:name="Medium Grid 3 Accent 5"/>
-    <w:lsdException w:unhideWhenUsed="0" w:uiPriority="70" w:semiHidden="0" w:name="Dark List Accent 5"/>
-    <w:lsdException w:unhideWhenUsed="0" w:uiPriority="71" w:semiHidden="0" w:name="Colorful Shading Accent 5"/>
-    <w:lsdException w:unhideWhenUsed="0" w:uiPriority="72" w:semiHidden="0" w:name="Colorful List Accent 5"/>
-    <w:lsdException w:unhideWhenUsed="0" w:uiPriority="73" w:semiHidden="0" w:name="Colorful Grid Accent 5"/>
-    <w:lsdException w:unhideWhenUsed="0" w:uiPriority="60" w:semiHidden="0" w:name="Light Shading Accent 6"/>
-    <w:lsdException w:unhideWhenUsed="0" w:uiPriority="61" w:semiHidden="0" w:name="Light List Accent 6"/>
-    <w:lsdException w:unhideWhenUsed="0" w:uiPriority="62" w:semiHidden="0" w:name="Light Grid Accent 6"/>
-    <w:lsdException w:unhideWhenUsed="0" w:uiPriority="63" w:semiHidden="0" w:name="Medium Shading 1 Accent 6"/>
-    <w:lsdException w:unhideWhenUsed="0" w:uiPriority="64" w:semiHidden="0" w:name="Medium Shading 2 Accent 6"/>
-    <w:lsdException w:unhideWhenUsed="0" w:uiPriority="65" w:semiHidden="0" w:name="Medium List 1 Accent 6"/>
-    <w:lsdException w:unhideWhenUsed="0" w:uiPriority="66" w:semiHidden="0" w:name="Medium List 2 Accent 6"/>
-    <w:lsdException w:unhideWhenUsed="0" w:uiPriority="67" w:semiHidden="0" w:name="Medium Grid 1 Accent 6"/>
-    <w:lsdException w:unhideWhenUsed="0" w:uiPriority="68" w:semiHidden="0" w:name="Medium Grid 2 Accent 6"/>
-    <w:lsdException w:unhideWhenUsed="0" w:uiPriority="69" w:semiHidden="0" w:name="Medium Grid 3 Accent 6"/>
-    <w:lsdException w:unhideWhenUsed="0" w:uiPriority="70" w:semiHidden="0" w:name="Dark List Accent 6"/>
-    <w:lsdException w:unhideWhenUsed="0" w:uiPriority="71" w:semiHidden="0" w:name="Colorful Shading Accent 6"/>
-    <w:lsdException w:unhideWhenUsed="0" w:uiPriority="72" w:semiHidden="0" w:name="Colorful List Accent 6"/>
-    <w:lsdException w:unhideWhenUsed="0" w:uiPriority="73" w:semiHidden="0" w:name="Colorful Grid Accent 6"/>
+  <w:latentStyles w:defLockedState="0" w:defUIPriority="99" w:defSemiHidden="1" w:defUnhideWhenUsed="1" w:defQFormat="0" w:count="260">
+    <w:lsdException w:name="Salutation" w:uiPriority="99"/>
+    <w:lsdException w:name="Closing" w:uiPriority="99"/>
+    <w:lsdException w:name="Medium Grid 3 Accent 2" w:uiPriority="69" w:semiHidden="0" w:unhideWhenUsed="0"/>
+    <w:lsdException w:name="Light Grid Accent 2" w:uiPriority="62" w:semiHidden="0" w:unhideWhenUsed="0"/>
+    <w:lsdException w:name="List Bullet 5" w:uiPriority="99"/>
+    <w:lsdException w:name="Medium List 2 Accent 5" w:uiPriority="66" w:semiHidden="0" w:unhideWhenUsed="0"/>
+    <w:lsdException w:name="Table Simple 2" w:uiPriority="99"/>
+    <w:lsdException w:name="HTML Variable" w:uiPriority="99"/>
+    <w:lsdException w:name="Table List 8" w:uiPriority="99"/>
+    <w:lsdException w:name="header" w:uiPriority="99" w:semiHidden="0"/>
+    <w:lsdException w:name="toc 4" w:uiPriority="39"/>
+    <w:lsdException w:name="Colorful List Accent 6" w:uiPriority="72" w:semiHidden="0" w:unhideWhenUsed="0"/>
+    <w:lsdException w:name="Balloon Text" w:uiPriority="99"/>
+    <w:lsdException w:name="Table Columns 4" w:uiPriority="99"/>
+    <w:lsdException w:name="Colorful Shading" w:uiPriority="71" w:semiHidden="0" w:unhideWhenUsed="0"/>
+    <w:lsdException w:name="Subtitle" w:uiPriority="11" w:semiHidden="0" w:unhideWhenUsed="0" w:qFormat="1"/>
+    <w:lsdException w:name="table of authorities" w:uiPriority="99"/>
+    <w:lsdException w:name="Light List Accent 2" w:uiPriority="61" w:semiHidden="0" w:unhideWhenUsed="0"/>
+    <w:lsdException w:name="Colorful Shading Accent 3" w:uiPriority="71" w:semiHidden="0" w:unhideWhenUsed="0"/>
+    <w:lsdException w:name="Table Grid 2" w:uiPriority="99"/>
+    <w:lsdException w:name="heading 4" w:uiPriority="9" w:qFormat="1"/>
+    <w:lsdException w:name="Light Grid Accent 3" w:uiPriority="62" w:semiHidden="0" w:unhideWhenUsed="0"/>
+    <w:lsdException w:name="Dark List Accent 3" w:uiPriority="70" w:semiHidden="0" w:unhideWhenUsed="0"/>
+    <w:lsdException w:name="annotation subject" w:uiPriority="99"/>
+    <w:lsdException w:name="Signature" w:uiPriority="99"/>
+    <w:lsdException w:name="Hyperlink" w:uiPriority="99"/>
+    <w:lsdException w:name="caption" w:uiPriority="35" w:qFormat="1"/>
+    <w:lsdException w:name="Table Columns 3" w:uiPriority="99"/>
+    <w:lsdException w:name="Medium List 1 Accent 6" w:uiPriority="65" w:semiHidden="0" w:unhideWhenUsed="0"/>
+    <w:lsdException w:name="Medium Grid 3 Accent 3" w:uiPriority="69" w:semiHidden="0" w:unhideWhenUsed="0"/>
+    <w:lsdException w:name="HTML Cite" w:uiPriority="99"/>
+    <w:lsdException w:name="Medium Grid 1 Accent 2" w:uiPriority="67" w:semiHidden="0" w:unhideWhenUsed="0"/>
+    <w:lsdException w:name="footer" w:uiPriority="99" w:semiHidden="0" w:qFormat="1"/>
+    <w:lsdException w:name="Medium List 2" w:uiPriority="66" w:semiHidden="0" w:unhideWhenUsed="0"/>
+    <w:lsdException w:name="heading 5" w:uiPriority="9" w:qFormat="1"/>
+    <w:lsdException w:name="toc 2" w:uiPriority="39"/>
+    <w:lsdException w:name="Light Shading Accent 6" w:uiPriority="60" w:semiHidden="0" w:unhideWhenUsed="0"/>
+    <w:lsdException w:name="Default Paragraph Font" w:uiPriority="1" w:qFormat="1"/>
+    <w:lsdException w:name="List 2" w:uiPriority="99"/>
+    <w:lsdException w:name="Light Grid Accent 4" w:uiPriority="62" w:semiHidden="0" w:unhideWhenUsed="0"/>
+    <w:lsdException w:name="annotation reference" w:uiPriority="99"/>
+    <w:lsdException w:name="Colorful Grid Accent 5" w:uiPriority="73" w:semiHidden="0" w:unhideWhenUsed="0"/>
+    <w:lsdException w:name="HTML Address" w:uiPriority="99"/>
+    <w:lsdException w:name="HTML Typewriter" w:uiPriority="99"/>
+    <w:lsdException w:name="Medium Shading 1" w:uiPriority="63" w:semiHidden="0" w:unhideWhenUsed="0"/>
+    <w:lsdException w:name="Strong" w:uiPriority="22" w:semiHidden="0" w:unhideWhenUsed="0" w:qFormat="1"/>
+    <w:lsdException w:name="heading 6" w:uiPriority="9" w:qFormat="1"/>
+    <w:lsdException w:name="Table List 2" w:uiPriority="99"/>
+    <w:lsdException w:name="List Bullet" w:uiPriority="99"/>
+    <w:lsdException w:name="List Continue 5" w:uiPriority="99"/>
+    <w:lsdException w:name="Table Simple 1" w:uiPriority="99"/>
+    <w:lsdException w:name="Medium Grid 3 Accent 1" w:uiPriority="69" w:semiHidden="0" w:unhideWhenUsed="0"/>
+    <w:lsdException w:name="Medium List 1 Accent 3" w:uiPriority="65" w:semiHidden="0" w:unhideWhenUsed="0"/>
+    <w:lsdException w:name="Table Columns 2" w:uiPriority="99"/>
+    <w:lsdException w:name="Medium List 2 Accent 6" w:uiPriority="66" w:semiHidden="0" w:unhideWhenUsed="0"/>
+    <w:lsdException w:name="Medium Shading 2 Accent 5" w:uiPriority="64" w:semiHidden="0" w:unhideWhenUsed="0"/>
+    <w:lsdException w:name="Colorful Grid Accent 1" w:uiPriority="73" w:semiHidden="0" w:unhideWhenUsed="0"/>
+    <w:lsdException w:name="FollowedHyperlink" w:uiPriority="99"/>
+    <w:lsdException w:name="Colorful Shading Accent 5" w:uiPriority="71" w:semiHidden="0" w:unhideWhenUsed="0"/>
+    <w:lsdException w:name="Table Grid 4" w:uiPriority="99"/>
+    <w:lsdException w:name="Medium Grid 1 Accent 3" w:uiPriority="67" w:semiHidden="0" w:unhideWhenUsed="0"/>
+    <w:lsdException w:name="toc 7" w:uiPriority="39"/>
+    <w:lsdException w:name="index 6" w:uiPriority="99"/>
+    <w:lsdException w:name="Light Grid Accent 5" w:uiPriority="62" w:semiHidden="0" w:unhideWhenUsed="0"/>
+    <w:lsdException w:name="List 3" w:uiPriority="99"/>
+    <w:lsdException w:name="Light Grid" w:uiPriority="62" w:semiHidden="0" w:unhideWhenUsed="0"/>
+    <w:lsdException w:name="Dark List Accent 2" w:uiPriority="70" w:semiHidden="0" w:unhideWhenUsed="0"/>
+    <w:lsdException w:name="Body Text Indent 3" w:uiPriority="99"/>
+    <w:lsdException w:name="Medium Grid 1 Accent 4" w:uiPriority="67" w:semiHidden="0" w:unhideWhenUsed="0"/>
+    <w:lsdException w:name="E-mail Signature" w:uiPriority="99"/>
+    <w:lsdException w:name="Table List 3" w:uiPriority="99"/>
+    <w:lsdException w:name="heading 7" w:uiPriority="9" w:qFormat="1"/>
+    <w:lsdException w:name="endnote reference" w:uiPriority="99"/>
+    <w:lsdException w:name="Table Colorful 2" w:uiPriority="99"/>
+    <w:lsdException w:name="List 4" w:uiPriority="99"/>
+    <w:lsdException w:name="Medium Grid 1" w:uiPriority="67" w:semiHidden="0" w:unhideWhenUsed="0"/>
+    <w:lsdException w:name="List Bullet 2" w:uiPriority="99"/>
+    <w:lsdException w:name="Medium List 1 Accent 1" w:uiPriority="65" w:semiHidden="0" w:unhideWhenUsed="0"/>
+    <w:lsdException w:name="index heading" w:uiPriority="99"/>
+    <w:lsdException w:name="Table Web 1" w:uiPriority="99"/>
+    <w:lsdException w:name="Body Text First Indent 2" w:uiPriority="99"/>
+    <w:lsdException w:name="Table Grid 6" w:uiPriority="99"/>
+    <w:lsdException w:name="List Paragraph" w:uiPriority="34" w:semiHidden="0" w:unhideWhenUsed="0" w:qFormat="1"/>
+    <w:lsdException w:name="Medium Grid 1 Accent 5" w:uiPriority="67" w:semiHidden="0" w:unhideWhenUsed="0"/>
+    <w:lsdException w:name="Light List Accent 5" w:uiPriority="61" w:semiHidden="0" w:unhideWhenUsed="0"/>
+    <w:lsdException w:name="List Continue" w:uiPriority="99"/>
+    <w:lsdException w:name="List Number 3" w:uiPriority="99"/>
+    <w:lsdException w:name="Medium List 1 Accent 2" w:uiPriority="65" w:semiHidden="0" w:unhideWhenUsed="0"/>
+    <w:lsdException w:name="index 4" w:uiPriority="99"/>
+    <w:lsdException w:name="toc 5" w:uiPriority="39"/>
+    <w:lsdException w:name="Dark List Accent 4" w:uiPriority="70" w:semiHidden="0" w:unhideWhenUsed="0"/>
+    <w:lsdException w:name="Medium Shading 2 Accent 3" w:uiPriority="64" w:semiHidden="0" w:unhideWhenUsed="0"/>
+    <w:lsdException w:name="Normal" w:uiPriority="0" w:semiHidden="0" w:unhideWhenUsed="0" w:qFormat="1"/>
+    <w:lsdException w:name="toa heading" w:uiPriority="99"/>
+    <w:lsdException w:name="heading 9" w:uiPriority="9" w:qFormat="1"/>
+    <w:lsdException w:name="Body Text 3" w:uiPriority="99"/>
+    <w:lsdException w:name="Medium Grid 2 Accent 1" w:uiPriority="68" w:semiHidden="0" w:unhideWhenUsed="0"/>
+    <w:lsdException w:name="Block Text" w:uiPriority="99"/>
+    <w:lsdException w:name="Colorful Shading Accent 4" w:uiPriority="71" w:semiHidden="0" w:unhideWhenUsed="0"/>
+    <w:lsdException w:name="HTML Definition" w:uiPriority="99"/>
+    <w:lsdException w:name="HTML Acronym" w:uiPriority="99"/>
+    <w:lsdException w:name="annotation text" w:uiPriority="99"/>
+    <w:lsdException w:name="toc 6" w:uiPriority="39"/>
+    <w:lsdException w:name="Medium Shading 2 Accent 2" w:uiPriority="64" w:semiHidden="0" w:unhideWhenUsed="0"/>
+    <w:lsdException w:name="Colorful List Accent 3" w:uiPriority="72" w:semiHidden="0" w:unhideWhenUsed="0"/>
+    <w:lsdException w:name="Table Contemporary" w:uiPriority="99"/>
+    <w:lsdException w:name="List Bullet 4" w:uiPriority="99"/>
+    <w:lsdException w:name="Table Grid 7" w:uiPriority="99"/>
+    <w:lsdException w:name="List 5" w:uiPriority="99"/>
+    <w:lsdException w:name="Date" w:uiPriority="99"/>
+    <w:lsdException w:name="Medium Shading 2" w:uiPriority="64" w:semiHidden="0" w:unhideWhenUsed="0"/>
+    <w:lsdException w:name="Medium Shading 1 Accent 5" w:uiPriority="63" w:semiHidden="0" w:unhideWhenUsed="0"/>
+    <w:lsdException w:name="Medium Grid 2" w:uiPriority="68" w:semiHidden="0" w:unhideWhenUsed="0"/>
+    <w:lsdException w:name="heading 1" w:uiPriority="9" w:semiHidden="0" w:unhideWhenUsed="0" w:qFormat="1"/>
+    <w:lsdException w:name="Table List 5" w:uiPriority="99"/>
+    <w:lsdException w:name="index 5" w:uiPriority="99"/>
+    <w:lsdException w:name="Body Text 2" w:uiPriority="99"/>
+    <w:lsdException w:name="Colorful List Accent 4" w:uiPriority="72" w:semiHidden="0" w:unhideWhenUsed="0"/>
+    <w:lsdException w:name="List Number 2" w:uiPriority="99"/>
+    <w:lsdException w:name="Table Columns 1" w:uiPriority="99"/>
+    <w:lsdException w:name="Normal Table" w:uiPriority="99" w:qFormat="1"/>
+    <w:lsdException w:name="Note Heading" w:uiPriority="99"/>
+    <w:lsdException w:name="Colorful Grid Accent 6" w:uiPriority="73" w:semiHidden="0" w:unhideWhenUsed="0"/>
+    <w:lsdException w:name="Medium Grid 2 Accent 3" w:uiPriority="68" w:semiHidden="0" w:unhideWhenUsed="0"/>
+    <w:lsdException w:name="Medium Shading 2 Accent 1" w:uiPriority="64" w:semiHidden="0" w:unhideWhenUsed="0"/>
+    <w:lsdException w:name="Medium Shading 1 Accent 6" w:uiPriority="63" w:semiHidden="0" w:unhideWhenUsed="0"/>
+    <w:lsdException w:name="Colorful Shading Accent 6" w:uiPriority="71" w:semiHidden="0" w:unhideWhenUsed="0"/>
+    <w:lsdException w:name="Light List Accent 4" w:uiPriority="61" w:semiHidden="0" w:unhideWhenUsed="0"/>
+    <w:lsdException w:name="index 9" w:uiPriority="99"/>
+    <w:lsdException w:name="Colorful List Accent 5" w:uiPriority="72" w:semiHidden="0" w:unhideWhenUsed="0"/>
+    <w:lsdException w:name="Medium Grid 2 Accent 4" w:uiPriority="68" w:semiHidden="0" w:unhideWhenUsed="0"/>
+    <w:lsdException w:name="Medium List 1 Accent 4" w:uiPriority="65" w:semiHidden="0" w:unhideWhenUsed="0"/>
+    <w:lsdException w:name="Table Colorful 1" w:uiPriority="99"/>
+    <w:lsdException w:name="Medium Grid 3 Accent 6" w:uiPriority="69" w:semiHidden="0" w:unhideWhenUsed="0"/>
+    <w:lsdException w:name="Light Shading Accent 3" w:uiPriority="60" w:semiHidden="0" w:unhideWhenUsed="0"/>
+    <w:lsdException w:name="Body Text" w:uiPriority="99"/>
+    <w:lsdException w:name="Medium List 2 Accent 1" w:uiPriority="66" w:semiHidden="0" w:unhideWhenUsed="0"/>
+    <w:lsdException w:name="Table Grid 1" w:uiPriority="99"/>
+    <w:lsdException w:name="HTML Keyboard" w:uiPriority="99"/>
+    <w:lsdException w:name="heading 3" w:uiPriority="9" w:qFormat="1"/>
+    <w:lsdException w:name="line number" w:uiPriority="99"/>
+    <w:lsdException w:name="Table List 7" w:uiPriority="99"/>
+    <w:lsdException w:name="footnote text" w:uiPriority="99"/>
+    <w:lsdException w:name="Colorful List Accent 2" w:uiPriority="72" w:semiHidden="0" w:unhideWhenUsed="0"/>
+    <w:lsdException w:name="Colorful Grid" w:uiPriority="73" w:semiHidden="0" w:unhideWhenUsed="0"/>
+    <w:lsdException w:name="List Number 4" w:uiPriority="99"/>
+    <w:lsdException w:name="Title" w:uiPriority="10" w:semiHidden="0" w:unhideWhenUsed="0" w:qFormat="1"/>
+    <w:lsdException w:name="HTML Code" w:uiPriority="99"/>
+    <w:lsdException w:name="index 3" w:uiPriority="99"/>
+    <w:lsdException w:name="Table 3D effects 2" w:uiPriority="99"/>
+    <w:lsdException w:name="Medium Grid 2 Accent 2" w:uiPriority="68" w:semiHidden="0" w:unhideWhenUsed="0"/>
+    <w:lsdException w:name="Light List Accent 6" w:uiPriority="61" w:semiHidden="0" w:unhideWhenUsed="0"/>
+    <w:lsdException w:name="Light Shading Accent 4" w:uiPriority="60" w:semiHidden="0" w:unhideWhenUsed="0"/>
+    <w:lsdException w:name="Medium Shading 1 Accent 4" w:uiPriority="63" w:semiHidden="0" w:unhideWhenUsed="0"/>
+    <w:lsdException w:name="Table Colorful 3" w:uiPriority="99"/>
+    <w:lsdException w:name="Medium Grid 3" w:uiPriority="69" w:semiHidden="0" w:unhideWhenUsed="0"/>
+    <w:lsdException w:name="Table Theme" w:uiPriority="99"/>
+    <w:lsdException w:name="Table List 4" w:uiPriority="99"/>
+    <w:lsdException w:name="Light Shading" w:uiPriority="60" w:semiHidden="0" w:unhideWhenUsed="0"/>
+    <w:lsdException w:name="Medium List 1 Accent 5" w:uiPriority="65" w:semiHidden="0" w:unhideWhenUsed="0"/>
+    <w:lsdException w:name="List Bullet 3" w:uiPriority="99"/>
+    <w:lsdException w:name="Medium List 2 Accent 4" w:uiPriority="66" w:semiHidden="0" w:unhideWhenUsed="0"/>
+    <w:lsdException w:name="Body Text Indent 2" w:uiPriority="99"/>
+    <w:lsdException w:name="Table Subtle 2" w:uiPriority="99"/>
+    <w:lsdException w:name="Table Web 2" w:uiPriority="99"/>
+    <w:lsdException w:name="Light Shading Accent 5" w:uiPriority="60" w:semiHidden="0" w:unhideWhenUsed="0"/>
+    <w:lsdException w:name="endnote text" w:uiPriority="99"/>
+    <w:lsdException w:name="index 8" w:uiPriority="99"/>
+    <w:lsdException w:name="Medium Grid 1 Accent 1" w:uiPriority="67" w:semiHidden="0" w:unhideWhenUsed="0"/>
+    <w:lsdException w:name="Dark List" w:uiPriority="70" w:semiHidden="0" w:unhideWhenUsed="0"/>
+    <w:lsdException w:name="toc 1" w:uiPriority="39"/>
+    <w:lsdException w:name="Table Classic 2" w:uiPriority="99"/>
+    <w:lsdException w:name="Table Grid 8" w:uiPriority="99"/>
+    <w:lsdException w:name="Light Shading Accent 2" w:uiPriority="60" w:semiHidden="0" w:unhideWhenUsed="0"/>
+    <w:lsdException w:name="Light List Accent 3" w:uiPriority="61" w:semiHidden="0" w:unhideWhenUsed="0"/>
+    <w:lsdException w:name="Colorful Shading Accent 1" w:uiPriority="71" w:semiHidden="0" w:unhideWhenUsed="0"/>
+    <w:lsdException w:name="heading 2" w:uiPriority="9" w:qFormat="1"/>
+    <w:lsdException w:name="Table List 6" w:uiPriority="99"/>
+    <w:lsdException w:name="Medium List 2 Accent 2" w:uiPriority="66" w:semiHidden="0" w:unhideWhenUsed="0"/>
+    <w:lsdException w:name="Medium Grid 2 Accent 5" w:uiPriority="68" w:semiHidden="0" w:unhideWhenUsed="0"/>
+    <w:lsdException w:name="Normal Indent" w:uiPriority="99"/>
+    <w:lsdException w:name="Table Web 3" w:uiPriority="99"/>
+    <w:lsdException w:name="Medium Grid 3 Accent 5" w:uiPriority="69" w:semiHidden="0" w:unhideWhenUsed="0"/>
+    <w:lsdException w:name="Medium Grid 1 Accent 6" w:uiPriority="67" w:semiHidden="0" w:unhideWhenUsed="0"/>
+    <w:lsdException w:name="Medium Shading 2 Accent 6" w:uiPriority="64" w:semiHidden="0" w:unhideWhenUsed="0"/>
+    <w:lsdException w:name="Dark List Accent 1" w:uiPriority="70" w:semiHidden="0" w:unhideWhenUsed="0"/>
+    <w:lsdException w:name="Medium Shading 1 Accent 2" w:uiPriority="63" w:semiHidden="0" w:unhideWhenUsed="0"/>
+    <w:lsdException w:name="List Number" w:uiPriority="99"/>
+    <w:lsdException w:name="Normal (Web)" w:uiPriority="99"/>
+    <w:lsdException w:name="index 2" w:uiPriority="99"/>
+    <w:lsdException w:name="toc 3" w:uiPriority="39"/>
+    <w:lsdException w:name="Table Professional" w:uiPriority="99"/>
+    <w:lsdException w:name="List Number 5" w:uiPriority="99"/>
+    <w:lsdException w:name="Light List Accent 1" w:uiPriority="61" w:semiHidden="0" w:unhideWhenUsed="0"/>
+    <w:lsdException w:name="Table 3D effects 3" w:uiPriority="99"/>
+    <w:lsdException w:name="Light Grid Accent 6" w:uiPriority="62" w:semiHidden="0" w:unhideWhenUsed="0"/>
+    <w:lsdException w:name="page number" w:uiPriority="99"/>
+    <w:lsdException w:name="Dark List Accent 6" w:uiPriority="70" w:semiHidden="0" w:unhideWhenUsed="0"/>
+    <w:lsdException w:name="Table Classic 4" w:uiPriority="99"/>
+    <w:lsdException w:name="Document Map" w:uiPriority="99"/>
+    <w:lsdException w:name="heading 8" w:uiPriority="9" w:qFormat="1"/>
+    <w:lsdException w:name="List Continue 3" w:uiPriority="99"/>
+    <w:lsdException w:name="Table Grid" w:uiPriority="59" w:semiHidden="0" w:unhideWhenUsed="0" w:qFormat="1"/>
+    <w:lsdException w:name="Emphasis" w:uiPriority="20" w:semiHidden="0" w:unhideWhenUsed="0" w:qFormat="1"/>
+    <w:lsdException w:name="Colorful List Accent 1" w:uiPriority="72" w:semiHidden="0" w:unhideWhenUsed="0"/>
+    <w:lsdException w:name="List" w:uiPriority="99"/>
+    <w:lsdException w:name="Medium Shading 2 Accent 4" w:uiPriority="64" w:semiHidden="0" w:unhideWhenUsed="0"/>
+    <w:lsdException w:name="Message Header" w:uiPriority="99"/>
+    <w:lsdException w:name="Table Grid 5" w:uiPriority="99"/>
+    <w:lsdException w:name="table of figures" w:uiPriority="99"/>
+    <w:lsdException w:name="Colorful Grid Accent 3" w:uiPriority="73" w:semiHidden="0" w:unhideWhenUsed="0"/>
+    <w:lsdException w:name="toc 9" w:uiPriority="39"/>
+    <w:lsdException w:name="Medium Shading 1 Accent 3" w:uiPriority="63" w:semiHidden="0" w:unhideWhenUsed="0"/>
+    <w:lsdException w:name="Table 3D effects 1" w:uiPriority="99"/>
+    <w:lsdException w:name="index 7" w:uiPriority="99"/>
+    <w:lsdException w:name="Medium List 2 Accent 3" w:uiPriority="66" w:semiHidden="0" w:unhideWhenUsed="0"/>
+    <w:lsdException w:name="Table Simple 3" w:uiPriority="99"/>
+    <w:lsdException w:name="Medium Grid 3 Accent 4" w:uiPriority="69" w:semiHidden="0" w:unhideWhenUsed="0"/>
+    <w:lsdException w:name="Table Classic 1" w:uiPriority="99"/>
+    <w:lsdException w:name="Body Text First Indent" w:uiPriority="99"/>
+    <w:lsdException w:name="Light List" w:uiPriority="61" w:semiHidden="0" w:unhideWhenUsed="0"/>
+    <w:lsdException w:name="Colorful Grid Accent 4" w:uiPriority="73" w:semiHidden="0" w:unhideWhenUsed="0"/>
+    <w:lsdException w:name="Body Text Indent" w:uiPriority="99"/>
+    <w:lsdException w:name="Plain Text" w:uiPriority="99"/>
+    <w:lsdException w:name="List Continue 2" w:uiPriority="99"/>
+    <w:lsdException w:name="Medium Grid 2 Accent 6" w:uiPriority="68" w:semiHidden="0" w:unhideWhenUsed="0"/>
+    <w:lsdException w:name="Table List 1" w:uiPriority="99"/>
+    <w:lsdException w:name="footnote reference" w:uiPriority="99"/>
+    <w:lsdException w:name="Table Grid 3" w:uiPriority="99"/>
+    <w:lsdException w:name="macro" w:uiPriority="99"/>
+    <w:lsdException w:name="Light Shading Accent 1" w:uiPriority="60" w:semiHidden="0" w:unhideWhenUsed="0"/>
+    <w:lsdException w:name="Table Subtle 1" w:uiPriority="99"/>
+    <w:lsdException w:name="Colorful List" w:uiPriority="72" w:semiHidden="0" w:unhideWhenUsed="0"/>
+    <w:lsdException w:name="Medium Shading 1 Accent 1" w:uiPriority="63" w:semiHidden="0" w:unhideWhenUsed="0"/>
+    <w:lsdException w:name="Table Elegant" w:uiPriority="99"/>
+    <w:lsdException w:name="HTML Sample" w:uiPriority="99"/>
+    <w:lsdException w:name="HTML Preformatted" w:uiPriority="99"/>
+    <w:lsdException w:name="index 1" w:uiPriority="99"/>
+    <w:lsdException w:name="envelope return" w:uiPriority="99"/>
+    <w:lsdException w:name="Dark List Accent 5" w:uiPriority="70" w:semiHidden="0" w:unhideWhenUsed="0"/>
+    <w:lsdException w:name="Table Classic 3" w:uiPriority="99"/>
+    <w:lsdException w:name="Medium List 1" w:uiPriority="65" w:semiHidden="0" w:unhideWhenUsed="0"/>
+    <w:lsdException w:name="envelope address" w:uiPriority="99"/>
+    <w:lsdException w:name="Light Grid Accent 1" w:uiPriority="62" w:semiHidden="0" w:unhideWhenUsed="0"/>
+    <w:lsdException w:name="Table Columns 5" w:uiPriority="99"/>
+    <w:lsdException w:name="Colorful Grid Accent 2" w:uiPriority="73" w:semiHidden="0" w:unhideWhenUsed="0"/>
+    <w:lsdException w:name="Colorful Shading Accent 2" w:uiPriority="71" w:semiHidden="0" w:unhideWhenUsed="0"/>
+    <w:lsdException w:name="List Continue 4" w:uiPriority="99"/>
+    <w:lsdException w:name="toc 8" w:uiPriority="39"/>
   </w:latentStyles>
-  <w:style w:type="paragraph" w:default="1" w:styleId="1">
+  <w:style w:type="character" w:styleId="000009" w:default="1">
+    <w:name w:val="Default Paragraph Font"/>
+    <w:uiPriority w:val="1"/>
+    <w:semiHidden w:val="1"/>
+    <w:unhideWhenUsed w:val="1"/>
+    <w:qFormat w:val="1"/>
+  </w:style>
+  <w:style w:type="paragraph" w:styleId="000008" w:default="1">
     <w:name w:val="Normal"/>
-    <w:qFormat/>
     <w:uiPriority w:val="0"/>
+    <w:qFormat w:val="1"/>
     <w:pPr>
       <w:widowControl w:val="0"/>
       <w:spacing w:after="0" w:line="240" w:lineRule="auto"/>
@@ -5412,20 +5213,23 @@
       <w14:ligatures w14:val="none"/>
     </w:rPr>
   </w:style>
-  <w:style w:type="character" w:default="1" w:styleId="8">
-    <w:name w:val="Default Paragraph Font"/>
-    <w:semiHidden/>
-    <w:unhideWhenUsed/>
-    <w:qFormat/>
-    <w:uiPriority w:val="1"/>
-  </w:style>
-  <w:style w:type="table" w:default="1" w:styleId="6">
-    <w:name w:val="Normal Table"/>
-    <w:semiHidden/>
-    <w:unhideWhenUsed/>
-    <w:qFormat/>
-    <w:uiPriority w:val="99"/>
+  <w:style w:type="table" w:styleId="000012">
+    <w:name w:val="Table Grid"/>
+    <w:basedOn w:val="00000a"/>
+    <w:uiPriority w:val="59"/>
+    <w:qFormat w:val="1"/>
+    <w:pPr>
+      <w:spacing w:after="0" w:line="240" w:lineRule="auto"/>
+    </w:pPr>
     <w:tblPr>
+      <w:tblBorders>
+        <w:top w:val="single" w:color="auto" w:sz="4" w:space="0"/>
+        <w:left w:val="single" w:color="auto" w:sz="4" w:space="0"/>
+        <w:bottom w:val="single" w:color="auto" w:sz="4" w:space="0"/>
+        <w:right w:val="single" w:color="auto" w:sz="4" w:space="0"/>
+        <w:insideH w:val="single" w:color="auto" w:sz="4" w:space="0"/>
+        <w:insideV w:val="single" w:color="auto" w:sz="4" w:space="0"/>
+      </w:tblBorders>
       <w:tblCellMar>
         <w:top w:w="0" w:type="dxa"/>
         <w:left w:w="108" w:type="dxa"/>
@@ -5434,13 +5238,43 @@
       </w:tblCellMar>
     </w:tblPr>
   </w:style>
-  <w:style w:type="paragraph" w:styleId="2">
+  <w:style w:type="paragraph" w:styleId="000014">
+    <w:name w:val="List Paragraph"/>
+    <w:basedOn w:val="000008"/>
+    <w:uiPriority w:val="34"/>
+    <w:qFormat w:val="1"/>
+    <w:pPr>
+      <w:ind w:firstLine="420" w:firstLineChars="200"/>
+    </w:pPr>
+  </w:style>
+  <w:style w:type="paragraph" w:styleId="00000f">
+    <w:name w:val="Subtitle"/>
+    <w:basedOn w:val="000008"/>
+    <w:next w:val="000008"/>
+    <w:link w:val="000010"/>
+    <w:uiPriority w:val="11"/>
+    <w:qFormat w:val="1"/>
+    <w:pPr>
+      <w:spacing w:before="240" w:after="60" w:line="312" w:lineRule="auto"/>
+      <w:jc w:val="center"/>
+      <w:outlineLvl w:val="1"/>
+    </w:pPr>
+    <w:rPr>
+      <w:rFonts w:asciiTheme="minorHAnsi" w:hAnsiTheme="minorHAnsi" w:eastAsiaTheme="minorEastAsia" w:cstheme="minorBidi"/>
+      <w:b w:val="1"/>
+      <w:bCs w:val="1"/>
+      <w:kern w:val="28"/>
+      <w:sz w:val="32"/>
+      <w:szCs w:val="32"/>
+    </w:rPr>
+  </w:style>
+  <w:style w:type="paragraph" w:styleId="00000b">
     <w:name w:val="footer"/>
-    <w:basedOn w:val="1"/>
-    <w:link w:val="10"/>
-    <w:unhideWhenUsed/>
-    <w:qFormat/>
+    <w:basedOn w:val="000008"/>
+    <w:link w:val="00000c"/>
     <w:uiPriority w:val="99"/>
+    <w:unhideWhenUsed w:val="1"/>
+    <w:qFormat w:val="1"/>
     <w:pPr>
       <w:tabs>
         <w:tab w:val="center" w:pos="4153"/>
@@ -5453,12 +5287,39 @@
       <w:szCs w:val="18"/>
     </w:rPr>
   </w:style>
-  <w:style w:type="paragraph" w:styleId="3">
+  <w:style w:type="paragraph" w:styleId="000013" w:customStyle="1">
+    <w:name w:val="xl22"/>
+    <w:basedOn w:val="000008"/>
+    <w:uiPriority w:val="0"/>
+    <w:qFormat w:val="1"/>
+    <w:pPr>
+      <w:widowControl w:val="1"/>
+      <w:spacing w:before="100" w:beforeAutospacing="1" w:after="100" w:afterAutospacing="1"/>
+      <w:jc w:val="center"/>
+    </w:pPr>
+    <w:rPr>
+      <w:rFonts w:ascii="宋体" w:hAnsi="宋体"/>
+      <w:kern w:val="0"/>
+      <w:sz w:val="24"/>
+    </w:rPr>
+  </w:style>
+  <w:style w:type="character" w:styleId="00000e" w:customStyle="1">
+    <w:name w:val="页眉 字符"/>
+    <w:basedOn w:val="000009"/>
+    <w:link w:val="00000d"/>
+    <w:uiPriority w:val="99"/>
+    <w:qFormat w:val="1"/>
+    <w:rPr>
+      <w:sz w:val="18"/>
+      <w:szCs w:val="18"/>
+    </w:rPr>
+  </w:style>
+  <w:style w:type="paragraph" w:styleId="00000d">
     <w:name w:val="header"/>
-    <w:basedOn w:val="1"/>
-    <w:link w:val="9"/>
-    <w:unhideWhenUsed/>
+    <w:basedOn w:val="000008"/>
+    <w:link w:val="00000e"/>
     <w:uiPriority w:val="99"/>
+    <w:unhideWhenUsed w:val="1"/>
     <w:pPr>
       <w:tabs>
         <w:tab w:val="center" w:pos="4153"/>
@@ -5472,33 +5333,12 @@
       <w:szCs w:val="18"/>
     </w:rPr>
   </w:style>
-  <w:style w:type="paragraph" w:styleId="4">
-    <w:name w:val="Subtitle"/>
-    <w:basedOn w:val="1"/>
-    <w:next w:val="1"/>
-    <w:link w:val="13"/>
-    <w:qFormat/>
-    <w:uiPriority w:val="11"/>
-    <w:pPr>
-      <w:spacing w:before="240" w:after="60" w:line="312" w:lineRule="auto"/>
-      <w:jc w:val="center"/>
-      <w:outlineLvl w:val="1"/>
-    </w:pPr>
-    <w:rPr>
-      <w:rFonts w:asciiTheme="minorHAnsi" w:hAnsiTheme="minorHAnsi" w:eastAsiaTheme="minorEastAsia" w:cstheme="minorBidi"/>
-      <w:b/>
-      <w:bCs/>
-      <w:kern w:val="28"/>
-      <w:sz w:val="32"/>
-      <w:szCs w:val="32"/>
-    </w:rPr>
-  </w:style>
-  <w:style w:type="paragraph" w:styleId="5">
+  <w:style w:type="paragraph" w:styleId="000011">
     <w:name w:val="HTML Preformatted"/>
-    <w:basedOn w:val="1"/>
-    <w:semiHidden/>
-    <w:unhideWhenUsed/>
+    <w:basedOn w:val="000008"/>
     <w:uiPriority w:val="99"/>
+    <w:semiHidden w:val="1"/>
+    <w:unhideWhenUsed w:val="1"/>
     <w:pPr>
       <w:tabs>
         <w:tab w:val="left" w:pos="916"/>
@@ -5528,23 +5368,39 @@
       <w:lang w:val="en-US" w:eastAsia="zh-CN" w:bidi="ar"/>
     </w:rPr>
   </w:style>
-  <w:style w:type="table" w:styleId="7">
-    <w:name w:val="Table Grid"/>
-    <w:basedOn w:val="6"/>
-    <w:qFormat/>
-    <w:uiPriority w:val="59"/>
-    <w:pPr>
-      <w:spacing w:after="0" w:line="240" w:lineRule="auto"/>
-    </w:pPr>
+  <w:style w:type="character" w:styleId="000010" w:customStyle="1">
+    <w:name w:val="副标题 字符"/>
+    <w:basedOn w:val="000009"/>
+    <w:link w:val="00000f"/>
+    <w:uiPriority w:val="11"/>
+    <w:qFormat w:val="1"/>
+    <w:rPr>
+      <w:b w:val="1"/>
+      <w:bCs w:val="1"/>
+      <w:kern w:val="28"/>
+      <w:sz w:val="32"/>
+      <w:szCs w:val="32"/>
+      <w14:ligatures w14:val="none"/>
+    </w:rPr>
+  </w:style>
+  <w:style w:type="character" w:styleId="00000c" w:customStyle="1">
+    <w:name w:val="页脚 字符"/>
+    <w:basedOn w:val="000009"/>
+    <w:link w:val="00000b"/>
+    <w:uiPriority w:val="99"/>
+    <w:qFormat w:val="1"/>
+    <w:rPr>
+      <w:sz w:val="18"/>
+      <w:szCs w:val="18"/>
+    </w:rPr>
+  </w:style>
+  <w:style w:type="table" w:styleId="00000a" w:default="1">
+    <w:name w:val="Normal Table"/>
+    <w:uiPriority w:val="99"/>
+    <w:semiHidden w:val="1"/>
+    <w:unhideWhenUsed w:val="1"/>
+    <w:qFormat w:val="1"/>
     <w:tblPr>
-      <w:tblBorders>
-        <w:top w:val="single" w:color="auto" w:sz="4" w:space="0"/>
-        <w:left w:val="single" w:color="auto" w:sz="4" w:space="0"/>
-        <w:bottom w:val="single" w:color="auto" w:sz="4" w:space="0"/>
-        <w:right w:val="single" w:color="auto" w:sz="4" w:space="0"/>
-        <w:insideH w:val="single" w:color="auto" w:sz="4" w:space="0"/>
-        <w:insideV w:val="single" w:color="auto" w:sz="4" w:space="0"/>
-      </w:tblBorders>
       <w:tblCellMar>
         <w:top w:w="0" w:type="dxa"/>
         <w:left w:w="108" w:type="dxa"/>
@@ -5552,68 +5408,6 @@
         <w:right w:w="108" w:type="dxa"/>
       </w:tblCellMar>
     </w:tblPr>
-  </w:style>
-  <w:style w:type="character" w:customStyle="1" w:styleId="9">
-    <w:name w:val="页眉 字符"/>
-    <w:basedOn w:val="8"/>
-    <w:link w:val="3"/>
-    <w:qFormat/>
-    <w:uiPriority w:val="99"/>
-    <w:rPr>
-      <w:sz w:val="18"/>
-      <w:szCs w:val="18"/>
-    </w:rPr>
-  </w:style>
-  <w:style w:type="character" w:customStyle="1" w:styleId="10">
-    <w:name w:val="页脚 字符"/>
-    <w:basedOn w:val="8"/>
-    <w:link w:val="2"/>
-    <w:qFormat/>
-    <w:uiPriority w:val="99"/>
-    <w:rPr>
-      <w:sz w:val="18"/>
-      <w:szCs w:val="18"/>
-    </w:rPr>
-  </w:style>
-  <w:style w:type="paragraph" w:customStyle="1" w:styleId="11">
-    <w:name w:val="xl22"/>
-    <w:basedOn w:val="1"/>
-    <w:qFormat/>
-    <w:uiPriority w:val="0"/>
-    <w:pPr>
-      <w:widowControl/>
-      <w:spacing w:before="100" w:beforeAutospacing="1" w:after="100" w:afterAutospacing="1"/>
-      <w:jc w:val="center"/>
-    </w:pPr>
-    <w:rPr>
-      <w:rFonts w:ascii="宋体" w:hAnsi="宋体"/>
-      <w:kern w:val="0"/>
-      <w:sz w:val="24"/>
-    </w:rPr>
-  </w:style>
-  <w:style w:type="paragraph" w:styleId="12">
-    <w:name w:val="List Paragraph"/>
-    <w:basedOn w:val="1"/>
-    <w:qFormat/>
-    <w:uiPriority w:val="34"/>
-    <w:pPr>
-      <w:ind w:firstLine="420" w:firstLineChars="200"/>
-    </w:pPr>
-  </w:style>
-  <w:style w:type="character" w:customStyle="1" w:styleId="13">
-    <w:name w:val="副标题 字符"/>
-    <w:basedOn w:val="8"/>
-    <w:link w:val="4"/>
-    <w:qFormat/>
-    <w:uiPriority w:val="11"/>
-    <w:rPr>
-      <w:b/>
-      <w:bCs/>
-      <w:kern w:val="28"/>
-      <w:sz w:val="32"/>
-      <w:szCs w:val="32"/>
-      <w14:ligatures w14:val="none"/>
-    </w:rPr>
   </w:style>
 </w:styles>
 </file>

</xml_diff>

<commit_message>
Remove personal info from reports: school name, major/name/student ID header, course/lab/teacher/score table rows; keep experiment name and content sections only
</commit_message>
<xml_diff>
--- a/reports/exp03_图像的边缘检测算法的实现_实验报告.docx
+++ b/reports/exp03_图像的边缘检测算法的实现_实验报告.docx
@@ -2,30 +2,6 @@
 <file path=word/document.xml><?xml version="1.0" encoding="utf-8"?>
 <w:document xmlns:w="http://schemas.openxmlformats.org/wordprocessingml/2006/main" xmlns:a="http://schemas.openxmlformats.org/drawingml/2006/main" xmlns:wp="http://schemas.openxmlformats.org/drawingml/2006/wordprocessingDrawing" xmlns:pic="http://schemas.openxmlformats.org/drawingml/2006/picture" xmlns:r="http://schemas.openxmlformats.org/officeDocument/2006/relationships" xmlns:w14="http://schemas.microsoft.com/office/word/2010/wordml" xmlns:mc="http://schemas.openxmlformats.org/markup-compatibility/2006" mc:Ignorable="w14">
   <w:body>
-    <w:p>
-      <w:pPr>
-        <w:pStyle w:val="00000f"/>
-        <w:rPr>
-          <w:rFonts w:hint="eastAsia" w:ascii="宋体" w:hAnsi="宋体" w:eastAsia="宋体"/>
-          <w:lang w:val="en-US" w:eastAsia="zh-CN"/>
-        </w:rPr>
-      </w:pPr>
-      <w:bookmarkStart w:id="1" w:name="_Toc169118284"/>
-      <w:r>
-        <w:rPr>
-          <w:rFonts w:hint="eastAsia" w:ascii="宋体" w:hAnsi="宋体" w:eastAsia="宋体"/>
-        </w:rPr>
-        <w:t>江西师范大学人工智能学院学生实验报告</w:t>
-      </w:r>
-      <w:bookmarkEnd w:id="1"/>
-      <w:r>
-        <w:rPr>
-          <w:rFonts w:hint="eastAsia" w:ascii="宋体" w:hAnsi="宋体" w:eastAsia="宋体"/>
-          <w:lang w:val="en-US" w:eastAsia="zh-CN"/>
-        </w:rPr>
-        <w:t>三</w:t>
-      </w:r>
-    </w:p>
     <w:p>
       <w:pPr>
         <w:spacing w:before="312" w:beforeLines="100" w:after="156" w:afterLines="50"/>
@@ -35,207 +11,6 @@
           <w:szCs w:val="21"/>
         </w:rPr>
       </w:pPr>
-      <w:r>
-        <w:rPr>
-          <w:rFonts w:hint="eastAsia" w:ascii="宋体" w:hAnsi="宋体"/>
-          <w:b w:val="1"/>
-          <w:bCs w:val="1"/>
-          <w:szCs w:val="21"/>
-        </w:rPr>
-        <w:t>专业</w:t>
-      </w:r>
-      <w:r>
-        <w:rPr>
-          <w:rFonts w:hint="eastAsia" w:ascii="宋体" w:hAnsi="宋体"/>
-          <w:b w:val="1"/>
-          <w:bCs w:val="1"/>
-          <w:szCs w:val="21"/>
-          <w:u w:val="single"/>
-        </w:rPr>
-        <w:t xml:space="preserve">  人工智能专业  </w:t>
-      </w:r>
-      <w:r>
-        <w:rPr>
-          <w:rFonts w:ascii="宋体" w:hAnsi="宋体"/>
-          <w:b w:val="1"/>
-          <w:bCs w:val="1"/>
-          <w:szCs w:val="21"/>
-          <w:u w:val="single"/>
-        </w:rPr>
-        <w:t xml:space="preserve"> </w:t>
-      </w:r>
-      <w:r>
-        <w:rPr>
-          <w:rFonts w:hint="eastAsia" w:ascii="宋体" w:hAnsi="宋体"/>
-          <w:b w:val="1"/>
-          <w:bCs w:val="1"/>
-          <w:szCs w:val="21"/>
-        </w:rPr>
-        <w:t xml:space="preserve">姓名 </w:t>
-      </w:r>
-      <w:r>
-        <w:rPr>
-          <w:rFonts w:hint="eastAsia" w:ascii="宋体" w:hAnsi="宋体"/>
-          <w:b w:val="1"/>
-          <w:bCs w:val="1"/>
-          <w:szCs w:val="21"/>
-          <w:u w:val="single"/>
-        </w:rPr>
-        <w:t xml:space="preserve">   </w:t>
-      </w:r>
-      <w:r>
-        <w:rPr>
-          <w:rFonts w:hint="eastAsia" w:ascii="宋体" w:hAnsi="宋体"/>
-          <w:b w:val="1"/>
-          <w:bCs w:val="1"/>
-          <w:szCs w:val="21"/>
-          <w:u w:val="single"/>
-          <w:lang w:val="en-US" w:eastAsia="zh-CN"/>
-        </w:rPr>
-        <w:t>王依倩</w:t>
-      </w:r>
-      <w:r>
-        <w:rPr>
-          <w:rFonts w:hint="eastAsia" w:ascii="宋体" w:hAnsi="宋体"/>
-          <w:b w:val="1"/>
-          <w:bCs w:val="1"/>
-          <w:szCs w:val="21"/>
-          <w:u w:val="single"/>
-        </w:rPr>
-        <w:t xml:space="preserve">   </w:t>
-      </w:r>
-      <w:r>
-        <w:rPr>
-          <w:rFonts w:hint="eastAsia" w:ascii="宋体" w:hAnsi="宋体"/>
-          <w:b w:val="1"/>
-          <w:bCs w:val="1"/>
-          <w:szCs w:val="21"/>
-        </w:rPr>
-        <w:t>学号</w:t>
-      </w:r>
-      <w:r>
-        <w:rPr>
-          <w:rFonts w:hint="eastAsia" w:ascii="宋体" w:hAnsi="宋体"/>
-          <w:b w:val="1"/>
-          <w:bCs w:val="1"/>
-          <w:szCs w:val="21"/>
-          <w:u w:val="single"/>
-        </w:rPr>
-        <w:t xml:space="preserve">  </w:t>
-      </w:r>
-      <w:r>
-        <w:rPr>
-          <w:rFonts w:hint="eastAsia" w:ascii="宋体" w:hAnsi="宋体"/>
-          <w:b w:val="1"/>
-          <w:bCs w:val="1"/>
-          <w:szCs w:val="21"/>
-          <w:u w:val="single"/>
-          <w:lang w:val="en-US" w:eastAsia="zh-CN"/>
-        </w:rPr>
-        <w:t>202426203004</w:t>
-      </w:r>
-      <w:r>
-        <w:rPr>
-          <w:rFonts w:hint="eastAsia" w:ascii="宋体" w:hAnsi="宋体"/>
-          <w:b w:val="1"/>
-          <w:bCs w:val="1"/>
-          <w:szCs w:val="21"/>
-          <w:u w:val="single"/>
-        </w:rPr>
-        <w:t xml:space="preserve">      </w:t>
-      </w:r>
-      <w:r>
-        <w:rPr>
-          <w:rFonts w:hint="eastAsia" w:ascii="宋体" w:hAnsi="宋体"/>
-          <w:b w:val="1"/>
-          <w:bCs w:val="1"/>
-          <w:szCs w:val="21"/>
-        </w:rPr>
-        <w:t>日期</w:t>
-      </w:r>
-      <w:r>
-        <w:rPr>
-          <w:rFonts w:ascii="宋体" w:hAnsi="宋体"/>
-          <w:b w:val="1"/>
-          <w:bCs w:val="1"/>
-          <w:szCs w:val="21"/>
-          <w:u w:val="single"/>
-        </w:rPr>
-        <w:t xml:space="preserve">   </w:t>
-      </w:r>
-      <w:r>
-        <w:rPr>
-          <w:rFonts w:hint="eastAsia" w:ascii="宋体" w:hAnsi="宋体"/>
-          <w:b w:val="1"/>
-          <w:bCs w:val="1"/>
-          <w:szCs w:val="21"/>
-          <w:u w:val="single"/>
-        </w:rPr>
-        <w:t>202</w:t>
-      </w:r>
-      <w:r>
-        <w:rPr>
-          <w:rFonts w:hint="eastAsia" w:ascii="宋体" w:hAnsi="宋体"/>
-          <w:b w:val="1"/>
-          <w:bCs w:val="1"/>
-          <w:szCs w:val="21"/>
-          <w:u w:val="single"/>
-          <w:lang w:val="en-US" w:eastAsia="zh-CN"/>
-        </w:rPr>
-        <w:t>6</w:t>
-      </w:r>
-      <w:r>
-        <w:rPr>
-          <w:rFonts w:hint="eastAsia" w:ascii="宋体" w:hAnsi="宋体"/>
-          <w:b w:val="1"/>
-          <w:bCs w:val="1"/>
-          <w:szCs w:val="21"/>
-          <w:u w:val="single"/>
-        </w:rPr>
-        <w:t>/</w:t>
-      </w:r>
-      <w:r>
-        <w:rPr>
-          <w:rFonts w:hint="eastAsia" w:ascii="宋体" w:hAnsi="宋体"/>
-          <w:b w:val="1"/>
-          <w:bCs w:val="1"/>
-          <w:szCs w:val="21"/>
-          <w:u w:val="single"/>
-          <w:lang w:val="en-US" w:eastAsia="zh-CN"/>
-        </w:rPr>
-        <w:t>9</w:t>
-      </w:r>
-      <w:r>
-        <w:rPr>
-          <w:rFonts w:hint="eastAsia" w:ascii="宋体" w:hAnsi="宋体"/>
-          <w:b w:val="1"/>
-          <w:bCs w:val="1"/>
-          <w:szCs w:val="21"/>
-          <w:u w:val="single"/>
-        </w:rPr>
-        <w:t>/</w:t>
-      </w:r>
-      <w:r>
-        <w:rPr>
-          <w:rFonts w:hint="eastAsia" w:ascii="宋体" w:hAnsi="宋体"/>
-          <w:b w:val="1"/>
-          <w:bCs w:val="1"/>
-          <w:szCs w:val="21"/>
-          <w:u w:val="single"/>
-          <w:lang w:val="en-US" w:eastAsia="zh-CN"/>
-        </w:rPr>
-        <w:t>14</w:t>
-      </w:r>
-      <w:r>
-        <w:rPr>
-          <w:rFonts w:ascii="宋体" w:hAnsi="宋体"/>
-          <w:b w:val="1"/>
-          <w:bCs w:val="1"/>
-          <w:szCs w:val="21"/>
-          <w:u w:val="single"/>
-        </w:rPr>
-        <w:t xml:space="preserve">    </w:t>
-      </w:r>
     </w:p>
     <w:tbl>
       <w:tblPr>
@@ -266,106 +41,6 @@
       </w:tblGrid>
       <w:tr>
         <w:trPr>
-          <w:trHeight w:val="624" w:hRule="atLeast"/>
-          <w:jc w:val="center"/>
-        </w:trPr>
-        <w:tc>
-          <w:tcPr>
-            <w:tcW w:w="1595" w:type="dxa"/>
-            <w:vAlign w:val="center"/>
-          </w:tcPr>
-          <w:p>
-            <w:pPr>
-              <w:spacing w:line="320" w:lineRule="exact"/>
-              <w:jc w:val="center"/>
-              <w:rPr>
-                <w:rFonts w:ascii="宋体" w:hAnsi="华文中宋"/>
-                <w:sz w:val="24"/>
-              </w:rPr>
-            </w:pPr>
-            <w:r>
-              <w:rPr>
-                <w:rFonts w:hint="eastAsia" w:ascii="宋体" w:hAnsi="华文中宋"/>
-                <w:sz w:val="24"/>
-              </w:rPr>
-              <w:t>课程名称</w:t>
-            </w:r>
-          </w:p>
-        </w:tc>
-        <w:tc>
-          <w:tcPr>
-            <w:tcW w:w="3338" w:type="dxa"/>
-            <w:vAlign w:val="center"/>
-          </w:tcPr>
-          <w:p>
-            <w:pPr>
-              <w:spacing w:line="320" w:lineRule="exact"/>
-              <w:jc w:val="center"/>
-              <w:rPr>
-                <w:rFonts w:ascii="宋体" w:hAnsi="华文中宋"/>
-                <w:sz w:val="24"/>
-              </w:rPr>
-            </w:pPr>
-            <w:r>
-              <w:rPr>
-                <w:rFonts w:hint="eastAsia" w:ascii="宋体" w:hAnsi="华文中宋"/>
-                <w:sz w:val="24"/>
-              </w:rPr>
-              <w:t>计算机视觉基础</w:t>
-            </w:r>
-          </w:p>
-        </w:tc>
-        <w:tc>
-          <w:tcPr>
-            <w:tcW w:w="1655" w:type="dxa"/>
-            <w:vAlign w:val="center"/>
-          </w:tcPr>
-          <w:p>
-            <w:pPr>
-              <w:spacing w:line="320" w:lineRule="exact"/>
-              <w:jc w:val="center"/>
-              <w:rPr>
-                <w:rFonts w:ascii="宋体" w:hAnsi="华文中宋"/>
-                <w:sz w:val="24"/>
-              </w:rPr>
-            </w:pPr>
-            <w:r>
-              <w:rPr>
-                <w:rFonts w:hint="eastAsia" w:ascii="宋体" w:hAnsi="华文中宋"/>
-                <w:sz w:val="24"/>
-              </w:rPr>
-              <w:t>实验室名称</w:t>
-            </w:r>
-          </w:p>
-        </w:tc>
-        <w:tc>
-          <w:tcPr>
-            <w:tcW w:w="2200" w:type="dxa"/>
-            <w:vAlign w:val="center"/>
-          </w:tcPr>
-          <w:p>
-            <w:pPr>
-              <w:spacing w:line="320" w:lineRule="exact"/>
-              <w:jc w:val="center"/>
-              <w:rPr>
-                <w:rFonts w:hint="default" w:ascii="宋体" w:hAnsi="华文中宋" w:eastAsia="宋体"/>
-                <w:sz w:val="24"/>
-                <w:lang w:val="en-US" w:eastAsia="zh-CN"/>
-              </w:rPr>
-            </w:pPr>
-            <w:r>
-              <w:rPr>
-                <w:rFonts w:hint="eastAsia" w:ascii="宋体" w:hAnsi="华文中宋"/>
-                <w:sz w:val="24"/>
-                <w:lang w:val="en-US" w:eastAsia="zh-CN"/>
-              </w:rPr>
-              <w:t>X3323</w:t>
-            </w:r>
-          </w:p>
-        </w:tc>
-      </w:tr>
-      <w:tr>
-        <w:trPr>
           <w:cantSplit w:val="1"/>
           <w:trHeight w:val="634" w:hRule="atLeast"/>
           <w:jc w:val="center"/>
@@ -417,98 +92,6 @@
               </w:rPr>
               <w:t>图像边缘检测算法的实现</w:t>
             </w:r>
-          </w:p>
-        </w:tc>
-      </w:tr>
-      <w:tr>
-        <w:trPr>
-          <w:trHeight w:val="621" w:hRule="atLeast"/>
-          <w:jc w:val="center"/>
-        </w:trPr>
-        <w:tc>
-          <w:tcPr>
-            <w:tcW w:w="1595" w:type="dxa"/>
-            <w:vAlign w:val="center"/>
-          </w:tcPr>
-          <w:p>
-            <w:pPr>
-              <w:spacing w:line="320" w:lineRule="exact"/>
-              <w:jc w:val="center"/>
-              <w:rPr>
-                <w:rFonts w:ascii="宋体" w:hAnsi="华文中宋"/>
-                <w:sz w:val="24"/>
-              </w:rPr>
-            </w:pPr>
-            <w:r>
-              <w:rPr>
-                <w:rFonts w:hint="eastAsia" w:ascii="宋体" w:hAnsi="华文中宋"/>
-                <w:sz w:val="24"/>
-              </w:rPr>
-              <w:t>指导教师</w:t>
-            </w:r>
-          </w:p>
-        </w:tc>
-        <w:tc>
-          <w:tcPr>
-            <w:tcW w:w="3338" w:type="dxa"/>
-            <w:vAlign w:val="center"/>
-          </w:tcPr>
-          <w:p>
-            <w:pPr>
-              <w:pStyle w:val="000013"/>
-              <w:widowControl w:val="0"/>
-              <w:spacing w:before="0" w:beforeAutospacing="0" w:after="0" w:afterAutospacing="0" w:line="320" w:lineRule="exact"/>
-              <w:rPr>
-                <w:rFonts w:hAnsi="华文中宋"/>
-                <w:kern w:val="2"/>
-              </w:rPr>
-            </w:pPr>
-            <w:r>
-              <w:rPr>
-                <w:rFonts w:hint="eastAsia" w:hAnsi="华文中宋"/>
-                <w:kern w:val="2"/>
-              </w:rPr>
-              <w:t>刘飞强</w:t>
-            </w:r>
-          </w:p>
-        </w:tc>
-        <w:tc>
-          <w:tcPr>
-            <w:tcW w:w="1655" w:type="dxa"/>
-            <w:vAlign w:val="center"/>
-          </w:tcPr>
-          <w:p>
-            <w:pPr>
-              <w:spacing w:line="320" w:lineRule="exact"/>
-              <w:jc w:val="center"/>
-              <w:rPr>
-                <w:rFonts w:ascii="宋体" w:hAnsi="华文中宋"/>
-                <w:sz w:val="24"/>
-              </w:rPr>
-            </w:pPr>
-            <w:r>
-              <w:rPr>
-                <w:rFonts w:hint="eastAsia" w:ascii="宋体" w:hAnsi="华文中宋"/>
-                <w:sz w:val="24"/>
-              </w:rPr>
-              <w:t>成绩</w:t>
-            </w:r>
-          </w:p>
-        </w:tc>
-        <w:tc>
-          <w:tcPr>
-            <w:tcW w:w="2200" w:type="dxa"/>
-            <w:vAlign w:val="center"/>
-          </w:tcPr>
-          <w:p>
-            <w:pPr>
-              <w:spacing w:line="320" w:lineRule="exact"/>
-              <w:jc w:val="center"/>
-              <w:rPr>
-                <w:rFonts w:ascii="宋体" w:hAnsi="华文中宋"/>
-                <w:sz w:val="24"/>
-              </w:rPr>
-            </w:pPr>
           </w:p>
         </w:tc>
       </w:tr>
@@ -980,8 +563,8 @@
               </w:rPr>
               <w:t>5. 观察并分析各算子的检测效果差异。</w:t>
             </w:r>
-            <w:bookmarkStart w:id="2" w:name="_GoBack"/>
-            <w:bookmarkEnd w:id="2"/>
+            <w:bookmarkStart w:id="1" w:name="_GoBack"/>
+            <w:bookmarkEnd w:id="1"/>
           </w:p>
         </w:tc>
       </w:tr>
@@ -4855,7 +4438,7 @@
 
 <file path=word/endnotes.xml><?xml version="1.0" encoding="utf-8"?>
 <w:endnotes xmlns:w="http://schemas.openxmlformats.org/wordprocessingml/2006/main" xmlns:w14="http://schemas.microsoft.com/office/word/2010/wordml" xmlns:mc="http://schemas.openxmlformats.org/markup-compatibility/2006" mc:Ignorable="w14">
-  <w:endnote w:type="continuationSeparator" w:id="0">
+  <w:endnote w:type="continuationSeparator" w:id="1">
     <w:p>
       <w:pPr>
         <w:spacing w:line="240" w:lineRule="auto"/>
@@ -4865,7 +4448,7 @@
       </w:r>
     </w:p>
   </w:endnote>
-  <w:endnote w:type="separator" w:id="1">
+  <w:endnote w:type="separator" w:id="0">
     <w:p>
       <w:pPr>
         <w:spacing w:line="240" w:lineRule="auto"/>
@@ -4938,336 +4521,256 @@
     <w:pPrDefault/>
   </w:docDefaults>
   <w:latentStyles w:defLockedState="0" w:defUIPriority="99" w:defSemiHidden="1" w:defUnhideWhenUsed="1" w:defQFormat="0" w:count="260">
-    <w:lsdException w:name="Salutation" w:uiPriority="99"/>
-    <w:lsdException w:name="Closing" w:uiPriority="99"/>
-    <w:lsdException w:name="Medium Grid 3 Accent 2" w:uiPriority="69" w:semiHidden="0" w:unhideWhenUsed="0"/>
+    <w:lsdException w:name="Colorful Shading Accent 2" w:uiPriority="71" w:semiHidden="0" w:unhideWhenUsed="0"/>
+    <w:lsdException w:name="footer" w:uiPriority="99" w:semiHidden="0" w:qFormat="1"/>
+    <w:lsdException w:name="Medium List 2 Accent 5" w:uiPriority="66" w:semiHidden="0" w:unhideWhenUsed="0"/>
+    <w:lsdException w:name="Plain Text" w:uiPriority="99"/>
+    <w:lsdException w:name="List Bullet 2" w:uiPriority="99"/>
+    <w:lsdException w:name="Medium List 1 Accent 2" w:uiPriority="65" w:semiHidden="0" w:unhideWhenUsed="0"/>
+    <w:lsdException w:name="Body Text Indent" w:uiPriority="99"/>
+    <w:lsdException w:name="Colorful Shading Accent 5" w:uiPriority="71" w:semiHidden="0" w:unhideWhenUsed="0"/>
+    <w:lsdException w:name="Medium Shading 2" w:uiPriority="64" w:semiHidden="0" w:unhideWhenUsed="0"/>
+    <w:lsdException w:name="caption" w:uiPriority="35" w:qFormat="1"/>
+    <w:lsdException w:name="Colorful List" w:uiPriority="72" w:semiHidden="0" w:unhideWhenUsed="0"/>
+    <w:lsdException w:name="Colorful Grid Accent 5" w:uiPriority="73" w:semiHidden="0" w:unhideWhenUsed="0"/>
+    <w:lsdException w:name="Table List 4" w:uiPriority="99"/>
+    <w:lsdException w:name="Medium Grid 2" w:uiPriority="68" w:semiHidden="0" w:unhideWhenUsed="0"/>
+    <w:lsdException w:name="Medium Shading 1 Accent 2" w:uiPriority="63" w:semiHidden="0" w:unhideWhenUsed="0"/>
+    <w:lsdException w:name="Colorful Grid Accent 3" w:uiPriority="73" w:semiHidden="0" w:unhideWhenUsed="0"/>
+    <w:lsdException w:name="Table List 7" w:uiPriority="99"/>
+    <w:lsdException w:name="Table List 1" w:uiPriority="99"/>
+    <w:lsdException w:name="Date" w:uiPriority="99"/>
+    <w:lsdException w:name="Table Grid 1" w:uiPriority="99"/>
+    <w:lsdException w:name="E-mail Signature" w:uiPriority="99"/>
+    <w:lsdException w:name="Dark List Accent 2" w:uiPriority="70" w:semiHidden="0" w:unhideWhenUsed="0"/>
+    <w:lsdException w:name="Table Grid 4" w:uiPriority="99"/>
+    <w:lsdException w:name="List Number 2" w:uiPriority="99"/>
+    <w:lsdException w:name="Light Shading Accent 5" w:uiPriority="60" w:semiHidden="0" w:unhideWhenUsed="0"/>
+    <w:lsdException w:name="Table Grid 7" w:uiPriority="99"/>
+    <w:lsdException w:name="Light Shading Accent 2" w:uiPriority="60" w:semiHidden="0" w:unhideWhenUsed="0"/>
+    <w:lsdException w:name="Light Grid Accent 5" w:uiPriority="62" w:semiHidden="0" w:unhideWhenUsed="0"/>
+    <w:lsdException w:name="Dark List Accent 1" w:uiPriority="70" w:semiHidden="0" w:unhideWhenUsed="0"/>
+    <w:lsdException w:name="Body Text Indent 2" w:uiPriority="99"/>
+    <w:lsdException w:name="toc 6" w:uiPriority="39"/>
+    <w:lsdException w:name="Table Elegant" w:uiPriority="99"/>
+    <w:lsdException w:name="Table Classic 2" w:uiPriority="99"/>
+    <w:lsdException w:name="Light List Accent 3" w:uiPriority="61" w:semiHidden="0" w:unhideWhenUsed="0"/>
+    <w:lsdException w:name="toc 9" w:uiPriority="39"/>
     <w:lsdException w:name="Light Grid Accent 2" w:uiPriority="62" w:semiHidden="0" w:unhideWhenUsed="0"/>
-    <w:lsdException w:name="List Bullet 5" w:uiPriority="99"/>
-    <w:lsdException w:name="Medium List 2 Accent 5" w:uiPriority="66" w:semiHidden="0" w:unhideWhenUsed="0"/>
-    <w:lsdException w:name="Table Simple 2" w:uiPriority="99"/>
-    <w:lsdException w:name="HTML Variable" w:uiPriority="99"/>
-    <w:lsdException w:name="Table List 8" w:uiPriority="99"/>
-    <w:lsdException w:name="header" w:uiPriority="99" w:semiHidden="0"/>
+    <w:lsdException w:name="Table Columns 5" w:uiPriority="99"/>
+    <w:lsdException w:name="HTML Acronym" w:uiPriority="99"/>
+    <w:lsdException w:name="Normal (Web)" w:uiPriority="99"/>
+    <w:lsdException w:name="toc 1" w:uiPriority="39"/>
+    <w:lsdException w:name="Strong" w:uiPriority="22" w:semiHidden="0" w:unhideWhenUsed="0" w:qFormat="1"/>
     <w:lsdException w:name="toc 4" w:uiPriority="39"/>
     <w:lsdException w:name="Colorful List Accent 6" w:uiPriority="72" w:semiHidden="0" w:unhideWhenUsed="0"/>
+    <w:lsdException w:name="Table Columns 2" w:uiPriority="99"/>
+    <w:lsdException w:name="Light List Accent 4" w:uiPriority="61" w:semiHidden="0" w:unhideWhenUsed="0"/>
+    <w:lsdException w:name="Medium Shading 2 Accent 3" w:uiPriority="64" w:semiHidden="0" w:unhideWhenUsed="0"/>
+    <w:lsdException w:name="index 7" w:uiPriority="99"/>
+    <w:lsdException w:name="Colorful List Accent 4" w:uiPriority="72" w:semiHidden="0" w:unhideWhenUsed="0"/>
+    <w:lsdException w:name="List 2" w:uiPriority="99"/>
+    <w:lsdException w:name="Medium Shading 2 Accent 5" w:uiPriority="64" w:semiHidden="0" w:unhideWhenUsed="0"/>
+    <w:lsdException w:name="Colorful List Accent 1" w:uiPriority="72" w:semiHidden="0" w:unhideWhenUsed="0"/>
+    <w:lsdException w:name="index 2" w:uiPriority="99"/>
+    <w:lsdException w:name="List 5" w:uiPriority="99"/>
+    <w:lsdException w:name="heading 3" w:uiPriority="9" w:qFormat="1"/>
+    <w:lsdException w:name="index 9" w:uiPriority="99"/>
+    <w:lsdException w:name="Medium Grid 3 Accent 1" w:uiPriority="69" w:semiHidden="0" w:unhideWhenUsed="0"/>
+    <w:lsdException w:name="heading 1" w:uiPriority="9" w:semiHidden="0" w:unhideWhenUsed="0" w:qFormat="1"/>
+    <w:lsdException w:name="Medium Shading 1 Accent 1" w:uiPriority="63" w:semiHidden="0" w:unhideWhenUsed="0"/>
+    <w:lsdException w:name="heading 8" w:uiPriority="9" w:qFormat="1"/>
+    <w:lsdException w:name="Medium Grid 3 Accent 2" w:uiPriority="69" w:semiHidden="0" w:unhideWhenUsed="0"/>
+    <w:lsdException w:name="Medium List 1" w:uiPriority="65" w:semiHidden="0" w:unhideWhenUsed="0"/>
+    <w:lsdException w:name="HTML Keyboard" w:uiPriority="99"/>
+    <w:lsdException w:name="Body Text First Indent 2" w:uiPriority="99"/>
+    <w:lsdException w:name="Medium Shading 1 Accent 3" w:uiPriority="63" w:semiHidden="0" w:unhideWhenUsed="0"/>
+    <w:lsdException w:name="Table Web 3" w:uiPriority="99"/>
+    <w:lsdException w:name="heading 6" w:uiPriority="9" w:qFormat="1"/>
+    <w:lsdException w:name="Colorful Grid Accent 6" w:uiPriority="73" w:semiHidden="0" w:unhideWhenUsed="0"/>
+    <w:lsdException w:name="Table Web 1" w:uiPriority="99"/>
+    <w:lsdException w:name="Medium Shading 1 Accent 4" w:uiPriority="63" w:semiHidden="0" w:unhideWhenUsed="0"/>
+    <w:lsdException w:name="Table Grid" w:uiPriority="59" w:semiHidden="0" w:unhideWhenUsed="0" w:qFormat="1"/>
+    <w:lsdException w:name="Table Simple 1" w:uiPriority="99"/>
+    <w:lsdException w:name="footnote text" w:uiPriority="99"/>
+    <w:lsdException w:name="FollowedHyperlink" w:uiPriority="99"/>
+    <w:lsdException w:name="Emphasis" w:uiPriority="20" w:semiHidden="0" w:unhideWhenUsed="0" w:qFormat="1"/>
+    <w:lsdException w:name="Colorful Grid Accent 1" w:uiPriority="73" w:semiHidden="0" w:unhideWhenUsed="0"/>
+    <w:lsdException w:name="endnote reference" w:uiPriority="99"/>
+    <w:lsdException w:name="Table Simple 3" w:uiPriority="99"/>
+    <w:lsdException w:name="Signature" w:uiPriority="99"/>
+    <w:lsdException w:name="Medium Grid 1 Accent 4" w:uiPriority="67" w:semiHidden="0" w:unhideWhenUsed="0"/>
+    <w:lsdException w:name="Table 3D effects 3" w:uiPriority="99"/>
+    <w:lsdException w:name="Colorful Grid" w:uiPriority="73" w:semiHidden="0" w:unhideWhenUsed="0"/>
+    <w:lsdException w:name="Medium Grid 1 Accent 2" w:uiPriority="67" w:semiHidden="0" w:unhideWhenUsed="0"/>
+    <w:lsdException w:name="Table Contemporary" w:uiPriority="99"/>
+    <w:lsdException w:name="Medium Grid 2 Accent 5" w:uiPriority="68" w:semiHidden="0" w:unhideWhenUsed="0"/>
+    <w:lsdException w:name="List Continue 5" w:uiPriority="99"/>
+    <w:lsdException w:name="table of authorities" w:uiPriority="99"/>
+    <w:lsdException w:name="Table Classic 1" w:uiPriority="99"/>
+    <w:lsdException w:name="List Continue 3" w:uiPriority="99"/>
+    <w:lsdException w:name="Normal" w:uiPriority="0" w:semiHidden="0" w:unhideWhenUsed="0" w:qFormat="1"/>
+    <w:lsdException w:name="Block Text" w:uiPriority="99"/>
+    <w:lsdException w:name="Table Professional" w:uiPriority="99"/>
+    <w:lsdException w:name="Light List Accent 6" w:uiPriority="61" w:semiHidden="0" w:unhideWhenUsed="0"/>
+    <w:lsdException w:name="Colorful Shading" w:uiPriority="71" w:semiHidden="0" w:unhideWhenUsed="0"/>
+    <w:lsdException w:name="Medium List 2 Accent 6" w:uiPriority="66" w:semiHidden="0" w:unhideWhenUsed="0"/>
+    <w:lsdException w:name="envelope return" w:uiPriority="99"/>
+    <w:lsdException w:name="Light List" w:uiPriority="61" w:semiHidden="0" w:unhideWhenUsed="0"/>
+    <w:lsdException w:name="Medium Grid 1" w:uiPriority="67" w:semiHidden="0" w:unhideWhenUsed="0"/>
+    <w:lsdException w:name="annotation subject" w:uiPriority="99"/>
+    <w:lsdException w:name="Medium List 1 Accent 3" w:uiPriority="65" w:semiHidden="0" w:unhideWhenUsed="0"/>
+    <w:lsdException w:name="page number" w:uiPriority="99"/>
+    <w:lsdException w:name="Medium Shading 2 Accent 2" w:uiPriority="64" w:semiHidden="0" w:unhideWhenUsed="0"/>
     <w:lsdException w:name="Balloon Text" w:uiPriority="99"/>
-    <w:lsdException w:name="Table Columns 4" w:uiPriority="99"/>
-    <w:lsdException w:name="Colorful Shading" w:uiPriority="71" w:semiHidden="0" w:unhideWhenUsed="0"/>
-    <w:lsdException w:name="Subtitle" w:uiPriority="11" w:semiHidden="0" w:unhideWhenUsed="0" w:qFormat="1"/>
-    <w:lsdException w:name="table of authorities" w:uiPriority="99"/>
-    <w:lsdException w:name="Light List Accent 2" w:uiPriority="61" w:semiHidden="0" w:unhideWhenUsed="0"/>
+    <w:lsdException w:name="Salutation" w:uiPriority="99"/>
+    <w:lsdException w:name="List Bullet 4" w:uiPriority="99"/>
     <w:lsdException w:name="Colorful Shading Accent 3" w:uiPriority="71" w:semiHidden="0" w:unhideWhenUsed="0"/>
+    <w:lsdException w:name="Medium List 1 Accent 4" w:uiPriority="65" w:semiHidden="0" w:unhideWhenUsed="0"/>
+    <w:lsdException w:name="Document Map" w:uiPriority="99"/>
+    <w:lsdException w:name="Medium List 1 Accent 6" w:uiPriority="65" w:semiHidden="0" w:unhideWhenUsed="0"/>
+    <w:lsdException w:name="List Bullet 3" w:uiPriority="99"/>
+    <w:lsdException w:name="index 1" w:uiPriority="99"/>
+    <w:lsdException w:name="Colorful Shading Accent 6" w:uiPriority="71" w:semiHidden="0" w:unhideWhenUsed="0"/>
+    <w:lsdException w:name="Medium List 1 Accent 1" w:uiPriority="65" w:semiHidden="0" w:unhideWhenUsed="0"/>
+    <w:lsdException w:name="HTML Definition" w:uiPriority="99"/>
+    <w:lsdException w:name="Medium Shading 1" w:uiPriority="63" w:semiHidden="0" w:unhideWhenUsed="0"/>
+    <w:lsdException w:name="heading 4" w:uiPriority="9" w:qFormat="1"/>
+    <w:lsdException w:name="Table Subtle 2" w:uiPriority="99"/>
+    <w:lsdException w:name="heading 9" w:uiPriority="9" w:qFormat="1"/>
+    <w:lsdException w:name="Table List 5" w:uiPriority="99"/>
+    <w:lsdException w:name="Table List 2" w:uiPriority="99"/>
+    <w:lsdException w:name="Hyperlink" w:uiPriority="99"/>
+    <w:lsdException w:name="Table Theme" w:uiPriority="99"/>
     <w:lsdException w:name="Table Grid 2" w:uiPriority="99"/>
-    <w:lsdException w:name="heading 4" w:uiPriority="9" w:qFormat="1"/>
-    <w:lsdException w:name="Light Grid Accent 3" w:uiPriority="62" w:semiHidden="0" w:unhideWhenUsed="0"/>
+    <w:lsdException w:name="HTML Typewriter" w:uiPriority="99"/>
     <w:lsdException w:name="Dark List Accent 3" w:uiPriority="70" w:semiHidden="0" w:unhideWhenUsed="0"/>
-    <w:lsdException w:name="annotation subject" w:uiPriority="99"/>
-    <w:lsdException w:name="Signature" w:uiPriority="99"/>
-    <w:lsdException w:name="Hyperlink" w:uiPriority="99"/>
-    <w:lsdException w:name="caption" w:uiPriority="35" w:qFormat="1"/>
-    <w:lsdException w:name="Table Columns 3" w:uiPriority="99"/>
-    <w:lsdException w:name="Medium List 1 Accent 6" w:uiPriority="65" w:semiHidden="0" w:unhideWhenUsed="0"/>
-    <w:lsdException w:name="Medium Grid 3 Accent 3" w:uiPriority="69" w:semiHidden="0" w:unhideWhenUsed="0"/>
+    <w:lsdException w:name="Default Paragraph Font" w:uiPriority="1" w:qFormat="1"/>
+    <w:lsdException w:name="Table Grid 5" w:uiPriority="99"/>
+    <w:lsdException w:name="Medium Grid 2 Accent 6" w:uiPriority="68" w:semiHidden="0" w:unhideWhenUsed="0"/>
+    <w:lsdException w:name="List Number 5" w:uiPriority="99"/>
+    <w:lsdException w:name="Dark List Accent 4" w:uiPriority="70" w:semiHidden="0" w:unhideWhenUsed="0"/>
+    <w:lsdException w:name="Table 3D effects 2" w:uiPriority="99"/>
+    <w:lsdException w:name="footnote reference" w:uiPriority="99"/>
     <w:lsdException w:name="HTML Cite" w:uiPriority="99"/>
-    <w:lsdException w:name="Medium Grid 1 Accent 2" w:uiPriority="67" w:semiHidden="0" w:unhideWhenUsed="0"/>
-    <w:lsdException w:name="footer" w:uiPriority="99" w:semiHidden="0" w:qFormat="1"/>
-    <w:lsdException w:name="Medium List 2" w:uiPriority="66" w:semiHidden="0" w:unhideWhenUsed="0"/>
-    <w:lsdException w:name="heading 5" w:uiPriority="9" w:qFormat="1"/>
-    <w:lsdException w:name="toc 2" w:uiPriority="39"/>
-    <w:lsdException w:name="Light Shading Accent 6" w:uiPriority="60" w:semiHidden="0" w:unhideWhenUsed="0"/>
-    <w:lsdException w:name="Default Paragraph Font" w:uiPriority="1" w:qFormat="1"/>
-    <w:lsdException w:name="List 2" w:uiPriority="99"/>
-    <w:lsdException w:name="Light Grid Accent 4" w:uiPriority="62" w:semiHidden="0" w:unhideWhenUsed="0"/>
-    <w:lsdException w:name="annotation reference" w:uiPriority="99"/>
-    <w:lsdException w:name="Colorful Grid Accent 5" w:uiPriority="73" w:semiHidden="0" w:unhideWhenUsed="0"/>
-    <w:lsdException w:name="HTML Address" w:uiPriority="99"/>
-    <w:lsdException w:name="HTML Typewriter" w:uiPriority="99"/>
-    <w:lsdException w:name="Medium Shading 1" w:uiPriority="63" w:semiHidden="0" w:unhideWhenUsed="0"/>
-    <w:lsdException w:name="Strong" w:uiPriority="22" w:semiHidden="0" w:unhideWhenUsed="0" w:qFormat="1"/>
-    <w:lsdException w:name="heading 6" w:uiPriority="9" w:qFormat="1"/>
-    <w:lsdException w:name="Table List 2" w:uiPriority="99"/>
-    <w:lsdException w:name="List Bullet" w:uiPriority="99"/>
-    <w:lsdException w:name="List Continue 5" w:uiPriority="99"/>
-    <w:lsdException w:name="Table Simple 1" w:uiPriority="99"/>
-    <w:lsdException w:name="Medium Grid 3 Accent 1" w:uiPriority="69" w:semiHidden="0" w:unhideWhenUsed="0"/>
-    <w:lsdException w:name="Medium List 1 Accent 3" w:uiPriority="65" w:semiHidden="0" w:unhideWhenUsed="0"/>
-    <w:lsdException w:name="Table Columns 2" w:uiPriority="99"/>
-    <w:lsdException w:name="Medium List 2 Accent 6" w:uiPriority="66" w:semiHidden="0" w:unhideWhenUsed="0"/>
-    <w:lsdException w:name="Medium Shading 2 Accent 5" w:uiPriority="64" w:semiHidden="0" w:unhideWhenUsed="0"/>
-    <w:lsdException w:name="Colorful Grid Accent 1" w:uiPriority="73" w:semiHidden="0" w:unhideWhenUsed="0"/>
-    <w:lsdException w:name="FollowedHyperlink" w:uiPriority="99"/>
-    <w:lsdException w:name="Colorful Shading Accent 5" w:uiPriority="71" w:semiHidden="0" w:unhideWhenUsed="0"/>
-    <w:lsdException w:name="Table Grid 4" w:uiPriority="99"/>
-    <w:lsdException w:name="Medium Grid 1 Accent 3" w:uiPriority="67" w:semiHidden="0" w:unhideWhenUsed="0"/>
-    <w:lsdException w:name="toc 7" w:uiPriority="39"/>
-    <w:lsdException w:name="index 6" w:uiPriority="99"/>
-    <w:lsdException w:name="Light Grid Accent 5" w:uiPriority="62" w:semiHidden="0" w:unhideWhenUsed="0"/>
-    <w:lsdException w:name="List 3" w:uiPriority="99"/>
-    <w:lsdException w:name="Light Grid" w:uiPriority="62" w:semiHidden="0" w:unhideWhenUsed="0"/>
-    <w:lsdException w:name="Dark List Accent 2" w:uiPriority="70" w:semiHidden="0" w:unhideWhenUsed="0"/>
-    <w:lsdException w:name="Body Text Indent 3" w:uiPriority="99"/>
-    <w:lsdException w:name="Medium Grid 1 Accent 4" w:uiPriority="67" w:semiHidden="0" w:unhideWhenUsed="0"/>
-    <w:lsdException w:name="E-mail Signature" w:uiPriority="99"/>
-    <w:lsdException w:name="Table List 3" w:uiPriority="99"/>
-    <w:lsdException w:name="heading 7" w:uiPriority="9" w:qFormat="1"/>
-    <w:lsdException w:name="endnote reference" w:uiPriority="99"/>
-    <w:lsdException w:name="Table Colorful 2" w:uiPriority="99"/>
-    <w:lsdException w:name="List 4" w:uiPriority="99"/>
-    <w:lsdException w:name="Medium Grid 1" w:uiPriority="67" w:semiHidden="0" w:unhideWhenUsed="0"/>
-    <w:lsdException w:name="List Bullet 2" w:uiPriority="99"/>
-    <w:lsdException w:name="Medium List 1 Accent 1" w:uiPriority="65" w:semiHidden="0" w:unhideWhenUsed="0"/>
-    <w:lsdException w:name="index heading" w:uiPriority="99"/>
-    <w:lsdException w:name="Table Web 1" w:uiPriority="99"/>
-    <w:lsdException w:name="Body Text First Indent 2" w:uiPriority="99"/>
-    <w:lsdException w:name="Table Grid 6" w:uiPriority="99"/>
-    <w:lsdException w:name="List Paragraph" w:uiPriority="34" w:semiHidden="0" w:unhideWhenUsed="0" w:qFormat="1"/>
-    <w:lsdException w:name="Medium Grid 1 Accent 5" w:uiPriority="67" w:semiHidden="0" w:unhideWhenUsed="0"/>
-    <w:lsdException w:name="Light List Accent 5" w:uiPriority="61" w:semiHidden="0" w:unhideWhenUsed="0"/>
-    <w:lsdException w:name="List Continue" w:uiPriority="99"/>
-    <w:lsdException w:name="List Number 3" w:uiPriority="99"/>
-    <w:lsdException w:name="Medium List 1 Accent 2" w:uiPriority="65" w:semiHidden="0" w:unhideWhenUsed="0"/>
-    <w:lsdException w:name="index 4" w:uiPriority="99"/>
-    <w:lsdException w:name="toc 5" w:uiPriority="39"/>
-    <w:lsdException w:name="Dark List Accent 4" w:uiPriority="70" w:semiHidden="0" w:unhideWhenUsed="0"/>
-    <w:lsdException w:name="Medium Shading 2 Accent 3" w:uiPriority="64" w:semiHidden="0" w:unhideWhenUsed="0"/>
-    <w:lsdException w:name="Normal" w:uiPriority="0" w:semiHidden="0" w:unhideWhenUsed="0" w:qFormat="1"/>
-    <w:lsdException w:name="toa heading" w:uiPriority="99"/>
-    <w:lsdException w:name="heading 9" w:uiPriority="9" w:qFormat="1"/>
-    <w:lsdException w:name="Body Text 3" w:uiPriority="99"/>
-    <w:lsdException w:name="Medium Grid 2 Accent 1" w:uiPriority="68" w:semiHidden="0" w:unhideWhenUsed="0"/>
-    <w:lsdException w:name="Block Text" w:uiPriority="99"/>
-    <w:lsdException w:name="Colorful Shading Accent 4" w:uiPriority="71" w:semiHidden="0" w:unhideWhenUsed="0"/>
-    <w:lsdException w:name="HTML Definition" w:uiPriority="99"/>
-    <w:lsdException w:name="HTML Acronym" w:uiPriority="99"/>
-    <w:lsdException w:name="annotation text" w:uiPriority="99"/>
-    <w:lsdException w:name="toc 6" w:uiPriority="39"/>
-    <w:lsdException w:name="Medium Shading 2 Accent 2" w:uiPriority="64" w:semiHidden="0" w:unhideWhenUsed="0"/>
-    <w:lsdException w:name="Colorful List Accent 3" w:uiPriority="72" w:semiHidden="0" w:unhideWhenUsed="0"/>
-    <w:lsdException w:name="Table Contemporary" w:uiPriority="99"/>
-    <w:lsdException w:name="List Bullet 4" w:uiPriority="99"/>
-    <w:lsdException w:name="Table Grid 7" w:uiPriority="99"/>
-    <w:lsdException w:name="List 5" w:uiPriority="99"/>
-    <w:lsdException w:name="Date" w:uiPriority="99"/>
-    <w:lsdException w:name="Medium Shading 2" w:uiPriority="64" w:semiHidden="0" w:unhideWhenUsed="0"/>
-    <w:lsdException w:name="Medium Shading 1 Accent 5" w:uiPriority="63" w:semiHidden="0" w:unhideWhenUsed="0"/>
-    <w:lsdException w:name="Medium Grid 2" w:uiPriority="68" w:semiHidden="0" w:unhideWhenUsed="0"/>
-    <w:lsdException w:name="heading 1" w:uiPriority="9" w:semiHidden="0" w:unhideWhenUsed="0" w:qFormat="1"/>
-    <w:lsdException w:name="Table List 5" w:uiPriority="99"/>
-    <w:lsdException w:name="index 5" w:uiPriority="99"/>
-    <w:lsdException w:name="Body Text 2" w:uiPriority="99"/>
-    <w:lsdException w:name="Colorful List Accent 4" w:uiPriority="72" w:semiHidden="0" w:unhideWhenUsed="0"/>
-    <w:lsdException w:name="List Number 2" w:uiPriority="99"/>
-    <w:lsdException w:name="Table Columns 1" w:uiPriority="99"/>
-    <w:lsdException w:name="Normal Table" w:uiPriority="99" w:qFormat="1"/>
-    <w:lsdException w:name="Note Heading" w:uiPriority="99"/>
-    <w:lsdException w:name="Colorful Grid Accent 6" w:uiPriority="73" w:semiHidden="0" w:unhideWhenUsed="0"/>
-    <w:lsdException w:name="Medium Grid 2 Accent 3" w:uiPriority="68" w:semiHidden="0" w:unhideWhenUsed="0"/>
-    <w:lsdException w:name="Medium Shading 2 Accent 1" w:uiPriority="64" w:semiHidden="0" w:unhideWhenUsed="0"/>
-    <w:lsdException w:name="Medium Shading 1 Accent 6" w:uiPriority="63" w:semiHidden="0" w:unhideWhenUsed="0"/>
-    <w:lsdException w:name="Colorful Shading Accent 6" w:uiPriority="71" w:semiHidden="0" w:unhideWhenUsed="0"/>
-    <w:lsdException w:name="Light List Accent 4" w:uiPriority="61" w:semiHidden="0" w:unhideWhenUsed="0"/>
-    <w:lsdException w:name="index 9" w:uiPriority="99"/>
-    <w:lsdException w:name="Colorful List Accent 5" w:uiPriority="72" w:semiHidden="0" w:unhideWhenUsed="0"/>
-    <w:lsdException w:name="Medium Grid 2 Accent 4" w:uiPriority="68" w:semiHidden="0" w:unhideWhenUsed="0"/>
-    <w:lsdException w:name="Medium List 1 Accent 4" w:uiPriority="65" w:semiHidden="0" w:unhideWhenUsed="0"/>
-    <w:lsdException w:name="Table Colorful 1" w:uiPriority="99"/>
-    <w:lsdException w:name="Medium Grid 3 Accent 6" w:uiPriority="69" w:semiHidden="0" w:unhideWhenUsed="0"/>
     <w:lsdException w:name="Light Shading Accent 3" w:uiPriority="60" w:semiHidden="0" w:unhideWhenUsed="0"/>
-    <w:lsdException w:name="Body Text" w:uiPriority="99"/>
-    <w:lsdException w:name="Medium List 2 Accent 1" w:uiPriority="66" w:semiHidden="0" w:unhideWhenUsed="0"/>
-    <w:lsdException w:name="Table Grid 1" w:uiPriority="99"/>
-    <w:lsdException w:name="HTML Keyboard" w:uiPriority="99"/>
-    <w:lsdException w:name="heading 3" w:uiPriority="9" w:qFormat="1"/>
-    <w:lsdException w:name="line number" w:uiPriority="99"/>
-    <w:lsdException w:name="Table List 7" w:uiPriority="99"/>
-    <w:lsdException w:name="footnote text" w:uiPriority="99"/>
-    <w:lsdException w:name="Colorful List Accent 2" w:uiPriority="72" w:semiHidden="0" w:unhideWhenUsed="0"/>
-    <w:lsdException w:name="Colorful Grid" w:uiPriority="73" w:semiHidden="0" w:unhideWhenUsed="0"/>
-    <w:lsdException w:name="List Number 4" w:uiPriority="99"/>
-    <w:lsdException w:name="Title" w:uiPriority="10" w:semiHidden="0" w:unhideWhenUsed="0" w:qFormat="1"/>
-    <w:lsdException w:name="HTML Code" w:uiPriority="99"/>
-    <w:lsdException w:name="index 3" w:uiPriority="99"/>
-    <w:lsdException w:name="Table 3D effects 2" w:uiPriority="99"/>
-    <w:lsdException w:name="Medium Grid 2 Accent 2" w:uiPriority="68" w:semiHidden="0" w:unhideWhenUsed="0"/>
-    <w:lsdException w:name="Light List Accent 6" w:uiPriority="61" w:semiHidden="0" w:unhideWhenUsed="0"/>
-    <w:lsdException w:name="Light Shading Accent 4" w:uiPriority="60" w:semiHidden="0" w:unhideWhenUsed="0"/>
-    <w:lsdException w:name="Medium Shading 1 Accent 4" w:uiPriority="63" w:semiHidden="0" w:unhideWhenUsed="0"/>
-    <w:lsdException w:name="Table Colorful 3" w:uiPriority="99"/>
-    <w:lsdException w:name="Medium Grid 3" w:uiPriority="69" w:semiHidden="0" w:unhideWhenUsed="0"/>
-    <w:lsdException w:name="Table Theme" w:uiPriority="99"/>
-    <w:lsdException w:name="Table List 4" w:uiPriority="99"/>
-    <w:lsdException w:name="Light Shading" w:uiPriority="60" w:semiHidden="0" w:unhideWhenUsed="0"/>
-    <w:lsdException w:name="Medium List 1 Accent 5" w:uiPriority="65" w:semiHidden="0" w:unhideWhenUsed="0"/>
-    <w:lsdException w:name="List Bullet 3" w:uiPriority="99"/>
-    <w:lsdException w:name="Medium List 2 Accent 4" w:uiPriority="66" w:semiHidden="0" w:unhideWhenUsed="0"/>
-    <w:lsdException w:name="Body Text Indent 2" w:uiPriority="99"/>
-    <w:lsdException w:name="Table Subtle 2" w:uiPriority="99"/>
-    <w:lsdException w:name="Table Web 2" w:uiPriority="99"/>
-    <w:lsdException w:name="Light Shading Accent 5" w:uiPriority="60" w:semiHidden="0" w:unhideWhenUsed="0"/>
-    <w:lsdException w:name="endnote text" w:uiPriority="99"/>
-    <w:lsdException w:name="index 8" w:uiPriority="99"/>
-    <w:lsdException w:name="Medium Grid 1 Accent 1" w:uiPriority="67" w:semiHidden="0" w:unhideWhenUsed="0"/>
-    <w:lsdException w:name="Dark List" w:uiPriority="70" w:semiHidden="0" w:unhideWhenUsed="0"/>
-    <w:lsdException w:name="toc 1" w:uiPriority="39"/>
-    <w:lsdException w:name="Table Classic 2" w:uiPriority="99"/>
-    <w:lsdException w:name="Table Grid 8" w:uiPriority="99"/>
-    <w:lsdException w:name="Light Shading Accent 2" w:uiPriority="60" w:semiHidden="0" w:unhideWhenUsed="0"/>
-    <w:lsdException w:name="Light List Accent 3" w:uiPriority="61" w:semiHidden="0" w:unhideWhenUsed="0"/>
-    <w:lsdException w:name="Colorful Shading Accent 1" w:uiPriority="71" w:semiHidden="0" w:unhideWhenUsed="0"/>
-    <w:lsdException w:name="heading 2" w:uiPriority="9" w:qFormat="1"/>
-    <w:lsdException w:name="Table List 6" w:uiPriority="99"/>
-    <w:lsdException w:name="Medium List 2 Accent 2" w:uiPriority="66" w:semiHidden="0" w:unhideWhenUsed="0"/>
-    <w:lsdException w:name="Medium Grid 2 Accent 5" w:uiPriority="68" w:semiHidden="0" w:unhideWhenUsed="0"/>
-    <w:lsdException w:name="Normal Indent" w:uiPriority="99"/>
-    <w:lsdException w:name="Table Web 3" w:uiPriority="99"/>
-    <w:lsdException w:name="Medium Grid 3 Accent 5" w:uiPriority="69" w:semiHidden="0" w:unhideWhenUsed="0"/>
-    <w:lsdException w:name="Medium Grid 1 Accent 6" w:uiPriority="67" w:semiHidden="0" w:unhideWhenUsed="0"/>
-    <w:lsdException w:name="Medium Shading 2 Accent 6" w:uiPriority="64" w:semiHidden="0" w:unhideWhenUsed="0"/>
-    <w:lsdException w:name="Dark List Accent 1" w:uiPriority="70" w:semiHidden="0" w:unhideWhenUsed="0"/>
-    <w:lsdException w:name="Medium Shading 1 Accent 2" w:uiPriority="63" w:semiHidden="0" w:unhideWhenUsed="0"/>
-    <w:lsdException w:name="List Number" w:uiPriority="99"/>
-    <w:lsdException w:name="Normal (Web)" w:uiPriority="99"/>
-    <w:lsdException w:name="index 2" w:uiPriority="99"/>
-    <w:lsdException w:name="toc 3" w:uiPriority="39"/>
-    <w:lsdException w:name="Table Professional" w:uiPriority="99"/>
-    <w:lsdException w:name="List Number 5" w:uiPriority="99"/>
-    <w:lsdException w:name="Light List Accent 1" w:uiPriority="61" w:semiHidden="0" w:unhideWhenUsed="0"/>
-    <w:lsdException w:name="Table 3D effects 3" w:uiPriority="99"/>
     <w:lsdException w:name="Light Grid Accent 6" w:uiPriority="62" w:semiHidden="0" w:unhideWhenUsed="0"/>
-    <w:lsdException w:name="page number" w:uiPriority="99"/>
     <w:lsdException w:name="Dark List Accent 6" w:uiPriority="70" w:semiHidden="0" w:unhideWhenUsed="0"/>
     <w:lsdException w:name="Table Classic 4" w:uiPriority="99"/>
-    <w:lsdException w:name="Document Map" w:uiPriority="99"/>
-    <w:lsdException w:name="heading 8" w:uiPriority="9" w:qFormat="1"/>
-    <w:lsdException w:name="List Continue 3" w:uiPriority="99"/>
-    <w:lsdException w:name="Table Grid" w:uiPriority="59" w:semiHidden="0" w:unhideWhenUsed="0" w:qFormat="1"/>
-    <w:lsdException w:name="Emphasis" w:uiPriority="20" w:semiHidden="0" w:unhideWhenUsed="0" w:qFormat="1"/>
-    <w:lsdException w:name="Colorful List Accent 1" w:uiPriority="72" w:semiHidden="0" w:unhideWhenUsed="0"/>
+    <w:lsdException w:name="toc 7" w:uiPriority="39"/>
+    <w:lsdException w:name="Body Text Indent 3" w:uiPriority="99"/>
+    <w:lsdException w:name="List Number 3" w:uiPriority="99"/>
+    <w:lsdException w:name="Closing" w:uiPriority="99"/>
+    <w:lsdException w:name="toc 5" w:uiPriority="39"/>
+    <w:lsdException w:name="Table Columns 4" w:uiPriority="99"/>
+    <w:lsdException w:name="Light List Accent 1" w:uiPriority="61" w:semiHidden="0" w:unhideWhenUsed="0"/>
+    <w:lsdException w:name="toc 2" w:uiPriority="39"/>
+    <w:lsdException w:name="List Bullet" w:uiPriority="99"/>
+    <w:lsdException w:name="header" w:uiPriority="99" w:semiHidden="0"/>
+    <w:lsdException w:name="Medium List 2 Accent 3" w:uiPriority="66" w:semiHidden="0" w:unhideWhenUsed="0"/>
+    <w:lsdException w:name="Table Columns 1" w:uiPriority="99"/>
+    <w:lsdException w:name="Medium List 2 Accent 1" w:uiPriority="66" w:semiHidden="0" w:unhideWhenUsed="0"/>
+    <w:lsdException w:name="Light List Accent 5" w:uiPriority="61" w:semiHidden="0" w:unhideWhenUsed="0"/>
+    <w:lsdException w:name="Colorful List Accent 5" w:uiPriority="72" w:semiHidden="0" w:unhideWhenUsed="0"/>
+    <w:lsdException w:name="index 4" w:uiPriority="99"/>
+    <w:lsdException w:name="Medium List 2 Accent 4" w:uiPriority="66" w:semiHidden="0" w:unhideWhenUsed="0"/>
+    <w:lsdException w:name="Table Columns 3" w:uiPriority="99"/>
+    <w:lsdException w:name="Body Text 3" w:uiPriority="99"/>
+    <w:lsdException w:name="Colorful List Accent 2" w:uiPriority="72" w:semiHidden="0" w:unhideWhenUsed="0"/>
+    <w:lsdException w:name="HTML Sample" w:uiPriority="99"/>
+    <w:lsdException w:name="List Number" w:uiPriority="99"/>
+    <w:lsdException w:name="Medium Grid 3 Accent 3" w:uiPriority="69" w:semiHidden="0" w:unhideWhenUsed="0"/>
     <w:lsdException w:name="List" w:uiPriority="99"/>
-    <w:lsdException w:name="Medium Shading 2 Accent 4" w:uiPriority="64" w:semiHidden="0" w:unhideWhenUsed="0"/>
-    <w:lsdException w:name="Message Header" w:uiPriority="99"/>
-    <w:lsdException w:name="Table Grid 5" w:uiPriority="99"/>
-    <w:lsdException w:name="table of figures" w:uiPriority="99"/>
-    <w:lsdException w:name="Colorful Grid Accent 3" w:uiPriority="73" w:semiHidden="0" w:unhideWhenUsed="0"/>
-    <w:lsdException w:name="toc 9" w:uiPriority="39"/>
-    <w:lsdException w:name="Medium Shading 1 Accent 3" w:uiPriority="63" w:semiHidden="0" w:unhideWhenUsed="0"/>
-    <w:lsdException w:name="Table 3D effects 1" w:uiPriority="99"/>
-    <w:lsdException w:name="index 7" w:uiPriority="99"/>
-    <w:lsdException w:name="Medium List 2 Accent 3" w:uiPriority="66" w:semiHidden="0" w:unhideWhenUsed="0"/>
-    <w:lsdException w:name="Table Simple 3" w:uiPriority="99"/>
+    <w:lsdException w:name="Medium List 2" w:uiPriority="66" w:semiHidden="0" w:unhideWhenUsed="0"/>
+    <w:lsdException w:name="Medium Grid 3 Accent 6" w:uiPriority="69" w:semiHidden="0" w:unhideWhenUsed="0"/>
+    <w:lsdException w:name="Medium Shading 1 Accent 6" w:uiPriority="63" w:semiHidden="0" w:unhideWhenUsed="0"/>
     <w:lsdException w:name="Medium Grid 3 Accent 4" w:uiPriority="69" w:semiHidden="0" w:unhideWhenUsed="0"/>
-    <w:lsdException w:name="Table Classic 1" w:uiPriority="99"/>
     <w:lsdException w:name="Body Text First Indent" w:uiPriority="99"/>
-    <w:lsdException w:name="Light List" w:uiPriority="61" w:semiHidden="0" w:unhideWhenUsed="0"/>
+    <w:lsdException w:name="Table Colorful 2" w:uiPriority="99"/>
     <w:lsdException w:name="Colorful Grid Accent 4" w:uiPriority="73" w:semiHidden="0" w:unhideWhenUsed="0"/>
-    <w:lsdException w:name="Body Text Indent" w:uiPriority="99"/>
-    <w:lsdException w:name="Plain Text" w:uiPriority="99"/>
-    <w:lsdException w:name="List Continue 2" w:uiPriority="99"/>
-    <w:lsdException w:name="Medium Grid 2 Accent 6" w:uiPriority="68" w:semiHidden="0" w:unhideWhenUsed="0"/>
-    <w:lsdException w:name="Table List 1" w:uiPriority="99"/>
-    <w:lsdException w:name="footnote reference" w:uiPriority="99"/>
+    <w:lsdException w:name="HTML Code" w:uiPriority="99"/>
+    <w:lsdException w:name="Medium Grid 3" w:uiPriority="69" w:semiHidden="0" w:unhideWhenUsed="0"/>
+    <w:lsdException w:name="Table Web 2" w:uiPriority="99"/>
+    <w:lsdException w:name="Table List 8" w:uiPriority="99"/>
+    <w:lsdException w:name="Table List 6" w:uiPriority="99"/>
+    <w:lsdException w:name="index heading" w:uiPriority="99"/>
+    <w:lsdException w:name="Medium Shading 1 Accent 5" w:uiPriority="63" w:semiHidden="0" w:unhideWhenUsed="0"/>
+    <w:lsdException w:name="Medium Grid 2 Accent 3" w:uiPriority="68" w:semiHidden="0" w:unhideWhenUsed="0"/>
+    <w:lsdException w:name="List Paragraph" w:uiPriority="34" w:semiHidden="0" w:unhideWhenUsed="0" w:qFormat="1"/>
+    <w:lsdException w:name="Colorful Grid Accent 2" w:uiPriority="73" w:semiHidden="0" w:unhideWhenUsed="0"/>
+    <w:lsdException w:name="Table List 3" w:uiPriority="99"/>
+    <w:lsdException w:name="Title" w:uiPriority="10" w:semiHidden="0" w:unhideWhenUsed="0" w:qFormat="1"/>
+    <w:lsdException w:name="List Continue" w:uiPriority="99"/>
+    <w:lsdException w:name="line number" w:uiPriority="99"/>
+    <w:lsdException w:name="Medium Grid 1 Accent 5" w:uiPriority="67" w:semiHidden="0" w:unhideWhenUsed="0"/>
     <w:lsdException w:name="Table Grid 3" w:uiPriority="99"/>
-    <w:lsdException w:name="macro" w:uiPriority="99"/>
+    <w:lsdException w:name="Light Shading Accent 6" w:uiPriority="60" w:semiHidden="0" w:unhideWhenUsed="0"/>
+    <w:lsdException w:name="List Continue 4" w:uiPriority="99"/>
+    <w:lsdException w:name="Light Grid" w:uiPriority="62" w:semiHidden="0" w:unhideWhenUsed="0"/>
+    <w:lsdException w:name="Light Shading Accent 4" w:uiPriority="60" w:semiHidden="0" w:unhideWhenUsed="0"/>
+    <w:lsdException w:name="Table Grid 8" w:uiPriority="99"/>
+    <w:lsdException w:name="Table Grid 6" w:uiPriority="99"/>
+    <w:lsdException w:name="List Number 4" w:uiPriority="99"/>
     <w:lsdException w:name="Light Shading Accent 1" w:uiPriority="60" w:semiHidden="0" w:unhideWhenUsed="0"/>
-    <w:lsdException w:name="Table Subtle 1" w:uiPriority="99"/>
-    <w:lsdException w:name="Colorful List" w:uiPriority="72" w:semiHidden="0" w:unhideWhenUsed="0"/>
-    <w:lsdException w:name="Medium Shading 1 Accent 1" w:uiPriority="63" w:semiHidden="0" w:unhideWhenUsed="0"/>
-    <w:lsdException w:name="Table Elegant" w:uiPriority="99"/>
-    <w:lsdException w:name="HTML Sample" w:uiPriority="99"/>
-    <w:lsdException w:name="HTML Preformatted" w:uiPriority="99"/>
-    <w:lsdException w:name="index 1" w:uiPriority="99"/>
-    <w:lsdException w:name="envelope return" w:uiPriority="99"/>
+    <w:lsdException w:name="Light Grid Accent 4" w:uiPriority="62" w:semiHidden="0" w:unhideWhenUsed="0"/>
     <w:lsdException w:name="Dark List Accent 5" w:uiPriority="70" w:semiHidden="0" w:unhideWhenUsed="0"/>
     <w:lsdException w:name="Table Classic 3" w:uiPriority="99"/>
-    <w:lsdException w:name="Medium List 1" w:uiPriority="65" w:semiHidden="0" w:unhideWhenUsed="0"/>
+    <w:lsdException w:name="Message Header" w:uiPriority="99"/>
+    <w:lsdException w:name="Light Grid Accent 3" w:uiPriority="62" w:semiHidden="0" w:unhideWhenUsed="0"/>
+    <w:lsdException w:name="toc 8" w:uiPriority="39"/>
+    <w:lsdException w:name="Light Grid Accent 1" w:uiPriority="62" w:semiHidden="0" w:unhideWhenUsed="0"/>
+    <w:lsdException w:name="table of figures" w:uiPriority="99"/>
+    <w:lsdException w:name="Body Text" w:uiPriority="99"/>
+    <w:lsdException w:name="toc 3" w:uiPriority="39"/>
+    <w:lsdException w:name="List 3" w:uiPriority="99"/>
+    <w:lsdException w:name="Medium Shading 2 Accent 4" w:uiPriority="64" w:semiHidden="0" w:unhideWhenUsed="0"/>
+    <w:lsdException w:name="Colorful Shading Accent 1" w:uiPriority="71" w:semiHidden="0" w:unhideWhenUsed="0"/>
+    <w:lsdException w:name="index 6" w:uiPriority="99"/>
+    <w:lsdException w:name="List 4" w:uiPriority="99"/>
+    <w:lsdException w:name="Medium Shading 2 Accent 6" w:uiPriority="64" w:semiHidden="0" w:unhideWhenUsed="0"/>
+    <w:lsdException w:name="List Bullet 5" w:uiPriority="99"/>
+    <w:lsdException w:name="index 5" w:uiPriority="99"/>
+    <w:lsdException w:name="index 3" w:uiPriority="99"/>
+    <w:lsdException w:name="Colorful Shading Accent 4" w:uiPriority="71" w:semiHidden="0" w:unhideWhenUsed="0"/>
+    <w:lsdException w:name="Table Subtle 1" w:uiPriority="99"/>
+    <w:lsdException w:name="Medium Shading 2 Accent 1" w:uiPriority="64" w:semiHidden="0" w:unhideWhenUsed="0"/>
+    <w:lsdException w:name="Subtitle" w:uiPriority="11" w:semiHidden="0" w:unhideWhenUsed="0" w:qFormat="1"/>
+    <w:lsdException w:name="endnote text" w:uiPriority="99"/>
+    <w:lsdException w:name="heading 2" w:uiPriority="9" w:qFormat="1"/>
+    <w:lsdException w:name="index 8" w:uiPriority="99"/>
+    <w:lsdException w:name="Normal Indent" w:uiPriority="99"/>
+    <w:lsdException w:name="heading 7" w:uiPriority="9" w:qFormat="1"/>
+    <w:lsdException w:name="heading 5" w:uiPriority="9" w:qFormat="1"/>
+    <w:lsdException w:name="Medium Grid 3 Accent 5" w:uiPriority="69" w:semiHidden="0" w:unhideWhenUsed="0"/>
+    <w:lsdException w:name="Table Colorful 3" w:uiPriority="99"/>
+    <w:lsdException w:name="Table Colorful 1" w:uiPriority="99"/>
+    <w:lsdException w:name="Medium Grid 2 Accent 1" w:uiPriority="68" w:semiHidden="0" w:unhideWhenUsed="0"/>
+    <w:lsdException w:name="toa heading" w:uiPriority="99"/>
+    <w:lsdException w:name="Medium Grid 2 Accent 2" w:uiPriority="68" w:semiHidden="0" w:unhideWhenUsed="0"/>
+    <w:lsdException w:name="Table Simple 2" w:uiPriority="99"/>
+    <w:lsdException w:name="Medium Grid 1 Accent 3" w:uiPriority="67" w:semiHidden="0" w:unhideWhenUsed="0"/>
+    <w:lsdException w:name="HTML Preformatted" w:uiPriority="99"/>
+    <w:lsdException w:name="Medium Grid 2 Accent 4" w:uiPriority="68" w:semiHidden="0" w:unhideWhenUsed="0"/>
+    <w:lsdException w:name="Medium Grid 1 Accent 1" w:uiPriority="67" w:semiHidden="0" w:unhideWhenUsed="0"/>
+    <w:lsdException w:name="annotation text" w:uiPriority="99"/>
+    <w:lsdException w:name="HTML Variable" w:uiPriority="99"/>
+    <w:lsdException w:name="Table 3D effects 1" w:uiPriority="99"/>
     <w:lsdException w:name="envelope address" w:uiPriority="99"/>
-    <w:lsdException w:name="Light Grid Accent 1" w:uiPriority="62" w:semiHidden="0" w:unhideWhenUsed="0"/>
-    <w:lsdException w:name="Table Columns 5" w:uiPriority="99"/>
-    <w:lsdException w:name="Colorful Grid Accent 2" w:uiPriority="73" w:semiHidden="0" w:unhideWhenUsed="0"/>
-    <w:lsdException w:name="Colorful Shading Accent 2" w:uiPriority="71" w:semiHidden="0" w:unhideWhenUsed="0"/>
-    <w:lsdException w:name="List Continue 4" w:uiPriority="99"/>
-    <w:lsdException w:name="toc 8" w:uiPriority="39"/>
+    <w:lsdException w:name="Medium Grid 1 Accent 6" w:uiPriority="67" w:semiHidden="0" w:unhideWhenUsed="0"/>
+    <w:lsdException w:name="Light List Accent 2" w:uiPriority="61" w:semiHidden="0" w:unhideWhenUsed="0"/>
+    <w:lsdException w:name="List Continue 2" w:uiPriority="99"/>
+    <w:lsdException w:name="Normal Table" w:uiPriority="99" w:qFormat="1"/>
+    <w:lsdException w:name="Dark List" w:uiPriority="70" w:semiHidden="0" w:unhideWhenUsed="0"/>
+    <w:lsdException w:name="macro" w:uiPriority="99"/>
+    <w:lsdException w:name="annotation reference" w:uiPriority="99"/>
+    <w:lsdException w:name="Light Shading" w:uiPriority="60" w:semiHidden="0" w:unhideWhenUsed="0"/>
+    <w:lsdException w:name="Medium List 2 Accent 2" w:uiPriority="66" w:semiHidden="0" w:unhideWhenUsed="0"/>
+    <w:lsdException w:name="Colorful List Accent 3" w:uiPriority="72" w:semiHidden="0" w:unhideWhenUsed="0"/>
+    <w:lsdException w:name="Body Text 2" w:uiPriority="99"/>
+    <w:lsdException w:name="Note Heading" w:uiPriority="99"/>
+    <w:lsdException w:name="Medium List 1 Accent 5" w:uiPriority="65" w:semiHidden="0" w:unhideWhenUsed="0"/>
+    <w:lsdException w:name="HTML Address" w:uiPriority="99"/>
   </w:latentStyles>
-  <w:style w:type="character" w:styleId="000009" w:default="1">
-    <w:name w:val="Default Paragraph Font"/>
-    <w:uiPriority w:val="1"/>
-    <w:semiHidden w:val="1"/>
-    <w:unhideWhenUsed w:val="1"/>
-    <w:qFormat w:val="1"/>
-  </w:style>
-  <w:style w:type="paragraph" w:styleId="000008" w:default="1">
-    <w:name w:val="Normal"/>
-    <w:uiPriority w:val="0"/>
-    <w:qFormat w:val="1"/>
-    <w:pPr>
-      <w:widowControl w:val="0"/>
-      <w:spacing w:after="0" w:line="240" w:lineRule="auto"/>
-      <w:jc w:val="both"/>
-    </w:pPr>
-    <w:rPr>
-      <w:rFonts w:ascii="Times New Roman" w:hAnsi="Times New Roman" w:eastAsia="宋体" w:cs="Times New Roman"/>
-      <w:kern w:val="2"/>
-      <w:sz w:val="21"/>
-      <w:szCs w:val="24"/>
-      <w:lang w:val="en-US" w:eastAsia="zh-CN" w:bidi="ar-SA"/>
-      <w14:ligatures w14:val="none"/>
-    </w:rPr>
-  </w:style>
-  <w:style w:type="table" w:styleId="000012">
-    <w:name w:val="Table Grid"/>
-    <w:basedOn w:val="00000a"/>
-    <w:uiPriority w:val="59"/>
-    <w:qFormat w:val="1"/>
-    <w:pPr>
-      <w:spacing w:after="0" w:line="240" w:lineRule="auto"/>
-    </w:pPr>
-    <w:tblPr>
-      <w:tblBorders>
-        <w:top w:val="single" w:color="auto" w:sz="4" w:space="0"/>
-        <w:left w:val="single" w:color="auto" w:sz="4" w:space="0"/>
-        <w:bottom w:val="single" w:color="auto" w:sz="4" w:space="0"/>
-        <w:right w:val="single" w:color="auto" w:sz="4" w:space="0"/>
-        <w:insideH w:val="single" w:color="auto" w:sz="4" w:space="0"/>
-        <w:insideV w:val="single" w:color="auto" w:sz="4" w:space="0"/>
-      </w:tblBorders>
-      <w:tblCellMar>
-        <w:top w:w="0" w:type="dxa"/>
-        <w:left w:w="108" w:type="dxa"/>
-        <w:bottom w:w="0" w:type="dxa"/>
-        <w:right w:w="108" w:type="dxa"/>
-      </w:tblCellMar>
-    </w:tblPr>
-  </w:style>
-  <w:style w:type="paragraph" w:styleId="000014">
-    <w:name w:val="List Paragraph"/>
-    <w:basedOn w:val="000008"/>
-    <w:uiPriority w:val="34"/>
-    <w:qFormat w:val="1"/>
-    <w:pPr>
-      <w:ind w:firstLine="420" w:firstLineChars="200"/>
-    </w:pPr>
-  </w:style>
-  <w:style w:type="paragraph" w:styleId="00000f">
-    <w:name w:val="Subtitle"/>
-    <w:basedOn w:val="000008"/>
-    <w:next w:val="000008"/>
-    <w:link w:val="000010"/>
-    <w:uiPriority w:val="11"/>
-    <w:qFormat w:val="1"/>
-    <w:pPr>
-      <w:spacing w:before="240" w:after="60" w:line="312" w:lineRule="auto"/>
-      <w:jc w:val="center"/>
-      <w:outlineLvl w:val="1"/>
-    </w:pPr>
-    <w:rPr>
-      <w:rFonts w:asciiTheme="minorHAnsi" w:hAnsiTheme="minorHAnsi" w:eastAsiaTheme="minorEastAsia" w:cstheme="minorBidi"/>
-      <w:b w:val="1"/>
-      <w:bCs w:val="1"/>
-      <w:kern w:val="28"/>
-      <w:sz w:val="32"/>
-      <w:szCs w:val="32"/>
-    </w:rPr>
-  </w:style>
   <w:style w:type="paragraph" w:styleId="00000b">
     <w:name w:val="footer"/>
     <w:basedOn w:val="000008"/>
@@ -5287,32 +4790,14 @@
       <w:szCs w:val="18"/>
     </w:rPr>
   </w:style>
-  <w:style w:type="paragraph" w:styleId="000013" w:customStyle="1">
-    <w:name w:val="xl22"/>
+  <w:style w:type="paragraph" w:styleId="000014">
+    <w:name w:val="List Paragraph"/>
     <w:basedOn w:val="000008"/>
-    <w:uiPriority w:val="0"/>
+    <w:uiPriority w:val="34"/>
     <w:qFormat w:val="1"/>
     <w:pPr>
-      <w:widowControl w:val="1"/>
-      <w:spacing w:before="100" w:beforeAutospacing="1" w:after="100" w:afterAutospacing="1"/>
-      <w:jc w:val="center"/>
+      <w:ind w:firstLine="420" w:firstLineChars="200"/>
     </w:pPr>
-    <w:rPr>
-      <w:rFonts w:ascii="宋体" w:hAnsi="宋体"/>
-      <w:kern w:val="0"/>
-      <w:sz w:val="24"/>
-    </w:rPr>
-  </w:style>
-  <w:style w:type="character" w:styleId="00000e" w:customStyle="1">
-    <w:name w:val="页眉 字符"/>
-    <w:basedOn w:val="000009"/>
-    <w:link w:val="00000d"/>
-    <w:uiPriority w:val="99"/>
-    <w:qFormat w:val="1"/>
-    <w:rPr>
-      <w:sz w:val="18"/>
-      <w:szCs w:val="18"/>
-    </w:rPr>
   </w:style>
   <w:style w:type="paragraph" w:styleId="00000d">
     <w:name w:val="header"/>
@@ -5331,6 +4816,72 @@
     <w:rPr>
       <w:sz w:val="18"/>
       <w:szCs w:val="18"/>
+    </w:rPr>
+  </w:style>
+  <w:style w:type="table" w:styleId="00000a" w:default="1">
+    <w:name w:val="Normal Table"/>
+    <w:uiPriority w:val="99"/>
+    <w:semiHidden w:val="1"/>
+    <w:unhideWhenUsed w:val="1"/>
+    <w:qFormat w:val="1"/>
+    <w:tblPr>
+      <w:tblCellMar>
+        <w:top w:w="0" w:type="dxa"/>
+        <w:left w:w="108" w:type="dxa"/>
+        <w:bottom w:w="0" w:type="dxa"/>
+        <w:right w:w="108" w:type="dxa"/>
+      </w:tblCellMar>
+    </w:tblPr>
+  </w:style>
+  <w:style w:type="character" w:styleId="00000c" w:customStyle="1">
+    <w:name w:val="页脚 字符"/>
+    <w:basedOn w:val="000009"/>
+    <w:link w:val="00000b"/>
+    <w:uiPriority w:val="99"/>
+    <w:qFormat w:val="1"/>
+    <w:rPr>
+      <w:sz w:val="18"/>
+      <w:szCs w:val="18"/>
+    </w:rPr>
+  </w:style>
+  <w:style w:type="character" w:styleId="000009" w:default="1">
+    <w:name w:val="Default Paragraph Font"/>
+    <w:uiPriority w:val="1"/>
+    <w:semiHidden w:val="1"/>
+    <w:unhideWhenUsed w:val="1"/>
+    <w:qFormat w:val="1"/>
+  </w:style>
+  <w:style w:type="character" w:styleId="000010" w:customStyle="1">
+    <w:name w:val="副标题 字符"/>
+    <w:basedOn w:val="000009"/>
+    <w:link w:val="00000f"/>
+    <w:uiPriority w:val="11"/>
+    <w:qFormat w:val="1"/>
+    <w:rPr>
+      <w:b w:val="1"/>
+      <w:bCs w:val="1"/>
+      <w:kern w:val="28"/>
+      <w:sz w:val="32"/>
+      <w:szCs w:val="32"/>
+      <w14:ligatures w14:val="none"/>
+    </w:rPr>
+  </w:style>
+  <w:style w:type="paragraph" w:styleId="000008" w:default="1">
+    <w:name w:val="Normal"/>
+    <w:uiPriority w:val="0"/>
+    <w:qFormat w:val="1"/>
+    <w:pPr>
+      <w:widowControl w:val="0"/>
+      <w:spacing w:after="0" w:line="240" w:lineRule="auto"/>
+      <w:jc w:val="both"/>
+    </w:pPr>
+    <w:rPr>
+      <w:rFonts w:ascii="Times New Roman" w:hAnsi="Times New Roman" w:eastAsia="宋体" w:cs="Times New Roman"/>
+      <w:kern w:val="2"/>
+      <w:sz w:val="21"/>
+      <w:szCs w:val="24"/>
+      <w:lang w:val="en-US" w:eastAsia="zh-CN" w:bidi="ar-SA"/>
+      <w14:ligatures w14:val="none"/>
     </w:rPr>
   </w:style>
   <w:style w:type="paragraph" w:styleId="000011">
@@ -5368,25 +4919,56 @@
       <w:lang w:val="en-US" w:eastAsia="zh-CN" w:bidi="ar"/>
     </w:rPr>
   </w:style>
-  <w:style w:type="character" w:styleId="000010" w:customStyle="1">
-    <w:name w:val="副标题 字符"/>
-    <w:basedOn w:val="000009"/>
-    <w:link w:val="00000f"/>
+  <w:style w:type="paragraph" w:styleId="00000f">
+    <w:name w:val="Subtitle"/>
+    <w:basedOn w:val="000008"/>
+    <w:next w:val="000008"/>
+    <w:link w:val="000010"/>
     <w:uiPriority w:val="11"/>
     <w:qFormat w:val="1"/>
+    <w:pPr>
+      <w:spacing w:before="240" w:after="60" w:line="312" w:lineRule="auto"/>
+      <w:jc w:val="center"/>
+      <w:outlineLvl w:val="1"/>
+    </w:pPr>
     <w:rPr>
+      <w:rFonts w:asciiTheme="minorHAnsi" w:hAnsiTheme="minorHAnsi" w:eastAsiaTheme="minorEastAsia" w:cstheme="minorBidi"/>
       <w:b w:val="1"/>
       <w:bCs w:val="1"/>
       <w:kern w:val="28"/>
       <w:sz w:val="32"/>
       <w:szCs w:val="32"/>
-      <w14:ligatures w14:val="none"/>
     </w:rPr>
   </w:style>
-  <w:style w:type="character" w:styleId="00000c" w:customStyle="1">
-    <w:name w:val="页脚 字符"/>
+  <w:style w:type="table" w:styleId="000012">
+    <w:name w:val="Table Grid"/>
+    <w:basedOn w:val="00000a"/>
+    <w:uiPriority w:val="59"/>
+    <w:qFormat w:val="1"/>
+    <w:pPr>
+      <w:spacing w:after="0" w:line="240" w:lineRule="auto"/>
+    </w:pPr>
+    <w:tblPr>
+      <w:tblBorders>
+        <w:top w:val="single" w:color="auto" w:sz="4" w:space="0"/>
+        <w:left w:val="single" w:color="auto" w:sz="4" w:space="0"/>
+        <w:bottom w:val="single" w:color="auto" w:sz="4" w:space="0"/>
+        <w:right w:val="single" w:color="auto" w:sz="4" w:space="0"/>
+        <w:insideH w:val="single" w:color="auto" w:sz="4" w:space="0"/>
+        <w:insideV w:val="single" w:color="auto" w:sz="4" w:space="0"/>
+      </w:tblBorders>
+      <w:tblCellMar>
+        <w:top w:w="0" w:type="dxa"/>
+        <w:left w:w="108" w:type="dxa"/>
+        <w:bottom w:w="0" w:type="dxa"/>
+        <w:right w:w="108" w:type="dxa"/>
+      </w:tblCellMar>
+    </w:tblPr>
+  </w:style>
+  <w:style w:type="character" w:styleId="00000e" w:customStyle="1">
+    <w:name w:val="页眉 字符"/>
     <w:basedOn w:val="000009"/>
-    <w:link w:val="00000b"/>
+    <w:link w:val="00000d"/>
     <w:uiPriority w:val="99"/>
     <w:qFormat w:val="1"/>
     <w:rPr>
@@ -5394,20 +4976,21 @@
       <w:szCs w:val="18"/>
     </w:rPr>
   </w:style>
-  <w:style w:type="table" w:styleId="00000a" w:default="1">
-    <w:name w:val="Normal Table"/>
-    <w:uiPriority w:val="99"/>
-    <w:semiHidden w:val="1"/>
-    <w:unhideWhenUsed w:val="1"/>
+  <w:style w:type="paragraph" w:styleId="000013" w:customStyle="1">
+    <w:name w:val="xl22"/>
+    <w:basedOn w:val="000008"/>
+    <w:uiPriority w:val="0"/>
     <w:qFormat w:val="1"/>
-    <w:tblPr>
-      <w:tblCellMar>
-        <w:top w:w="0" w:type="dxa"/>
-        <w:left w:w="108" w:type="dxa"/>
-        <w:bottom w:w="0" w:type="dxa"/>
-        <w:right w:w="108" w:type="dxa"/>
-      </w:tblCellMar>
-    </w:tblPr>
+    <w:pPr>
+      <w:widowControl w:val="1"/>
+      <w:spacing w:before="100" w:beforeAutospacing="1" w:after="100" w:afterAutospacing="1"/>
+      <w:jc w:val="center"/>
+    </w:pPr>
+    <w:rPr>
+      <w:rFonts w:ascii="宋体" w:hAnsi="宋体"/>
+      <w:kern w:val="0"/>
+      <w:sz w:val="24"/>
+    </w:rPr>
   </w:style>
 </w:styles>
 </file>

</xml_diff>